<commit_message>
Update experiment logs and documentation for final qualifying work, including new metrics for serial testing with Redis backplane, enhancements to delivery latency analysis, and refined content in the DOCX and Markdown files. Add new figures and update table of contents for improved navigation.
</commit_message>
<xml_diff>
--- a/build/docx/vkr-draft-1.docx
+++ b/build/docx/vkr-draft-1.docx
@@ -2381,7 +2381,7 @@
           <w:i w:val="0"/>
           <w:sz w:val="22"/>
         </w:rPr>
-        <w:t>5.5 Сравнительная таблица результатов ....................................... 24</w:t>
+        <w:t>5.5 Серийная проверка и задержка доставки ................................... 24</w:t>
       </w:r>
     </w:p>
     <w:p>
@@ -2396,7 +2396,7 @@
           <w:i w:val="0"/>
           <w:sz w:val="22"/>
         </w:rPr>
-        <w:t>5.6 Проверка входной точки стенда ........................................... 24</w:t>
+        <w:t>5.6 Сравнительная таблица результатов ....................................... 25</w:t>
       </w:r>
     </w:p>
     <w:p>
@@ -2411,7 +2411,7 @@
           <w:i w:val="0"/>
           <w:sz w:val="22"/>
         </w:rPr>
-        <w:t>5.7 Ограничения эксперимента ................................................ 24</w:t>
+        <w:t>5.7 Проверка входной точки стенда ........................................... 25</w:t>
       </w:r>
     </w:p>
     <w:p>
@@ -2426,7 +2426,22 @@
           <w:i w:val="0"/>
           <w:sz w:val="22"/>
         </w:rPr>
-        <w:t>5.8 Вывод по испытаниям ..................................................... 25</w:t>
+        <w:t>5.8 Ограничения эксперимента ................................................ 25</w:t>
+      </w:r>
+    </w:p>
+    <w:p>
+      <w:pPr>
+        <w:spacing w:line="240" w:lineRule="auto" w:after="0"/>
+        <w:ind w:firstLine="0" w:left="425"/>
+      </w:pPr>
+      <w:r>
+        <w:rPr>
+          <w:rFonts w:ascii="Times New Roman" w:hAnsi="Times New Roman" w:eastAsia="Times New Roman"/>
+          <w:b w:val="0"/>
+          <w:i w:val="0"/>
+          <w:sz w:val="22"/>
+        </w:rPr>
+        <w:t>5.9 Вывод по испытаниям ..................................................... 26</w:t>
       </w:r>
     </w:p>
     <w:p>
@@ -2441,7 +2456,7 @@
           <w:i w:val="0"/>
           <w:sz w:val="22"/>
         </w:rPr>
-        <w:t>ЗАКЛЮЧЕНИЕ ........................................................................ 25</w:t>
+        <w:t>ЗАКЛЮЧЕНИЕ ........................................................................ 26</w:t>
       </w:r>
     </w:p>
     <w:p>
@@ -2456,7 +2471,7 @@
           <w:i w:val="0"/>
           <w:sz w:val="22"/>
         </w:rPr>
-        <w:t>СПИСОК ИСПОЛЬЗОВАННЫХ ИСТОЧНИКОВ .................................................. 27</w:t>
+        <w:t>СПИСОК ИСПОЛЬЗОВАННЫХ ИСТОЧНИКОВ .................................................. 28</w:t>
       </w:r>
     </w:p>
     <w:p>
@@ -2471,7 +2486,7 @@
           <w:i w:val="0"/>
           <w:sz w:val="22"/>
         </w:rPr>
-        <w:t>ПРИЛОЖЕНИЕ А ...................................................................... 29</w:t>
+        <w:t>ПРИЛОЖЕНИЕ А ...................................................................... 30</w:t>
       </w:r>
     </w:p>
     <w:p>
@@ -6754,7 +6769,23 @@
           <w:i w:val="0"/>
           <w:sz w:val="28"/>
         </w:rPr>
-        <w:t>Выводит diagnostics обоих клиентов и полученный payload события.</w:t>
+        <w:t>Измеряет задержку от отправки PATCH-запроса до получения события на клиенте B.</w:t>
+      </w:r>
+    </w:p>
+    <w:p>
+      <w:pPr>
+        <w:pStyle w:val="ListNumber"/>
+        <w:spacing w:line="360" w:lineRule="auto"/>
+        <w:ind w:left="709" w:hanging="283"/>
+      </w:pPr>
+      <w:r>
+        <w:rPr>
+          <w:rFonts w:ascii="Times New Roman" w:hAnsi="Times New Roman" w:eastAsia="Times New Roman"/>
+          <w:b w:val="0"/>
+          <w:i w:val="0"/>
+          <w:sz w:val="28"/>
+        </w:rPr>
+        <w:t>Выводит diagnostics обоих клиентов, полученный payload события и метрики доставки.</w:t>
       </w:r>
     </w:p>
     <w:p>
@@ -6774,27 +6805,6 @@
       </w:r>
     </w:p>
     <w:p>
-      <w:r>
-        <w:br w:type="page"/>
-      </w:r>
-    </w:p>
-    <w:p>
-      <w:pPr>
-        <w:pStyle w:val="Heading1"/>
-      </w:pPr>
-      <w:r>
-        <w:t>5. Испытания и оценка результатов</w:t>
-      </w:r>
-    </w:p>
-    <w:p>
-      <w:pPr>
-        <w:pStyle w:val="Heading2"/>
-      </w:pPr>
-      <w:r>
-        <w:t>5.1 Цель и программа испытаний</w:t>
-      </w:r>
-    </w:p>
-    <w:p>
       <w:pPr>
         <w:spacing w:line="360" w:lineRule="auto"/>
         <w:ind w:firstLine="709"/>
@@ -6807,7 +6817,46 @@
           <w:i w:val="0"/>
           <w:sz w:val="28"/>
         </w:rPr>
-        <w:t>Цель испытаний — подтвердить, что реализованное решение устраняет ограничение single-node WebSocket-архитектуры и обеспечивает доставку real-time событий между клиентами, подключенными к разным экземплярам backend-сервиса [3], [4].</w:t>
+        <w:t xml:space="preserve">Для получения простой количественной оценки сценарий поддерживает серийный режим через переменную </w:t>
+      </w:r>
+      <w:r>
+        <w:rPr>
+          <w:rFonts w:ascii="Courier New" w:hAnsi="Courier New" w:eastAsia="Courier New"/>
+          <w:b w:val="0"/>
+          <w:i w:val="0"/>
+          <w:sz w:val="28"/>
+        </w:rPr>
+        <w:t>THESIS_ITERATIONS</w:t>
+      </w:r>
+      <w:r>
+        <w:rPr>
+          <w:rFonts w:ascii="Times New Roman" w:hAnsi="Times New Roman" w:eastAsia="Times New Roman"/>
+          <w:b w:val="0"/>
+          <w:i w:val="0"/>
+          <w:sz w:val="28"/>
+        </w:rPr>
+        <w:t>. В этом режиме выполняется несколько независимых проверок, после чего скрипт выводит число успешных доставок и агрегированные значения задержки: минимум, максимум, среднее, p50 и p95.</w:t>
+      </w:r>
+    </w:p>
+    <w:p>
+      <w:r>
+        <w:br w:type="page"/>
+      </w:r>
+    </w:p>
+    <w:p>
+      <w:pPr>
+        <w:pStyle w:val="Heading1"/>
+      </w:pPr>
+      <w:r>
+        <w:t>5. Испытания и оценка результатов</w:t>
+      </w:r>
+    </w:p>
+    <w:p>
+      <w:pPr>
+        <w:pStyle w:val="Heading2"/>
+      </w:pPr>
+      <w:r>
+        <w:t>5.1 Цель и программа испытаний</w:t>
       </w:r>
     </w:p>
     <w:p>
@@ -6823,6 +6872,22 @@
           <w:i w:val="0"/>
           <w:sz w:val="28"/>
         </w:rPr>
+        <w:t>Цель испытаний — подтвердить, что реализованное решение устраняет ограничение single-node WebSocket-архитектуры и обеспечивает доставку real-time событий между клиентами, подключенными к разным экземплярам backend-сервиса [3], [4].</w:t>
+      </w:r>
+    </w:p>
+    <w:p>
+      <w:pPr>
+        <w:spacing w:line="360" w:lineRule="auto"/>
+        <w:ind w:firstLine="709"/>
+        <w:jc w:val="both"/>
+      </w:pPr>
+      <w:r>
+        <w:rPr>
+          <w:rFonts w:ascii="Times New Roman" w:hAnsi="Times New Roman" w:eastAsia="Times New Roman"/>
+          <w:b w:val="0"/>
+          <w:i w:val="0"/>
+          <w:sz w:val="28"/>
+        </w:rPr>
         <w:t>Программа испытаний включает два основных режима:</w:t>
       </w:r>
     </w:p>
@@ -7074,14 +7139,6 @@
     </w:p>
     <w:p>
       <w:pPr>
-        <w:pStyle w:val="Heading2"/>
-      </w:pPr>
-      <w:r>
-        <w:t>5.3 Результат без Redis backplane</w:t>
-      </w:r>
-    </w:p>
-    <w:p>
-      <w:pPr>
         <w:spacing w:line="360" w:lineRule="auto"/>
         <w:ind w:firstLine="709"/>
         <w:jc w:val="both"/>
@@ -7093,25 +7150,7 @@
           <w:i w:val="0"/>
           <w:sz w:val="28"/>
         </w:rPr>
-        <w:t xml:space="preserve">В режиме без backplane оба экземпляра </w:t>
-      </w:r>
-      <w:r>
-        <w:rPr>
-          <w:rFonts w:ascii="Courier New" w:hAnsi="Courier New" w:eastAsia="Courier New"/>
-          <w:b w:val="0"/>
-          <w:i w:val="0"/>
-          <w:sz w:val="28"/>
-        </w:rPr>
-        <w:t>app-api</w:t>
-      </w:r>
-      <w:r>
-        <w:rPr>
-          <w:rFonts w:ascii="Times New Roman" w:hAnsi="Times New Roman" w:eastAsia="Times New Roman"/>
-          <w:b w:val="0"/>
-          <w:i w:val="0"/>
-          <w:sz w:val="28"/>
-        </w:rPr>
-        <w:t xml:space="preserve"> работают, но SignalR не имеет межузлового канала доставки событий. Проверочный сценарий завершился timeout:</w:t>
+        <w:t>Для серийной проверки доставки и задержки используется команда:</w:t>
       </w:r>
     </w:p>
     <w:p>
@@ -7126,7 +7165,30 @@
           <w:i w:val="0"/>
           <w:sz w:val="20"/>
         </w:rPr>
-        <w:t>Error: ReceiveReportPatch timed out after 10000ms</w:t>
+        <w:t>cd &lt;project-root&gt;</w:t>
+      </w:r>
+    </w:p>
+    <w:p>
+      <w:pPr>
+        <w:spacing w:line="240" w:lineRule="auto"/>
+        <w:ind w:firstLine="0" w:left="709"/>
+      </w:pPr>
+      <w:r>
+        <w:rPr>
+          <w:rFonts w:ascii="Courier New" w:hAnsi="Courier New" w:eastAsia="Courier New"/>
+          <w:b w:val="0"/>
+          <w:i w:val="0"/>
+          <w:sz w:val="20"/>
+        </w:rPr>
+        <w:t>THESIS_ITERATIONS=5 node scripts/realtime-scaleout-check.mjs</w:t>
+      </w:r>
+    </w:p>
+    <w:p>
+      <w:pPr>
+        <w:pStyle w:val="Heading2"/>
+      </w:pPr>
+      <w:r>
+        <w:t>5.3 Результат без Redis backplane</w:t>
       </w:r>
     </w:p>
     <w:p>
@@ -7142,15 +7204,40 @@
           <w:i w:val="0"/>
           <w:sz w:val="28"/>
         </w:rPr>
-        <w:t>Интерпретация результата: клиент A был подключен к одному экземпляру сервиса, клиент B — к другому. Событие изменения отчета было создано через первый экземпляр, но не дошло до клиента, подключенного ко второму экземпляру. Этот результат подтверждает исходное архитектурное ограничение: простой запуск нескольких backend-процессов не обеспечивает глобальную real-time доставку [3].</w:t>
-      </w:r>
-    </w:p>
-    <w:p>
-      <w:pPr>
-        <w:pStyle w:val="Heading2"/>
-      </w:pPr>
-      <w:r>
-        <w:t>5.4 Результат с Redis backplane</w:t>
+        <w:t xml:space="preserve">В режиме без backplane оба экземпляра </w:t>
+      </w:r>
+      <w:r>
+        <w:rPr>
+          <w:rFonts w:ascii="Courier New" w:hAnsi="Courier New" w:eastAsia="Courier New"/>
+          <w:b w:val="0"/>
+          <w:i w:val="0"/>
+          <w:sz w:val="28"/>
+        </w:rPr>
+        <w:t>app-api</w:t>
+      </w:r>
+      <w:r>
+        <w:rPr>
+          <w:rFonts w:ascii="Times New Roman" w:hAnsi="Times New Roman" w:eastAsia="Times New Roman"/>
+          <w:b w:val="0"/>
+          <w:i w:val="0"/>
+          <w:sz w:val="28"/>
+        </w:rPr>
+        <w:t xml:space="preserve"> работают, но SignalR не имеет межузлового канала доставки событий. Проверочный сценарий завершился timeout:</w:t>
+      </w:r>
+    </w:p>
+    <w:p>
+      <w:pPr>
+        <w:spacing w:line="240" w:lineRule="auto"/>
+        <w:ind w:firstLine="0" w:left="709"/>
+      </w:pPr>
+      <w:r>
+        <w:rPr>
+          <w:rFonts w:ascii="Courier New" w:hAnsi="Courier New" w:eastAsia="Courier New"/>
+          <w:b w:val="0"/>
+          <w:i w:val="0"/>
+          <w:sz w:val="20"/>
+        </w:rPr>
+        <w:t>Error: ReceiveReportPatch timed out after 10000ms</w:t>
       </w:r>
     </w:p>
     <w:p>
@@ -7166,322 +7253,15 @@
           <w:i w:val="0"/>
           <w:sz w:val="28"/>
         </w:rPr>
-        <w:t>В режиме с Redis backplane проверочный сценарий завершился успешно. Один из зафиксированных результатов:</w:t>
-      </w:r>
-    </w:p>
-    <w:p>
-      <w:pPr>
-        <w:spacing w:line="240" w:lineRule="auto"/>
-        <w:ind w:firstLine="0" w:left="709"/>
-      </w:pPr>
-      <w:r>
-        <w:rPr>
-          <w:rFonts w:ascii="Courier New" w:hAnsi="Courier New" w:eastAsia="Courier New"/>
-          <w:b w:val="0"/>
-          <w:i w:val="0"/>
-          <w:sz w:val="20"/>
-        </w:rPr>
-        <w:t>{</w:t>
-      </w:r>
-    </w:p>
-    <w:p>
-      <w:pPr>
-        <w:spacing w:line="240" w:lineRule="auto"/>
-        <w:ind w:firstLine="0" w:left="709"/>
-      </w:pPr>
-      <w:r>
-        <w:rPr>
-          <w:rFonts w:ascii="Courier New" w:hAnsi="Courier New" w:eastAsia="Courier New"/>
-          <w:b w:val="0"/>
-          <w:i w:val="0"/>
-          <w:sz w:val="20"/>
-        </w:rPr>
-        <w:t xml:space="preserve">  "ok": true,</w:t>
-      </w:r>
-    </w:p>
-    <w:p>
-      <w:pPr>
-        <w:spacing w:line="240" w:lineRule="auto"/>
-        <w:ind w:firstLine="0" w:left="709"/>
-      </w:pPr>
-      <w:r>
-        <w:rPr>
-          <w:rFonts w:ascii="Courier New" w:hAnsi="Courier New" w:eastAsia="Courier New"/>
-          <w:b w:val="0"/>
-          <w:i w:val="0"/>
-          <w:sz w:val="20"/>
-        </w:rPr>
-        <w:t xml:space="preserve">  "reportId": "3",</w:t>
-      </w:r>
-    </w:p>
-    <w:p>
-      <w:pPr>
-        <w:spacing w:line="240" w:lineRule="auto"/>
-        <w:ind w:firstLine="0" w:left="709"/>
-      </w:pPr>
-      <w:r>
-        <w:rPr>
-          <w:rFonts w:ascii="Courier New" w:hAnsi="Courier New" w:eastAsia="Courier New"/>
-          <w:b w:val="0"/>
-          <w:i w:val="0"/>
-          <w:sz w:val="20"/>
-        </w:rPr>
-        <w:t xml:space="preserve">  "patchedTitle": "scaleout-patched-1778316874715",</w:t>
-      </w:r>
-    </w:p>
-    <w:p>
-      <w:pPr>
-        <w:spacing w:line="240" w:lineRule="auto"/>
-        <w:ind w:firstLine="0" w:left="709"/>
-      </w:pPr>
-      <w:r>
-        <w:rPr>
-          <w:rFonts w:ascii="Courier New" w:hAnsi="Courier New" w:eastAsia="Courier New"/>
-          <w:b w:val="0"/>
-          <w:i w:val="0"/>
-          <w:sz w:val="20"/>
-        </w:rPr>
-        <w:t xml:space="preserve">  "nodeA": {</w:t>
-      </w:r>
-    </w:p>
-    <w:p>
-      <w:pPr>
-        <w:spacing w:line="240" w:lineRule="auto"/>
-        <w:ind w:firstLine="0" w:left="709"/>
-      </w:pPr>
-      <w:r>
-        <w:rPr>
-          <w:rFonts w:ascii="Courier New" w:hAnsi="Courier New" w:eastAsia="Courier New"/>
-          <w:b w:val="0"/>
-          <w:i w:val="0"/>
-          <w:sz w:val="20"/>
-        </w:rPr>
-        <w:t xml:space="preserve">    "serverInstanceId": "app-api-1",</w:t>
-      </w:r>
-    </w:p>
-    <w:p>
-      <w:pPr>
-        <w:spacing w:line="240" w:lineRule="auto"/>
-        <w:ind w:firstLine="0" w:left="709"/>
-      </w:pPr>
-      <w:r>
-        <w:rPr>
-          <w:rFonts w:ascii="Courier New" w:hAnsi="Courier New" w:eastAsia="Courier New"/>
-          <w:b w:val="0"/>
-          <w:i w:val="0"/>
-          <w:sz w:val="20"/>
-        </w:rPr>
-        <w:t xml:space="preserve">    "machineName": "21ee5de48b13",</w:t>
-      </w:r>
-    </w:p>
-    <w:p>
-      <w:pPr>
-        <w:spacing w:line="240" w:lineRule="auto"/>
-        <w:ind w:firstLine="0" w:left="709"/>
-      </w:pPr>
-      <w:r>
-        <w:rPr>
-          <w:rFonts w:ascii="Courier New" w:hAnsi="Courier New" w:eastAsia="Courier New"/>
-          <w:b w:val="0"/>
-          <w:i w:val="0"/>
-          <w:sz w:val="20"/>
-        </w:rPr>
-        <w:t xml:space="preserve">    "connectionId": "9iIIs9uWgfJlf6BHXER8XA",</w:t>
-      </w:r>
-    </w:p>
-    <w:p>
-      <w:pPr>
-        <w:spacing w:line="240" w:lineRule="auto"/>
-        <w:ind w:firstLine="0" w:left="709"/>
-      </w:pPr>
-      <w:r>
-        <w:rPr>
-          <w:rFonts w:ascii="Courier New" w:hAnsi="Courier New" w:eastAsia="Courier New"/>
-          <w:b w:val="0"/>
-          <w:i w:val="0"/>
-          <w:sz w:val="20"/>
-        </w:rPr>
-        <w:t xml:space="preserve">    "userIdentifier": "thesis-user"</w:t>
-      </w:r>
-    </w:p>
-    <w:p>
-      <w:pPr>
-        <w:spacing w:line="240" w:lineRule="auto"/>
-        <w:ind w:firstLine="0" w:left="709"/>
-      </w:pPr>
-      <w:r>
-        <w:rPr>
-          <w:rFonts w:ascii="Courier New" w:hAnsi="Courier New" w:eastAsia="Courier New"/>
-          <w:b w:val="0"/>
-          <w:i w:val="0"/>
-          <w:sz w:val="20"/>
-        </w:rPr>
-        <w:t xml:space="preserve">  },</w:t>
-      </w:r>
-    </w:p>
-    <w:p>
-      <w:pPr>
-        <w:spacing w:line="240" w:lineRule="auto"/>
-        <w:ind w:firstLine="0" w:left="709"/>
-      </w:pPr>
-      <w:r>
-        <w:rPr>
-          <w:rFonts w:ascii="Courier New" w:hAnsi="Courier New" w:eastAsia="Courier New"/>
-          <w:b w:val="0"/>
-          <w:i w:val="0"/>
-          <w:sz w:val="20"/>
-        </w:rPr>
-        <w:t xml:space="preserve">  "nodeB": {</w:t>
-      </w:r>
-    </w:p>
-    <w:p>
-      <w:pPr>
-        <w:spacing w:line="240" w:lineRule="auto"/>
-        <w:ind w:firstLine="0" w:left="709"/>
-      </w:pPr>
-      <w:r>
-        <w:rPr>
-          <w:rFonts w:ascii="Courier New" w:hAnsi="Courier New" w:eastAsia="Courier New"/>
-          <w:b w:val="0"/>
-          <w:i w:val="0"/>
-          <w:sz w:val="20"/>
-        </w:rPr>
-        <w:t xml:space="preserve">    "serverInstanceId": "app-api-2",</w:t>
-      </w:r>
-    </w:p>
-    <w:p>
-      <w:pPr>
-        <w:spacing w:line="240" w:lineRule="auto"/>
-        <w:ind w:firstLine="0" w:left="709"/>
-      </w:pPr>
-      <w:r>
-        <w:rPr>
-          <w:rFonts w:ascii="Courier New" w:hAnsi="Courier New" w:eastAsia="Courier New"/>
-          <w:b w:val="0"/>
-          <w:i w:val="0"/>
-          <w:sz w:val="20"/>
-        </w:rPr>
-        <w:t xml:space="preserve">    "machineName": "1d6a8589cdae",</w:t>
-      </w:r>
-    </w:p>
-    <w:p>
-      <w:pPr>
-        <w:spacing w:line="240" w:lineRule="auto"/>
-        <w:ind w:firstLine="0" w:left="709"/>
-      </w:pPr>
-      <w:r>
-        <w:rPr>
-          <w:rFonts w:ascii="Courier New" w:hAnsi="Courier New" w:eastAsia="Courier New"/>
-          <w:b w:val="0"/>
-          <w:i w:val="0"/>
-          <w:sz w:val="20"/>
-        </w:rPr>
-        <w:t xml:space="preserve">    "connectionId": "NpH7DSAYYJW1EWM2XKhyqQ",</w:t>
-      </w:r>
-    </w:p>
-    <w:p>
-      <w:pPr>
-        <w:spacing w:line="240" w:lineRule="auto"/>
-        <w:ind w:firstLine="0" w:left="709"/>
-      </w:pPr>
-      <w:r>
-        <w:rPr>
-          <w:rFonts w:ascii="Courier New" w:hAnsi="Courier New" w:eastAsia="Courier New"/>
-          <w:b w:val="0"/>
-          <w:i w:val="0"/>
-          <w:sz w:val="20"/>
-        </w:rPr>
-        <w:t xml:space="preserve">    "userIdentifier": "thesis-user"</w:t>
-      </w:r>
-    </w:p>
-    <w:p>
-      <w:pPr>
-        <w:spacing w:line="240" w:lineRule="auto"/>
-        <w:ind w:firstLine="0" w:left="709"/>
-      </w:pPr>
-      <w:r>
-        <w:rPr>
-          <w:rFonts w:ascii="Courier New" w:hAnsi="Courier New" w:eastAsia="Courier New"/>
-          <w:b w:val="0"/>
-          <w:i w:val="0"/>
-          <w:sz w:val="20"/>
-        </w:rPr>
-        <w:t xml:space="preserve">  },</w:t>
-      </w:r>
-    </w:p>
-    <w:p>
-      <w:pPr>
-        <w:spacing w:line="240" w:lineRule="auto"/>
-        <w:ind w:firstLine="0" w:left="709"/>
-      </w:pPr>
-      <w:r>
-        <w:rPr>
-          <w:rFonts w:ascii="Courier New" w:hAnsi="Courier New" w:eastAsia="Courier New"/>
-          <w:b w:val="0"/>
-          <w:i w:val="0"/>
-          <w:sz w:val="20"/>
-        </w:rPr>
-        <w:t xml:space="preserve">  "receivedPatch": {</w:t>
-      </w:r>
-    </w:p>
-    <w:p>
-      <w:pPr>
-        <w:spacing w:line="240" w:lineRule="auto"/>
-        <w:ind w:firstLine="0" w:left="709"/>
-      </w:pPr>
-      <w:r>
-        <w:rPr>
-          <w:rFonts w:ascii="Courier New" w:hAnsi="Courier New" w:eastAsia="Courier New"/>
-          <w:b w:val="0"/>
-          <w:i w:val="0"/>
-          <w:sz w:val="20"/>
-        </w:rPr>
-        <w:t xml:space="preserve">    "title": "scaleout-patched-1778316874715",</w:t>
-      </w:r>
-    </w:p>
-    <w:p>
-      <w:pPr>
-        <w:spacing w:line="240" w:lineRule="auto"/>
-        <w:ind w:firstLine="0" w:left="709"/>
-      </w:pPr>
-      <w:r>
-        <w:rPr>
-          <w:rFonts w:ascii="Courier New" w:hAnsi="Courier New" w:eastAsia="Courier New"/>
-          <w:b w:val="0"/>
-          <w:i w:val="0"/>
-          <w:sz w:val="20"/>
-        </w:rPr>
-        <w:t xml:space="preserve">    "updatedAt": "2026-05-09T08:54:35.186614+00:00"</w:t>
-      </w:r>
-    </w:p>
-    <w:p>
-      <w:pPr>
-        <w:spacing w:line="240" w:lineRule="auto"/>
-        <w:ind w:firstLine="0" w:left="709"/>
-      </w:pPr>
-      <w:r>
-        <w:rPr>
-          <w:rFonts w:ascii="Courier New" w:hAnsi="Courier New" w:eastAsia="Courier New"/>
-          <w:b w:val="0"/>
-          <w:i w:val="0"/>
-          <w:sz w:val="20"/>
-        </w:rPr>
-        <w:t xml:space="preserve">  }</w:t>
-      </w:r>
-    </w:p>
-    <w:p>
-      <w:pPr>
-        <w:spacing w:line="240" w:lineRule="auto"/>
-        <w:ind w:firstLine="0" w:left="709"/>
-      </w:pPr>
-      <w:r>
-        <w:rPr>
-          <w:rFonts w:ascii="Courier New" w:hAnsi="Courier New" w:eastAsia="Courier New"/>
-          <w:b w:val="0"/>
-          <w:i w:val="0"/>
-          <w:sz w:val="20"/>
-        </w:rPr>
-        <w:t>}</w:t>
+        <w:t>Интерпретация результата: клиент A был подключен к одному экземпляру сервиса, клиент B — к другому. Событие изменения отчета было создано через первый экземпляр, но не дошло до клиента, подключенного ко второму экземпляру. Этот результат подтверждает исходное архитектурное ограничение: простой запуск нескольких backend-процессов не обеспечивает глобальную real-time доставку [3].</w:t>
+      </w:r>
+    </w:p>
+    <w:p>
+      <w:pPr>
+        <w:pStyle w:val="Heading2"/>
+      </w:pPr>
+      <w:r>
+        <w:t>5.4 Результат с Redis backplane</w:t>
       </w:r>
     </w:p>
     <w:p>
@@ -7497,6 +7277,397 @@
           <w:i w:val="0"/>
           <w:sz w:val="28"/>
         </w:rPr>
+        <w:t>В режиме с Redis backplane проверочный сценарий завершился успешно. Один из зафиксированных результатов:</w:t>
+      </w:r>
+    </w:p>
+    <w:p>
+      <w:pPr>
+        <w:spacing w:line="240" w:lineRule="auto"/>
+        <w:ind w:firstLine="0" w:left="709"/>
+      </w:pPr>
+      <w:r>
+        <w:rPr>
+          <w:rFonts w:ascii="Courier New" w:hAnsi="Courier New" w:eastAsia="Courier New"/>
+          <w:b w:val="0"/>
+          <w:i w:val="0"/>
+          <w:sz w:val="20"/>
+        </w:rPr>
+        <w:t>{</w:t>
+      </w:r>
+    </w:p>
+    <w:p>
+      <w:pPr>
+        <w:spacing w:line="240" w:lineRule="auto"/>
+        <w:ind w:firstLine="0" w:left="709"/>
+      </w:pPr>
+      <w:r>
+        <w:rPr>
+          <w:rFonts w:ascii="Courier New" w:hAnsi="Courier New" w:eastAsia="Courier New"/>
+          <w:b w:val="0"/>
+          <w:i w:val="0"/>
+          <w:sz w:val="20"/>
+        </w:rPr>
+        <w:t xml:space="preserve">  "ok": true,</w:t>
+      </w:r>
+    </w:p>
+    <w:p>
+      <w:pPr>
+        <w:spacing w:line="240" w:lineRule="auto"/>
+        <w:ind w:firstLine="0" w:left="709"/>
+      </w:pPr>
+      <w:r>
+        <w:rPr>
+          <w:rFonts w:ascii="Courier New" w:hAnsi="Courier New" w:eastAsia="Courier New"/>
+          <w:b w:val="0"/>
+          <w:i w:val="0"/>
+          <w:sz w:val="20"/>
+        </w:rPr>
+        <w:t xml:space="preserve">  "reportId": "3",</w:t>
+      </w:r>
+    </w:p>
+    <w:p>
+      <w:pPr>
+        <w:spacing w:line="240" w:lineRule="auto"/>
+        <w:ind w:firstLine="0" w:left="709"/>
+      </w:pPr>
+      <w:r>
+        <w:rPr>
+          <w:rFonts w:ascii="Courier New" w:hAnsi="Courier New" w:eastAsia="Courier New"/>
+          <w:b w:val="0"/>
+          <w:i w:val="0"/>
+          <w:sz w:val="20"/>
+        </w:rPr>
+        <w:t xml:space="preserve">  "patchedTitle": "scaleout-patched-1778316874715",</w:t>
+      </w:r>
+    </w:p>
+    <w:p>
+      <w:pPr>
+        <w:spacing w:line="240" w:lineRule="auto"/>
+        <w:ind w:firstLine="0" w:left="709"/>
+      </w:pPr>
+      <w:r>
+        <w:rPr>
+          <w:rFonts w:ascii="Courier New" w:hAnsi="Courier New" w:eastAsia="Courier New"/>
+          <w:b w:val="0"/>
+          <w:i w:val="0"/>
+          <w:sz w:val="20"/>
+        </w:rPr>
+        <w:t xml:space="preserve">  "nodeA": {</w:t>
+      </w:r>
+    </w:p>
+    <w:p>
+      <w:pPr>
+        <w:spacing w:line="240" w:lineRule="auto"/>
+        <w:ind w:firstLine="0" w:left="709"/>
+      </w:pPr>
+      <w:r>
+        <w:rPr>
+          <w:rFonts w:ascii="Courier New" w:hAnsi="Courier New" w:eastAsia="Courier New"/>
+          <w:b w:val="0"/>
+          <w:i w:val="0"/>
+          <w:sz w:val="20"/>
+        </w:rPr>
+        <w:t xml:space="preserve">    "serverInstanceId": "app-api-1",</w:t>
+      </w:r>
+    </w:p>
+    <w:p>
+      <w:pPr>
+        <w:spacing w:line="240" w:lineRule="auto"/>
+        <w:ind w:firstLine="0" w:left="709"/>
+      </w:pPr>
+      <w:r>
+        <w:rPr>
+          <w:rFonts w:ascii="Courier New" w:hAnsi="Courier New" w:eastAsia="Courier New"/>
+          <w:b w:val="0"/>
+          <w:i w:val="0"/>
+          <w:sz w:val="20"/>
+        </w:rPr>
+        <w:t xml:space="preserve">    "machineName": "21ee5de48b13",</w:t>
+      </w:r>
+    </w:p>
+    <w:p>
+      <w:pPr>
+        <w:spacing w:line="240" w:lineRule="auto"/>
+        <w:ind w:firstLine="0" w:left="709"/>
+      </w:pPr>
+      <w:r>
+        <w:rPr>
+          <w:rFonts w:ascii="Courier New" w:hAnsi="Courier New" w:eastAsia="Courier New"/>
+          <w:b w:val="0"/>
+          <w:i w:val="0"/>
+          <w:sz w:val="20"/>
+        </w:rPr>
+        <w:t xml:space="preserve">    "connectionId": "9iIIs9uWgfJlf6BHXER8XA",</w:t>
+      </w:r>
+    </w:p>
+    <w:p>
+      <w:pPr>
+        <w:spacing w:line="240" w:lineRule="auto"/>
+        <w:ind w:firstLine="0" w:left="709"/>
+      </w:pPr>
+      <w:r>
+        <w:rPr>
+          <w:rFonts w:ascii="Courier New" w:hAnsi="Courier New" w:eastAsia="Courier New"/>
+          <w:b w:val="0"/>
+          <w:i w:val="0"/>
+          <w:sz w:val="20"/>
+        </w:rPr>
+        <w:t xml:space="preserve">    "userIdentifier": "thesis-user"</w:t>
+      </w:r>
+    </w:p>
+    <w:p>
+      <w:pPr>
+        <w:spacing w:line="240" w:lineRule="auto"/>
+        <w:ind w:firstLine="0" w:left="709"/>
+      </w:pPr>
+      <w:r>
+        <w:rPr>
+          <w:rFonts w:ascii="Courier New" w:hAnsi="Courier New" w:eastAsia="Courier New"/>
+          <w:b w:val="0"/>
+          <w:i w:val="0"/>
+          <w:sz w:val="20"/>
+        </w:rPr>
+        <w:t xml:space="preserve">  },</w:t>
+      </w:r>
+    </w:p>
+    <w:p>
+      <w:pPr>
+        <w:spacing w:line="240" w:lineRule="auto"/>
+        <w:ind w:firstLine="0" w:left="709"/>
+      </w:pPr>
+      <w:r>
+        <w:rPr>
+          <w:rFonts w:ascii="Courier New" w:hAnsi="Courier New" w:eastAsia="Courier New"/>
+          <w:b w:val="0"/>
+          <w:i w:val="0"/>
+          <w:sz w:val="20"/>
+        </w:rPr>
+        <w:t xml:space="preserve">  "nodeB": {</w:t>
+      </w:r>
+    </w:p>
+    <w:p>
+      <w:pPr>
+        <w:spacing w:line="240" w:lineRule="auto"/>
+        <w:ind w:firstLine="0" w:left="709"/>
+      </w:pPr>
+      <w:r>
+        <w:rPr>
+          <w:rFonts w:ascii="Courier New" w:hAnsi="Courier New" w:eastAsia="Courier New"/>
+          <w:b w:val="0"/>
+          <w:i w:val="0"/>
+          <w:sz w:val="20"/>
+        </w:rPr>
+        <w:t xml:space="preserve">    "serverInstanceId": "app-api-2",</w:t>
+      </w:r>
+    </w:p>
+    <w:p>
+      <w:pPr>
+        <w:spacing w:line="240" w:lineRule="auto"/>
+        <w:ind w:firstLine="0" w:left="709"/>
+      </w:pPr>
+      <w:r>
+        <w:rPr>
+          <w:rFonts w:ascii="Courier New" w:hAnsi="Courier New" w:eastAsia="Courier New"/>
+          <w:b w:val="0"/>
+          <w:i w:val="0"/>
+          <w:sz w:val="20"/>
+        </w:rPr>
+        <w:t xml:space="preserve">    "machineName": "1d6a8589cdae",</w:t>
+      </w:r>
+    </w:p>
+    <w:p>
+      <w:pPr>
+        <w:spacing w:line="240" w:lineRule="auto"/>
+        <w:ind w:firstLine="0" w:left="709"/>
+      </w:pPr>
+      <w:r>
+        <w:rPr>
+          <w:rFonts w:ascii="Courier New" w:hAnsi="Courier New" w:eastAsia="Courier New"/>
+          <w:b w:val="0"/>
+          <w:i w:val="0"/>
+          <w:sz w:val="20"/>
+        </w:rPr>
+        <w:t xml:space="preserve">    "connectionId": "NpH7DSAYYJW1EWM2XKhyqQ",</w:t>
+      </w:r>
+    </w:p>
+    <w:p>
+      <w:pPr>
+        <w:spacing w:line="240" w:lineRule="auto"/>
+        <w:ind w:firstLine="0" w:left="709"/>
+      </w:pPr>
+      <w:r>
+        <w:rPr>
+          <w:rFonts w:ascii="Courier New" w:hAnsi="Courier New" w:eastAsia="Courier New"/>
+          <w:b w:val="0"/>
+          <w:i w:val="0"/>
+          <w:sz w:val="20"/>
+        </w:rPr>
+        <w:t xml:space="preserve">    "userIdentifier": "thesis-user"</w:t>
+      </w:r>
+    </w:p>
+    <w:p>
+      <w:pPr>
+        <w:spacing w:line="240" w:lineRule="auto"/>
+        <w:ind w:firstLine="0" w:left="709"/>
+      </w:pPr>
+      <w:r>
+        <w:rPr>
+          <w:rFonts w:ascii="Courier New" w:hAnsi="Courier New" w:eastAsia="Courier New"/>
+          <w:b w:val="0"/>
+          <w:i w:val="0"/>
+          <w:sz w:val="20"/>
+        </w:rPr>
+        <w:t xml:space="preserve">  },</w:t>
+      </w:r>
+    </w:p>
+    <w:p>
+      <w:pPr>
+        <w:spacing w:line="240" w:lineRule="auto"/>
+        <w:ind w:firstLine="0" w:left="709"/>
+      </w:pPr>
+      <w:r>
+        <w:rPr>
+          <w:rFonts w:ascii="Courier New" w:hAnsi="Courier New" w:eastAsia="Courier New"/>
+          <w:b w:val="0"/>
+          <w:i w:val="0"/>
+          <w:sz w:val="20"/>
+        </w:rPr>
+        <w:t xml:space="preserve">  "receivedPatch": {</w:t>
+      </w:r>
+    </w:p>
+    <w:p>
+      <w:pPr>
+        <w:spacing w:line="240" w:lineRule="auto"/>
+        <w:ind w:firstLine="0" w:left="709"/>
+      </w:pPr>
+      <w:r>
+        <w:rPr>
+          <w:rFonts w:ascii="Courier New" w:hAnsi="Courier New" w:eastAsia="Courier New"/>
+          <w:b w:val="0"/>
+          <w:i w:val="0"/>
+          <w:sz w:val="20"/>
+        </w:rPr>
+        <w:t xml:space="preserve">    "title": "scaleout-patched-1778316874715",</w:t>
+      </w:r>
+    </w:p>
+    <w:p>
+      <w:pPr>
+        <w:spacing w:line="240" w:lineRule="auto"/>
+        <w:ind w:firstLine="0" w:left="709"/>
+      </w:pPr>
+      <w:r>
+        <w:rPr>
+          <w:rFonts w:ascii="Courier New" w:hAnsi="Courier New" w:eastAsia="Courier New"/>
+          <w:b w:val="0"/>
+          <w:i w:val="0"/>
+          <w:sz w:val="20"/>
+        </w:rPr>
+        <w:t xml:space="preserve">    "updatedAt": "2026-05-09T08:54:35.186614+00:00"</w:t>
+      </w:r>
+    </w:p>
+    <w:p>
+      <w:pPr>
+        <w:spacing w:line="240" w:lineRule="auto"/>
+        <w:ind w:firstLine="0" w:left="709"/>
+      </w:pPr>
+      <w:r>
+        <w:rPr>
+          <w:rFonts w:ascii="Courier New" w:hAnsi="Courier New" w:eastAsia="Courier New"/>
+          <w:b w:val="0"/>
+          <w:i w:val="0"/>
+          <w:sz w:val="20"/>
+        </w:rPr>
+        <w:t xml:space="preserve">  },</w:t>
+      </w:r>
+    </w:p>
+    <w:p>
+      <w:pPr>
+        <w:spacing w:line="240" w:lineRule="auto"/>
+        <w:ind w:firstLine="0" w:left="709"/>
+      </w:pPr>
+      <w:r>
+        <w:rPr>
+          <w:rFonts w:ascii="Courier New" w:hAnsi="Courier New" w:eastAsia="Courier New"/>
+          <w:b w:val="0"/>
+          <w:i w:val="0"/>
+          <w:sz w:val="20"/>
+        </w:rPr>
+        <w:t xml:space="preserve">  "metrics": {</w:t>
+      </w:r>
+    </w:p>
+    <w:p>
+      <w:pPr>
+        <w:spacing w:line="240" w:lineRule="auto"/>
+        <w:ind w:firstLine="0" w:left="709"/>
+      </w:pPr>
+      <w:r>
+        <w:rPr>
+          <w:rFonts w:ascii="Courier New" w:hAnsi="Courier New" w:eastAsia="Courier New"/>
+          <w:b w:val="0"/>
+          <w:i w:val="0"/>
+          <w:sz w:val="20"/>
+        </w:rPr>
+        <w:t xml:space="preserve">    "deliveryLatencyMs": 9.5,</w:t>
+      </w:r>
+    </w:p>
+    <w:p>
+      <w:pPr>
+        <w:spacing w:line="240" w:lineRule="auto"/>
+        <w:ind w:firstLine="0" w:left="709"/>
+      </w:pPr>
+      <w:r>
+        <w:rPr>
+          <w:rFonts w:ascii="Courier New" w:hAnsi="Courier New" w:eastAsia="Courier New"/>
+          <w:b w:val="0"/>
+          <w:i w:val="0"/>
+          <w:sz w:val="20"/>
+        </w:rPr>
+        <w:t xml:space="preserve">    "patchRequestMs": 8.5</w:t>
+      </w:r>
+    </w:p>
+    <w:p>
+      <w:pPr>
+        <w:spacing w:line="240" w:lineRule="auto"/>
+        <w:ind w:firstLine="0" w:left="709"/>
+      </w:pPr>
+      <w:r>
+        <w:rPr>
+          <w:rFonts w:ascii="Courier New" w:hAnsi="Courier New" w:eastAsia="Courier New"/>
+          <w:b w:val="0"/>
+          <w:i w:val="0"/>
+          <w:sz w:val="20"/>
+        </w:rPr>
+        <w:t xml:space="preserve">  }</w:t>
+      </w:r>
+    </w:p>
+    <w:p>
+      <w:pPr>
+        <w:spacing w:line="240" w:lineRule="auto"/>
+        <w:ind w:firstLine="0" w:left="709"/>
+      </w:pPr>
+      <w:r>
+        <w:rPr>
+          <w:rFonts w:ascii="Courier New" w:hAnsi="Courier New" w:eastAsia="Courier New"/>
+          <w:b w:val="0"/>
+          <w:i w:val="0"/>
+          <w:sz w:val="20"/>
+        </w:rPr>
+        <w:t>}</w:t>
+      </w:r>
+    </w:p>
+    <w:p>
+      <w:pPr>
+        <w:spacing w:line="360" w:lineRule="auto"/>
+        <w:ind w:firstLine="709"/>
+        <w:jc w:val="both"/>
+      </w:pPr>
+      <w:r>
+        <w:rPr>
+          <w:rFonts w:ascii="Times New Roman" w:hAnsi="Times New Roman" w:eastAsia="Times New Roman"/>
+          <w:b w:val="0"/>
+          <w:i w:val="0"/>
+          <w:sz w:val="28"/>
+        </w:rPr>
         <w:t xml:space="preserve">Из результата видно, что клиент A был подключен к </w:t>
       </w:r>
       <w:r>
@@ -7559,7 +7730,314 @@
         <w:pStyle w:val="Heading2"/>
       </w:pPr>
       <w:r>
-        <w:t>5.5 Сравнительная таблица результатов</w:t>
+        <w:t>5.5 Серийная проверка и задержка доставки</w:t>
+      </w:r>
+    </w:p>
+    <w:p>
+      <w:pPr>
+        <w:spacing w:line="360" w:lineRule="auto"/>
+        <w:ind w:firstLine="709"/>
+        <w:jc w:val="both"/>
+      </w:pPr>
+      <w:r>
+        <w:rPr>
+          <w:rFonts w:ascii="Times New Roman" w:hAnsi="Times New Roman" w:eastAsia="Times New Roman"/>
+          <w:b w:val="0"/>
+          <w:i w:val="0"/>
+          <w:sz w:val="28"/>
+        </w:rPr>
+        <w:t>Для дополнительной проверки был выполнен серийный запуск из пяти независимых итераций в режиме с Redis backplane:</w:t>
+      </w:r>
+    </w:p>
+    <w:p>
+      <w:pPr>
+        <w:spacing w:line="240" w:lineRule="auto"/>
+        <w:ind w:firstLine="0" w:left="709"/>
+      </w:pPr>
+      <w:r>
+        <w:rPr>
+          <w:rFonts w:ascii="Courier New" w:hAnsi="Courier New" w:eastAsia="Courier New"/>
+          <w:b w:val="0"/>
+          <w:i w:val="0"/>
+          <w:sz w:val="20"/>
+        </w:rPr>
+        <w:t>THESIS_ITERATIONS=5 node scripts/realtime-scaleout-check.mjs</w:t>
+      </w:r>
+    </w:p>
+    <w:p>
+      <w:pPr>
+        <w:spacing w:line="360" w:lineRule="auto"/>
+        <w:ind w:firstLine="709"/>
+        <w:jc w:val="both"/>
+      </w:pPr>
+      <w:r>
+        <w:rPr>
+          <w:rFonts w:ascii="Times New Roman" w:hAnsi="Times New Roman" w:eastAsia="Times New Roman"/>
+          <w:b w:val="0"/>
+          <w:i w:val="0"/>
+          <w:sz w:val="28"/>
+        </w:rPr>
+        <w:t>Результат:</w:t>
+      </w:r>
+    </w:p>
+    <w:p>
+      <w:pPr>
+        <w:spacing w:line="240" w:lineRule="auto"/>
+        <w:ind w:firstLine="0" w:left="709"/>
+      </w:pPr>
+      <w:r>
+        <w:rPr>
+          <w:rFonts w:ascii="Courier New" w:hAnsi="Courier New" w:eastAsia="Courier New"/>
+          <w:b w:val="0"/>
+          <w:i w:val="0"/>
+          <w:sz w:val="20"/>
+        </w:rPr>
+        <w:t>{</w:t>
+      </w:r>
+    </w:p>
+    <w:p>
+      <w:pPr>
+        <w:spacing w:line="240" w:lineRule="auto"/>
+        <w:ind w:firstLine="0" w:left="709"/>
+      </w:pPr>
+      <w:r>
+        <w:rPr>
+          <w:rFonts w:ascii="Courier New" w:hAnsi="Courier New" w:eastAsia="Courier New"/>
+          <w:b w:val="0"/>
+          <w:i w:val="0"/>
+          <w:sz w:val="20"/>
+        </w:rPr>
+        <w:t xml:space="preserve">  "ok": true,</w:t>
+      </w:r>
+    </w:p>
+    <w:p>
+      <w:pPr>
+        <w:spacing w:line="240" w:lineRule="auto"/>
+        <w:ind w:firstLine="0" w:left="709"/>
+      </w:pPr>
+      <w:r>
+        <w:rPr>
+          <w:rFonts w:ascii="Courier New" w:hAnsi="Courier New" w:eastAsia="Courier New"/>
+          <w:b w:val="0"/>
+          <w:i w:val="0"/>
+          <w:sz w:val="20"/>
+        </w:rPr>
+        <w:t xml:space="preserve">  "iterations": 5,</w:t>
+      </w:r>
+    </w:p>
+    <w:p>
+      <w:pPr>
+        <w:spacing w:line="240" w:lineRule="auto"/>
+        <w:ind w:firstLine="0" w:left="709"/>
+      </w:pPr>
+      <w:r>
+        <w:rPr>
+          <w:rFonts w:ascii="Courier New" w:hAnsi="Courier New" w:eastAsia="Courier New"/>
+          <w:b w:val="0"/>
+          <w:i w:val="0"/>
+          <w:sz w:val="20"/>
+        </w:rPr>
+        <w:t xml:space="preserve">  "successful": 5,</w:t>
+      </w:r>
+    </w:p>
+    <w:p>
+      <w:pPr>
+        <w:spacing w:line="240" w:lineRule="auto"/>
+        <w:ind w:firstLine="0" w:left="709"/>
+      </w:pPr>
+      <w:r>
+        <w:rPr>
+          <w:rFonts w:ascii="Courier New" w:hAnsi="Courier New" w:eastAsia="Courier New"/>
+          <w:b w:val="0"/>
+          <w:i w:val="0"/>
+          <w:sz w:val="20"/>
+        </w:rPr>
+        <w:t xml:space="preserve">  "failed": 0,</w:t>
+      </w:r>
+    </w:p>
+    <w:p>
+      <w:pPr>
+        <w:spacing w:line="240" w:lineRule="auto"/>
+        <w:ind w:firstLine="0" w:left="709"/>
+      </w:pPr>
+      <w:r>
+        <w:rPr>
+          <w:rFonts w:ascii="Courier New" w:hAnsi="Courier New" w:eastAsia="Courier New"/>
+          <w:b w:val="0"/>
+          <w:i w:val="0"/>
+          <w:sz w:val="20"/>
+        </w:rPr>
+        <w:t xml:space="preserve">  "latencyMs": {</w:t>
+      </w:r>
+    </w:p>
+    <w:p>
+      <w:pPr>
+        <w:spacing w:line="240" w:lineRule="auto"/>
+        <w:ind w:firstLine="0" w:left="709"/>
+      </w:pPr>
+      <w:r>
+        <w:rPr>
+          <w:rFonts w:ascii="Courier New" w:hAnsi="Courier New" w:eastAsia="Courier New"/>
+          <w:b w:val="0"/>
+          <w:i w:val="0"/>
+          <w:sz w:val="20"/>
+        </w:rPr>
+        <w:t xml:space="preserve">    "min": 3.6,</w:t>
+      </w:r>
+    </w:p>
+    <w:p>
+      <w:pPr>
+        <w:spacing w:line="240" w:lineRule="auto"/>
+        <w:ind w:firstLine="0" w:left="709"/>
+      </w:pPr>
+      <w:r>
+        <w:rPr>
+          <w:rFonts w:ascii="Courier New" w:hAnsi="Courier New" w:eastAsia="Courier New"/>
+          <w:b w:val="0"/>
+          <w:i w:val="0"/>
+          <w:sz w:val="20"/>
+        </w:rPr>
+        <w:t xml:space="preserve">    "max": 9.5,</w:t>
+      </w:r>
+    </w:p>
+    <w:p>
+      <w:pPr>
+        <w:spacing w:line="240" w:lineRule="auto"/>
+        <w:ind w:firstLine="0" w:left="709"/>
+      </w:pPr>
+      <w:r>
+        <w:rPr>
+          <w:rFonts w:ascii="Courier New" w:hAnsi="Courier New" w:eastAsia="Courier New"/>
+          <w:b w:val="0"/>
+          <w:i w:val="0"/>
+          <w:sz w:val="20"/>
+        </w:rPr>
+        <w:t xml:space="preserve">    "avg": 5.5,</w:t>
+      </w:r>
+    </w:p>
+    <w:p>
+      <w:pPr>
+        <w:spacing w:line="240" w:lineRule="auto"/>
+        <w:ind w:firstLine="0" w:left="709"/>
+      </w:pPr>
+      <w:r>
+        <w:rPr>
+          <w:rFonts w:ascii="Courier New" w:hAnsi="Courier New" w:eastAsia="Courier New"/>
+          <w:b w:val="0"/>
+          <w:i w:val="0"/>
+          <w:sz w:val="20"/>
+        </w:rPr>
+        <w:t xml:space="preserve">    "p50": 4.4,</w:t>
+      </w:r>
+    </w:p>
+    <w:p>
+      <w:pPr>
+        <w:spacing w:line="240" w:lineRule="auto"/>
+        <w:ind w:firstLine="0" w:left="709"/>
+      </w:pPr>
+      <w:r>
+        <w:rPr>
+          <w:rFonts w:ascii="Courier New" w:hAnsi="Courier New" w:eastAsia="Courier New"/>
+          <w:b w:val="0"/>
+          <w:i w:val="0"/>
+          <w:sz w:val="20"/>
+        </w:rPr>
+        <w:t xml:space="preserve">    "p95": 9.5</w:t>
+      </w:r>
+    </w:p>
+    <w:p>
+      <w:pPr>
+        <w:spacing w:line="240" w:lineRule="auto"/>
+        <w:ind w:firstLine="0" w:left="709"/>
+      </w:pPr>
+      <w:r>
+        <w:rPr>
+          <w:rFonts w:ascii="Courier New" w:hAnsi="Courier New" w:eastAsia="Courier New"/>
+          <w:b w:val="0"/>
+          <w:i w:val="0"/>
+          <w:sz w:val="20"/>
+        </w:rPr>
+        <w:t xml:space="preserve">  }</w:t>
+      </w:r>
+    </w:p>
+    <w:p>
+      <w:pPr>
+        <w:spacing w:line="240" w:lineRule="auto"/>
+        <w:ind w:firstLine="0" w:left="709"/>
+      </w:pPr>
+      <w:r>
+        <w:rPr>
+          <w:rFonts w:ascii="Courier New" w:hAnsi="Courier New" w:eastAsia="Courier New"/>
+          <w:b w:val="0"/>
+          <w:i w:val="0"/>
+          <w:sz w:val="20"/>
+        </w:rPr>
+        <w:t>}</w:t>
+      </w:r>
+    </w:p>
+    <w:p>
+      <w:pPr>
+        <w:spacing w:line="360" w:lineRule="auto"/>
+        <w:ind w:firstLine="709"/>
+        <w:jc w:val="both"/>
+      </w:pPr>
+      <w:r>
+        <w:rPr>
+          <w:rFonts w:ascii="Times New Roman" w:hAnsi="Times New Roman" w:eastAsia="Times New Roman"/>
+          <w:b w:val="0"/>
+          <w:i w:val="0"/>
+          <w:sz w:val="28"/>
+        </w:rPr>
+        <w:t xml:space="preserve">Все пять проверок завершились успешно: каждый раз клиент, подключенный к </w:t>
+      </w:r>
+      <w:r>
+        <w:rPr>
+          <w:rFonts w:ascii="Courier New" w:hAnsi="Courier New" w:eastAsia="Courier New"/>
+          <w:b w:val="0"/>
+          <w:i w:val="0"/>
+          <w:sz w:val="28"/>
+        </w:rPr>
+        <w:t>app-api-2</w:t>
+      </w:r>
+      <w:r>
+        <w:rPr>
+          <w:rFonts w:ascii="Times New Roman" w:hAnsi="Times New Roman" w:eastAsia="Times New Roman"/>
+          <w:b w:val="0"/>
+          <w:i w:val="0"/>
+          <w:sz w:val="28"/>
+        </w:rPr>
+        <w:t xml:space="preserve">, получал событие, инициированное через </w:t>
+      </w:r>
+      <w:r>
+        <w:rPr>
+          <w:rFonts w:ascii="Courier New" w:hAnsi="Courier New" w:eastAsia="Courier New"/>
+          <w:b w:val="0"/>
+          <w:i w:val="0"/>
+          <w:sz w:val="28"/>
+        </w:rPr>
+        <w:t>app-api-1</w:t>
+      </w:r>
+      <w:r>
+        <w:rPr>
+          <w:rFonts w:ascii="Times New Roman" w:hAnsi="Times New Roman" w:eastAsia="Times New Roman"/>
+          <w:b w:val="0"/>
+          <w:i w:val="0"/>
+          <w:sz w:val="28"/>
+        </w:rPr>
+        <w:t>. Измеренная задержка доставки в локальном стенде составила в среднем 5,5 мс, p50 — 4,4 мс, p95 — 9,5 мс. Эти значения не следует трактовать как промышленный нагрузочный тест, поскольку стенд локальный и число итераций невелико. Однако они подтверждают, что реализованная межузловая доставка работает не только в единичном запуске, но и в серии повторных проверок.</w:t>
+      </w:r>
+    </w:p>
+    <w:p>
+      <w:r>
+        <w:br w:type="page"/>
+      </w:r>
+    </w:p>
+    <w:p>
+      <w:pPr>
+        <w:pStyle w:val="Heading2"/>
+      </w:pPr>
+      <w:r>
+        <w:t>5.6 Сравнительная таблица результатов</w:t>
       </w:r>
     </w:p>
     <w:p>
@@ -7879,7 +8357,7 @@
                 <w:b w:val="0"/>
                 <w:sz w:val="22"/>
               </w:rPr>
-              <w:t>Multi-instance с backplane</w:t>
+              <w:t>Multi-instance с backplane, одиночный запуск</w:t>
             </w:r>
           </w:p>
         </w:tc>
@@ -7994,13 +8472,147 @@
           </w:p>
         </w:tc>
       </w:tr>
+      <w:tr>
+        <w:tc>
+          <w:tcPr>
+            <w:tcW w:type="dxa" w:w="1615"/>
+            <w:vAlign w:val="center"/>
+          </w:tcPr>
+          <w:p>
+            <w:pPr>
+              <w:spacing w:line="240" w:lineRule="auto" w:before="0" w:after="0"/>
+              <w:ind w:firstLine="0"/>
+              <w:jc w:val="left"/>
+            </w:pPr>
+            <w:r/>
+            <w:r>
+              <w:rPr>
+                <w:rFonts w:ascii="Times New Roman" w:hAnsi="Times New Roman" w:eastAsia="Times New Roman"/>
+                <w:b w:val="0"/>
+                <w:sz w:val="22"/>
+              </w:rPr>
+              <w:t>Multi-instance с backplane, 5 итераций</w:t>
+            </w:r>
+          </w:p>
+        </w:tc>
+        <w:tc>
+          <w:tcPr>
+            <w:tcW w:type="dxa" w:w="1615"/>
+            <w:vAlign w:val="center"/>
+          </w:tcPr>
+          <w:p>
+            <w:pPr>
+              <w:spacing w:line="240" w:lineRule="auto" w:before="0" w:after="0"/>
+              <w:ind w:firstLine="0"/>
+              <w:jc w:val="left"/>
+            </w:pPr>
+            <w:r/>
+            <w:r>
+              <w:rPr>
+                <w:rFonts w:ascii="Times New Roman" w:hAnsi="Times New Roman" w:eastAsia="Times New Roman"/>
+                <w:b w:val="0"/>
+                <w:sz w:val="22"/>
+              </w:rPr>
+              <w:t>Да</w:t>
+            </w:r>
+          </w:p>
+        </w:tc>
+        <w:tc>
+          <w:tcPr>
+            <w:tcW w:type="dxa" w:w="1615"/>
+            <w:vAlign w:val="center"/>
+          </w:tcPr>
+          <w:p>
+            <w:pPr>
+              <w:spacing w:line="240" w:lineRule="auto" w:before="0" w:after="0"/>
+              <w:ind w:firstLine="0"/>
+              <w:jc w:val="left"/>
+            </w:pPr>
+            <w:r/>
+            <w:r>
+              <w:rPr>
+                <w:rFonts w:ascii="Times New Roman" w:hAnsi="Times New Roman" w:eastAsia="Times New Roman"/>
+                <w:b w:val="0"/>
+                <w:sz w:val="22"/>
+              </w:rPr>
+              <w:t>Да</w:t>
+            </w:r>
+          </w:p>
+        </w:tc>
+        <w:tc>
+          <w:tcPr>
+            <w:tcW w:type="dxa" w:w="1615"/>
+            <w:vAlign w:val="center"/>
+          </w:tcPr>
+          <w:p>
+            <w:pPr>
+              <w:spacing w:line="240" w:lineRule="auto" w:before="0" w:after="0"/>
+              <w:ind w:firstLine="0"/>
+              <w:jc w:val="left"/>
+            </w:pPr>
+            <w:r/>
+            <w:r>
+              <w:rPr>
+                <w:rFonts w:ascii="Times New Roman" w:hAnsi="Times New Roman" w:eastAsia="Times New Roman"/>
+                <w:b w:val="0"/>
+                <w:sz w:val="22"/>
+              </w:rPr>
+              <w:t>Все события доставляются между узлами</w:t>
+            </w:r>
+          </w:p>
+        </w:tc>
+        <w:tc>
+          <w:tcPr>
+            <w:tcW w:type="dxa" w:w="1615"/>
+            <w:vAlign w:val="center"/>
+          </w:tcPr>
+          <w:p>
+            <w:pPr>
+              <w:spacing w:line="240" w:lineRule="auto" w:before="0" w:after="0"/>
+              <w:ind w:firstLine="0"/>
+              <w:jc w:val="left"/>
+            </w:pPr>
+            <w:r/>
+            <w:r>
+              <w:rPr>
+                <w:rFonts w:ascii="Times New Roman" w:hAnsi="Times New Roman" w:eastAsia="Times New Roman"/>
+                <w:b w:val="0"/>
+                <w:sz w:val="22"/>
+              </w:rPr>
+              <w:t>5 из 5 успешно, p95 = 9,5 мс</w:t>
+            </w:r>
+          </w:p>
+        </w:tc>
+        <w:tc>
+          <w:tcPr>
+            <w:tcW w:type="dxa" w:w="1615"/>
+            <w:vAlign w:val="center"/>
+          </w:tcPr>
+          <w:p>
+            <w:pPr>
+              <w:spacing w:line="240" w:lineRule="auto" w:before="0" w:after="0"/>
+              <w:ind w:firstLine="0"/>
+              <w:jc w:val="left"/>
+            </w:pPr>
+            <w:r/>
+            <w:r>
+              <w:rPr>
+                <w:rFonts w:ascii="Times New Roman" w:hAnsi="Times New Roman" w:eastAsia="Times New Roman"/>
+                <w:b w:val="0"/>
+                <w:sz w:val="22"/>
+              </w:rPr>
+              <w:t>Подтверждена повторяемость результата</w:t>
+            </w:r>
+          </w:p>
+        </w:tc>
+      </w:tr>
     </w:tbl>
     <w:p>
       <w:pPr>
         <w:pStyle w:val="Heading2"/>
       </w:pPr>
       <w:r>
-        <w:t>5.6 Проверка входной точки стенда</w:t>
+        <w:t>5.7 Проверка входной точки стенда</w:t>
       </w:r>
     </w:p>
     <w:p>
@@ -8078,7 +8690,7 @@
         <w:pStyle w:val="Heading2"/>
       </w:pPr>
       <w:r>
-        <w:t>5.7 Ограничения эксперимента</w:t>
+        <w:t>5.8 Ограничения эксперимента</w:t>
       </w:r>
     </w:p>
     <w:p>
@@ -8110,7 +8722,7 @@
           <w:i w:val="0"/>
           <w:sz w:val="28"/>
         </w:rPr>
-        <w:t>Серией из N последовательных изменений для оценки доли успешно доставленных событий.</w:t>
+        <w:t>Сценарием остановки одного экземпляра `app-api` и проверки восстановления соединения.</w:t>
       </w:r>
     </w:p>
     <w:p>
@@ -8126,7 +8738,7 @@
           <w:i w:val="0"/>
           <w:sz w:val="28"/>
         </w:rPr>
-        <w:t>Измерением p50 и p95 задержки доставки с учетом того, что задержка влияет на качество real-time совместной работы [15].</w:t>
+        <w:t>Проверкой повторного вступления в группу после reconnect.</w:t>
       </w:r>
     </w:p>
     <w:p>
@@ -8142,7 +8754,7 @@
           <w:i w:val="0"/>
           <w:sz w:val="28"/>
         </w:rPr>
-        <w:t>Сценарием остановки одного экземпляра `app-api` и проверки восстановления соединения.</w:t>
+        <w:t>Увеличением числа одновременных клиентов и числа событий.</w:t>
       </w:r>
     </w:p>
     <w:p>
@@ -8158,7 +8770,7 @@
           <w:i w:val="0"/>
           <w:sz w:val="28"/>
         </w:rPr>
-        <w:t>Проверкой повторного вступления в группу после reconnect.</w:t>
+        <w:t>Сравнением поведения при разных стратегиях балансировки.</w:t>
       </w:r>
     </w:p>
     <w:p>
@@ -8174,7 +8786,7 @@
           <w:i w:val="0"/>
           <w:sz w:val="28"/>
         </w:rPr>
-        <w:t>Сравнением поведения при разных стратегиях балансировки.</w:t>
+        <w:t>Сбором p99 и распределения задержек на более длинной серии запусков с учетом того, что задержка влияет на качество real-time совместной работы [15].</w:t>
       </w:r>
     </w:p>
     <w:p>
@@ -8198,7 +8810,7 @@
         <w:pStyle w:val="Heading2"/>
       </w:pPr>
       <w:r>
-        <w:t>5.8 Вывод по испытаниям</w:t>
+        <w:t>5.9 Вывод по испытаниям</w:t>
       </w:r>
     </w:p>
     <w:p>
@@ -8250,7 +8862,7 @@
           <w:i w:val="0"/>
           <w:sz w:val="28"/>
         </w:rPr>
-        <w:t>. Таким образом, реализованное решение подтверждает заявленный тезис работы: single-node ограничение WebSocket-архитектуры устранено за счет распределенного real-time контура [3], [4].</w:t>
+        <w:t>. Серийная проверка показала 5 успешных доставок из 5, а p95 задержки в локальном стенде составил 9,5 мс. Таким образом, реализованное решение подтверждает заявленный тезис работы: single-node ограничение WebSocket-архитектуры устранено за счет распределенного real-time контура [3], [4].</w:t>
       </w:r>
     </w:p>
     <w:p>
@@ -8361,7 +8973,7 @@
           <w:i w:val="0"/>
           <w:sz w:val="28"/>
         </w:rPr>
-        <w:t>. Это подтверждает устранение ограничения single-node WebSocket-архитектуры [3], [4].</w:t>
+        <w:t>. Серийный запуск из пяти итераций подтвердил повторяемость результата и позволил получить первичную оценку задержки доставки. Это подтверждает устранение ограничения single-node WebSocket-архитектуры [3], [4].</w:t>
       </w:r>
     </w:p>
     <w:p>
@@ -8377,7 +8989,7 @@
           <w:i w:val="0"/>
           <w:sz w:val="28"/>
         </w:rPr>
-        <w:t>Полученные результаты имеют практическую значимость для дальнейшего развития системы отслеживания задач, поскольку предложенное решение позволяет перейти от локального real-time механизма к масштабируемому контуру совместной работы над сущностями. В дальнейшем решение может быть расширено метриками задержек, отказными сценариями, дополнительной трассировкой событий и проверкой на большем числе одновременных клиентов [8], [15].</w:t>
+        <w:t>Полученные результаты имеют практическую значимость для дальнейшего развития системы отслеживания задач, поскольку предложенное решение позволяет перейти от локального real-time механизма к масштабируемому контуру совместной работы над сущностями. В дальнейшем решение может быть расширено отказными сценариями, дополнительной трассировкой событий, более длинной серией измерений задержек и проверкой на большем числе одновременных клиентов [8], [15].</w:t>
       </w:r>
     </w:p>
     <w:p>

</xml_diff>

<commit_message>
Enhance documentation and add new report generation scripts for final qualifying work. Update README.md with new artifacts, including practice report and presentation draft. Introduce scripts for generating practice reports and presentations, and refine existing DOCX generation logic. Update experiment logs with new metrics and scenarios for rejoin and failover tests, ensuring comprehensive coverage of real-time interface performance.
</commit_message>
<xml_diff>
--- a/build/docx/vkr-draft-1.docx
+++ b/build/docx/vkr-draft-1.docx
@@ -1823,7 +1823,7 @@
           <w:i w:val="0"/>
           <w:sz w:val="28"/>
         </w:rPr>
-        <w:t>Выпускная квалификационная работа содержит введение, пять глав, заключение, список использованных источников из 15 наименований и приложения. Количество страниц, рисунков и таблиц уточняется после финальной верстки.</w:t>
+        <w:t>Выпускная квалификационная работа содержит введение, пять глав, заключение, список использованных источников из 20 наименований и приложения. Количество страниц, рисунков и таблиц уточняется после финальной верстки.</w:t>
       </w:r>
     </w:p>
     <w:p>
@@ -2396,7 +2396,7 @@
           <w:i w:val="0"/>
           <w:sz w:val="22"/>
         </w:rPr>
-        <w:t>5.6 Сравнительная таблица результатов ....................................... 25</w:t>
+        <w:t>5.6 Проверка восстановления соединения и отказа узла ........................ 24</w:t>
       </w:r>
     </w:p>
     <w:p>
@@ -2411,7 +2411,7 @@
           <w:i w:val="0"/>
           <w:sz w:val="22"/>
         </w:rPr>
-        <w:t>5.7 Проверка входной точки стенда ........................................... 25</w:t>
+        <w:t>5.7 Сравнительная таблица результатов ....................................... 26</w:t>
       </w:r>
     </w:p>
     <w:p>
@@ -2426,7 +2426,7 @@
           <w:i w:val="0"/>
           <w:sz w:val="22"/>
         </w:rPr>
-        <w:t>5.8 Ограничения эксперимента ................................................ 25</w:t>
+        <w:t>5.8 Проверка входной точки стенда ........................................... 26</w:t>
       </w:r>
     </w:p>
     <w:p>
@@ -2441,7 +2441,22 @@
           <w:i w:val="0"/>
           <w:sz w:val="22"/>
         </w:rPr>
-        <w:t>5.9 Вывод по испытаниям ..................................................... 26</w:t>
+        <w:t>5.9 Ограничения эксперимента ................................................ 26</w:t>
+      </w:r>
+    </w:p>
+    <w:p>
+      <w:pPr>
+        <w:spacing w:line="240" w:lineRule="auto" w:after="0"/>
+        <w:ind w:firstLine="0" w:left="425"/>
+      </w:pPr>
+      <w:r>
+        <w:rPr>
+          <w:rFonts w:ascii="Times New Roman" w:hAnsi="Times New Roman" w:eastAsia="Times New Roman"/>
+          <w:b w:val="0"/>
+          <w:i w:val="0"/>
+          <w:sz w:val="22"/>
+        </w:rPr>
+        <w:t>5.10 Вывод по испытаниям .................................................... 27</w:t>
       </w:r>
     </w:p>
     <w:p>
@@ -2456,7 +2471,7 @@
           <w:i w:val="0"/>
           <w:sz w:val="22"/>
         </w:rPr>
-        <w:t>ЗАКЛЮЧЕНИЕ ........................................................................ 26</w:t>
+        <w:t>ЗАКЛЮЧЕНИЕ ........................................................................ 27</w:t>
       </w:r>
     </w:p>
     <w:p>
@@ -2471,7 +2486,7 @@
           <w:i w:val="0"/>
           <w:sz w:val="22"/>
         </w:rPr>
-        <w:t>СПИСОК ИСПОЛЬЗОВАННЫХ ИСТОЧНИКОВ .................................................. 28</w:t>
+        <w:t>СПИСОК ИСПОЛЬЗОВАННЫХ ИСТОЧНИКОВ .................................................. 29</w:t>
       </w:r>
     </w:p>
     <w:p>
@@ -2486,7 +2501,7 @@
           <w:i w:val="0"/>
           <w:sz w:val="22"/>
         </w:rPr>
-        <w:t>ПРИЛОЖЕНИЕ А ...................................................................... 30</w:t>
+        <w:t>ПРИЛОЖЕНИЕ А ...................................................................... 31</w:t>
       </w:r>
     </w:p>
     <w:p>
@@ -3094,7 +3109,7 @@
           <w:i w:val="0"/>
           <w:sz w:val="28"/>
         </w:rPr>
-        <w:t>Современные системы отслеживания задач используются не только как хранилище карточек, статусов и комментариев, но и как рабочая среда для совместной координации действий команды. Пользователи ожидают, что изменения задач, комментариев, вложений, статусов и участников будут отображаться без ручного обновления страницы. Поэтому real-time интерфейс в такой системе следует рассматривать не как декоративный элемент, а как часть прикладного контура совместной работы, обеспечивающую оперативную синхронизацию состояния между участниками [13], [14].</w:t>
+        <w:t>Современные системы отслеживания задач используются не только как хранилище карточек, статусов и комментариев, но и как рабочая среда для совместной координации действий команды. Пользователи ожидают, что изменения задач, комментариев, вложений, статусов и участников будут отображаться без ручного обновления страницы. Поэтому real-time интерфейс в такой системе следует рассматривать не как декоративный элемент, а как часть прикладного контура совместной работы, обеспечивающую оперативную синхронизацию состояния между участниками [15], [19].</w:t>
       </w:r>
     </w:p>
     <w:p>
@@ -3366,7 +3381,7 @@
           <w:i w:val="0"/>
           <w:sz w:val="28"/>
         </w:rPr>
-        <w:t>Новизна работы заключается в инженерно-исследовательском обосновании и экспериментальной проверке распределенного real-time контура для системы отслеживания задач. В рамках работы не разрабатывается новый сетевой протокол, но выполняется авторская композиция архитектурного решения, включающая SignalR, несколько экземпляров backend-сервиса, балансировщик, Redis backplane, диагностический контур и воспроизводимую программу испытаний [2], [4], [8], [11].</w:t>
+        <w:t>Элемент новизны работы заключается в инженерно-исследовательском обосновании и экспериментальной проверке распределенного real-time контура для системы отслеживания задач. В рамках работы не разрабатывается новый сетевой протокол, но выполняется авторская композиция архитектурного решения, включающая SignalR, несколько экземпляров backend-сервиса, балансировщик, Redis backplane, диагностический контур и воспроизводимую программу испытаний [2], [4], [8], [10].</w:t>
       </w:r>
     </w:p>
     <w:p>
@@ -3386,27 +3401,6 @@
       </w:r>
     </w:p>
     <w:p>
-      <w:r>
-        <w:br w:type="page"/>
-      </w:r>
-    </w:p>
-    <w:p>
-      <w:pPr>
-        <w:pStyle w:val="Heading1"/>
-      </w:pPr>
-      <w:r>
-        <w:t>1. Анализ предметной области и существующих подходов</w:t>
-      </w:r>
-    </w:p>
-    <w:p>
-      <w:pPr>
-        <w:pStyle w:val="Heading2"/>
-      </w:pPr>
-      <w:r>
-        <w:t>1.1 Real-time взаимодействие в системах отслеживания задач</w:t>
-      </w:r>
-    </w:p>
-    <w:p>
       <w:pPr>
         <w:spacing w:line="360" w:lineRule="auto"/>
         <w:ind w:firstLine="709"/>
@@ -3419,7 +3413,28 @@
           <w:i w:val="0"/>
           <w:sz w:val="28"/>
         </w:rPr>
-        <w:t>Системы отслеживания задач предназначены для фиксации, распределения и контроля выполнения работ. В таких системах ключевыми сущностями являются задачи, отчеты, комментарии, вложения, исполнители, статусы, команды и рабочие пространства. В отличие от статичных справочников, эти сущности часто изменяются несколькими пользователями в течение короткого времени. Один участник может изменить статус задачи, второй добавить комментарий, третий прикрепить файл или уточнить шаг воспроизведения ошибки.</w:t>
+        <w:t>Оформление текстовой части, списка использованных источников и версии отчета по преддипломной практике выполняется с учетом требований ГОСТ 7.32-2017, ГОСТ Р 7.0.100-2018 и методических рекомендаций кафедры [11], [12], [13].</w:t>
+      </w:r>
+    </w:p>
+    <w:p>
+      <w:r>
+        <w:br w:type="page"/>
+      </w:r>
+    </w:p>
+    <w:p>
+      <w:pPr>
+        <w:pStyle w:val="Heading1"/>
+      </w:pPr>
+      <w:r>
+        <w:t>1. Анализ предметной области и существующих подходов</w:t>
+      </w:r>
+    </w:p>
+    <w:p>
+      <w:pPr>
+        <w:pStyle w:val="Heading2"/>
+      </w:pPr>
+      <w:r>
+        <w:t>1.1 Real-time взаимодействие в системах отслеживания задач</w:t>
       </w:r>
     </w:p>
     <w:p>
@@ -3435,7 +3450,7 @@
           <w:i w:val="0"/>
           <w:sz w:val="28"/>
         </w:rPr>
-        <w:t>Если изменения становятся видимыми только после ручного обновления страницы, у пользователей возникает рассогласованное представление о состоянии системы. Это приводит к дублированию действий, работе с устаревшими данными и дополнительным коммуникационным издержкам. Поэтому для систем отслеживания задач важна поддержка awareness-составляющей: пользователь должен понимать, что объект уже изменился, кто присоединился к работе, какие комментарии или вложения появились и какие поля были обновлены [13], [14].</w:t>
+        <w:t>Системы отслеживания задач предназначены для фиксации, распределения и контроля выполнения работ. В таких системах ключевыми сущностями являются задачи, отчеты, комментарии, вложения, исполнители, статусы, команды и рабочие пространства. В отличие от статичных справочников, эти сущности часто изменяются несколькими пользователями в течение короткого времени. Один участник может изменить статус задачи, второй добавить комментарий, третий прикрепить файл или уточнить шаг воспроизведения ошибки [16], [18].</w:t>
       </w:r>
     </w:p>
     <w:p>
@@ -3451,15 +3466,7 @@
           <w:i w:val="0"/>
           <w:sz w:val="28"/>
         </w:rPr>
-        <w:t>В контексте данной работы real-time интерфейс определяется как интерфейсный и серверный контур, обеспечивающий оперативное распространение событий изменения сущностей между клиентами. Такой контур включает клиентское WebSocket-соединение, серверный хаб, модель подписок, механизм групп, доставку событий и обработку переподключений [1], [2], [5], [6].</w:t>
-      </w:r>
-    </w:p>
-    <w:p>
-      <w:pPr>
-        <w:pStyle w:val="Heading2"/>
-      </w:pPr>
-      <w:r>
-        <w:t>1.2 WebSocket и SignalR как основа real-time контура</w:t>
+        <w:t>Если изменения становятся видимыми только после ручного обновления страницы, у пользователей возникает рассогласованное представление о состоянии системы. Это приводит к дублированию действий, работе с устаревшими данными и дополнительным коммуникационным издержкам. Поэтому для систем отслеживания задач важна поддержка согласованного представления о состоянии объекта: пользователь должен понимать, что объект уже изменился, кто присоединился к работе, какие комментарии или вложения появились и какие поля были обновлены [15], [19].</w:t>
       </w:r>
     </w:p>
     <w:p>
@@ -3475,7 +3482,15 @@
           <w:i w:val="0"/>
           <w:sz w:val="28"/>
         </w:rPr>
-        <w:t>WebSocket обеспечивает двусторонний обмен данными поверх одного длительно открытого соединения. Для web-интерфейсов совместной работы это удобнее, чем периодический polling, поскольку сервер может самостоятельно отправлять клиентам события сразу после изменения состояния. В платформе ASP.NET Core над WebSocket часто используется SignalR. Он предоставляет более высокоуровневую модель: серверные хабы, клиентские методы, группы, отправку событий конкретным пользователям или всем участникам группы [1], [2].</w:t>
+        <w:t>В контексте данной работы real-time интерфейс определяется как интерфейсный и серверный контур, обеспечивающий оперативное распространение событий изменения сущностей между клиентами. Такой контур включает клиентское WebSocket-соединение, серверный хаб, модель подписок, механизм групп, доставку событий и обработку переподключений [1], [2], [5], [6], [14].</w:t>
+      </w:r>
+    </w:p>
+    <w:p>
+      <w:pPr>
+        <w:pStyle w:val="Heading2"/>
+      </w:pPr>
+      <w:r>
+        <w:t>1.2 WebSocket и SignalR как основа real-time контура</w:t>
       </w:r>
     </w:p>
     <w:p>
@@ -3491,7 +3506,7 @@
           <w:i w:val="0"/>
           <w:sz w:val="28"/>
         </w:rPr>
-        <w:t>Для системы отслеживания задач особенно полезна модель групп. Клиент может вступить в группу, соответствующую конкретному отчету или задаче, после чего сервер отправляет события изменения только заинтересованным участникам. Такой подход снижает лишний трафик и делает real-time контур предметно ориентированным: событие связано не с абстрактным каналом, а с конкретной сущностью системы [5].</w:t>
+        <w:t>WebSocket обеспечивает двусторонний обмен данными поверх одного длительно открытого соединения. Для web-интерфейсов совместной работы это удобнее, чем периодический polling, поскольку сервер может самостоятельно отправлять клиентам события сразу после изменения состояния. В платформе ASP.NET Core над WebSocket часто используется SignalR. Он предоставляет более высокоуровневую модель: серверные хабы, клиентские методы, группы, отправку событий конкретным пользователям или всем участникам группы [1], [2].</w:t>
       </w:r>
     </w:p>
     <w:p>
@@ -3507,15 +3522,7 @@
           <w:i w:val="0"/>
           <w:sz w:val="28"/>
         </w:rPr>
-        <w:t>В то же время группы SignalR являются оперативным механизмом доставки, а не долговременным источником истины. Сведения о членстве соединений в группах хранятся в памяти серверного процесса и не должны использоваться как единственная база для авторизации, аудита или долговременного учета присутствия. Это обстоятельство важно при проектировании масштабируемого контура, поскольку при переподключении клиент должен заново восстановить необходимые подписки [5], [6].</w:t>
-      </w:r>
-    </w:p>
-    <w:p>
-      <w:pPr>
-        <w:pStyle w:val="Heading2"/>
-      </w:pPr>
-      <w:r>
-        <w:t>1.3 Ограничение single-node WebSocket-архитектуры</w:t>
+        <w:t>Для системы отслеживания задач особенно полезна модель групп. Клиент может вступить в группу, соответствующую конкретному отчету или задаче, после чего сервер отправляет события изменения только заинтересованным участникам. Такой подход снижает лишний трафик и делает real-time контур предметно ориентированным: событие связано не с абстрактным каналом, а с конкретной сущностью системы [5].</w:t>
       </w:r>
     </w:p>
     <w:p>
@@ -3531,7 +3538,15 @@
           <w:i w:val="0"/>
           <w:sz w:val="28"/>
         </w:rPr>
-        <w:t>Single-node архитектура означает, что все WebSocket-соединения обслуживаются одним экземпляром backend-сервиса. Такой вариант прост в реализации и достаточен для раннего прототипа. Сервер хранит локальную таблицу активных соединений и групп, а при изменении сущности отправляет событие клиентам, подключенным к этому же процессу [3], [5].</w:t>
+        <w:t>В то же время группы SignalR являются оперативным механизмом доставки, а не долговременным источником истины. Сведения о членстве соединений в группах хранятся в памяти серверного процесса и не должны использоваться как единственная база для авторизации, аудита или долговременного учета присутствия. Это обстоятельство важно при проектировании масштабируемого контура, поскольку при переподключении клиент должен заново восстановить необходимые подписки [5], [6].</w:t>
+      </w:r>
+    </w:p>
+    <w:p>
+      <w:pPr>
+        <w:pStyle w:val="Heading2"/>
+      </w:pPr>
+      <w:r>
+        <w:t>1.3 Ограничение single-node WebSocket-архитектуры</w:t>
       </w:r>
     </w:p>
     <w:p>
@@ -3547,43 +3562,7 @@
           <w:i w:val="0"/>
           <w:sz w:val="28"/>
         </w:rPr>
-        <w:t xml:space="preserve">Проблема возникает при горизонтальном масштабировании. Если приложение запускается в нескольких экземплярах, входящий трафик распределяется между ними балансировщиком. Клиент A может оказаться подключенным к </w:t>
-      </w:r>
-      <w:r>
-        <w:rPr>
-          <w:rFonts w:ascii="Courier New" w:hAnsi="Courier New" w:eastAsia="Courier New"/>
-          <w:b w:val="0"/>
-          <w:i w:val="0"/>
-          <w:sz w:val="28"/>
-        </w:rPr>
-        <w:t>app-api-1</w:t>
-      </w:r>
-      <w:r>
-        <w:rPr>
-          <w:rFonts w:ascii="Times New Roman" w:hAnsi="Times New Roman" w:eastAsia="Times New Roman"/>
-          <w:b w:val="0"/>
-          <w:i w:val="0"/>
-          <w:sz w:val="28"/>
-        </w:rPr>
-        <w:t xml:space="preserve">, а клиент B — к </w:t>
-      </w:r>
-      <w:r>
-        <w:rPr>
-          <w:rFonts w:ascii="Courier New" w:hAnsi="Courier New" w:eastAsia="Courier New"/>
-          <w:b w:val="0"/>
-          <w:i w:val="0"/>
-          <w:sz w:val="28"/>
-        </w:rPr>
-        <w:t>app-api-2</w:t>
-      </w:r>
-      <w:r>
-        <w:rPr>
-          <w:rFonts w:ascii="Times New Roman" w:hAnsi="Times New Roman" w:eastAsia="Times New Roman"/>
-          <w:b w:val="0"/>
-          <w:i w:val="0"/>
-          <w:sz w:val="28"/>
-        </w:rPr>
-        <w:t>. Если событие изменения отчета создано на первом узле, то без межузловой синхронизации второй узел не узнает, что нужно отправить событие своим клиентам. Формально система уже имеет два backend-экземпляра, но real-time пространство фрагментируется на независимые острова [3], [12].</w:t>
+        <w:t>Single-node архитектура означает, что все WebSocket-соединения обслуживаются одним экземпляром backend-сервиса. Такой вариант прост в реализации и достаточен для раннего прототипа. Сервер хранит локальную таблицу активных соединений и групп, а при изменении сущности отправляет событие клиентам, подключенным к этому же процессу [3], [5].</w:t>
       </w:r>
     </w:p>
     <w:p>
@@ -3599,15 +3578,43 @@
           <w:i w:val="0"/>
           <w:sz w:val="28"/>
         </w:rPr>
-        <w:t>Для системы совместной работы это является функциональным дефектом. Пользователь не обязан знать, через какой серверный процесс он подключен. Ожидаемое свойство интерфейса состоит в том, что изменение сущности доставляется всем заинтересованным участникам. Следовательно, поддержка горизонтального масштабирования WebSocket-соединений должна включать не только запуск нескольких процессов, но и межузловую доставку событий [3], [13].</w:t>
-      </w:r>
-    </w:p>
-    <w:p>
-      <w:pPr>
-        <w:pStyle w:val="Heading2"/>
-      </w:pPr>
-      <w:r>
-        <w:t>1.4 Сравнение подходов к масштабированию</w:t>
+        <w:t xml:space="preserve">Проблема возникает при горизонтальном масштабировании. Если приложение запускается в нескольких экземплярах, входящий трафик распределяется между ними балансировщиком. Клиент A может оказаться подключенным к </w:t>
+      </w:r>
+      <w:r>
+        <w:rPr>
+          <w:rFonts w:ascii="Courier New" w:hAnsi="Courier New" w:eastAsia="Courier New"/>
+          <w:b w:val="0"/>
+          <w:i w:val="0"/>
+          <w:sz w:val="28"/>
+        </w:rPr>
+        <w:t>app-api-1</w:t>
+      </w:r>
+      <w:r>
+        <w:rPr>
+          <w:rFonts w:ascii="Times New Roman" w:hAnsi="Times New Roman" w:eastAsia="Times New Roman"/>
+          <w:b w:val="0"/>
+          <w:i w:val="0"/>
+          <w:sz w:val="28"/>
+        </w:rPr>
+        <w:t xml:space="preserve">, а клиент B — к </w:t>
+      </w:r>
+      <w:r>
+        <w:rPr>
+          <w:rFonts w:ascii="Courier New" w:hAnsi="Courier New" w:eastAsia="Courier New"/>
+          <w:b w:val="0"/>
+          <w:i w:val="0"/>
+          <w:sz w:val="28"/>
+        </w:rPr>
+        <w:t>app-api-2</w:t>
+      </w:r>
+      <w:r>
+        <w:rPr>
+          <w:rFonts w:ascii="Times New Roman" w:hAnsi="Times New Roman" w:eastAsia="Times New Roman"/>
+          <w:b w:val="0"/>
+          <w:i w:val="0"/>
+          <w:sz w:val="28"/>
+        </w:rPr>
+        <w:t>. Если событие изменения отчета создано на первом узле, то без межузловой синхронизации второй узел не узнает, что нужно отправить событие своим клиентам. Формально система уже имеет два backend-экземпляра, но real-time пространство фрагментируется на независимые острова [3], [10].</w:t>
       </w:r>
     </w:p>
     <w:p>
@@ -3623,7 +3630,31 @@
           <w:i w:val="0"/>
           <w:sz w:val="28"/>
         </w:rPr>
-        <w:t>В рамках работы рассматривались несколько подходов к построению масштабируемого real-time контура [3], [4], [9], [10], [12].</w:t>
+        <w:t>Для системы совместной работы это является функциональным дефектом. Пользователь не обязан знать, через какой серверный процесс он подключен. Ожидаемое свойство интерфейса состоит в том, что изменение сущности доставляется всем заинтересованным участникам. Следовательно, поддержка горизонтального масштабирования WebSocket-соединений должна включать не только запуск нескольких процессов, но и межузловую доставку событий [3], [15].</w:t>
+      </w:r>
+    </w:p>
+    <w:p>
+      <w:pPr>
+        <w:pStyle w:val="Heading2"/>
+      </w:pPr>
+      <w:r>
+        <w:t>1.4 Сравнение подходов к масштабированию</w:t>
+      </w:r>
+    </w:p>
+    <w:p>
+      <w:pPr>
+        <w:spacing w:line="360" w:lineRule="auto"/>
+        <w:ind w:firstLine="709"/>
+        <w:jc w:val="both"/>
+      </w:pPr>
+      <w:r>
+        <w:rPr>
+          <w:rFonts w:ascii="Times New Roman" w:hAnsi="Times New Roman" w:eastAsia="Times New Roman"/>
+          <w:b w:val="0"/>
+          <w:i w:val="0"/>
+          <w:sz w:val="28"/>
+        </w:rPr>
+        <w:t>В рамках работы рассматривались несколько подходов к построению масштабируемого real-time контура [3], [4], [7], [9], [10].</w:t>
       </w:r>
     </w:p>
     <w:p>
@@ -3638,7 +3669,7 @@
           <w:i w:val="0"/>
           <w:sz w:val="24"/>
         </w:rPr>
-        <w:t>Таблица 1 — Подход</w:t>
+        <w:t>Таблица 1 — Сравнение подходов к масштабированию WebSocket-соединений</w:t>
       </w:r>
     </w:p>
     <w:tbl>
@@ -4477,7 +4508,7 @@
           <w:i w:val="0"/>
           <w:sz w:val="28"/>
         </w:rPr>
-        <w:t>Анализ показал, что real-time интерфейс в системе отслеживания задач должен рассматриваться как контур совместной работы над сущностями, а не только как клиентский WebSocket. Главным ограничением single-node реализации является локальность сведений о соединениях и группах. Для устранения этого ограничения требуется архитектура, в которой несколько экземпляров backend-сервиса обмениваются real-time событиями через межузловой механизм. Для рассматриваемой системы рациональным решением является использование Redis backplane в составе SignalR [3], [4], [13].</w:t>
+        <w:t>Анализ показал, что real-time интерфейс в системе отслеживания задач должен рассматриваться как контур совместной работы над сущностями, а не только как клиентский WebSocket. Главным ограничением single-node реализации является локальность сведений о соединениях и группах. Для устранения этого ограничения требуется архитектура, в которой несколько экземпляров backend-сервиса обмениваются real-time событиями через межузловой механизм. Для рассматриваемой системы рациональным решением является использование Redis backplane в составе SignalR [3], [4], [15].</w:t>
       </w:r>
     </w:p>
     <w:p>
@@ -5267,7 +5298,7 @@
           <w:i w:val="0"/>
           <w:sz w:val="28"/>
         </w:rPr>
-        <w:t>. Оба экземпляра подключены к общей базе данных и к Redis. SignalR использует Redis backplane для межузловой доставки событий [4], [11], [12].</w:t>
+        <w:t>. Оба экземпляра подключены к общей базе данных и к Redis. SignalR использует Redis backplane для межузловой доставки событий [4], [10], [14].</w:t>
       </w:r>
     </w:p>
     <w:p>
@@ -6472,7 +6503,7 @@
           <w:i w:val="0"/>
           <w:sz w:val="28"/>
         </w:rPr>
-        <w:t xml:space="preserve"> в пустую строку для обоих экземпляров.</w:t>
+        <w:t xml:space="preserve"> в пустую строку для обоих экземпляров [17].</w:t>
       </w:r>
     </w:p>
     <w:p>
@@ -6506,7 +6537,7 @@
           <w:i w:val="0"/>
           <w:sz w:val="28"/>
         </w:rPr>
-        <w:t xml:space="preserve"> содержит два backend-сервера [12]:</w:t>
+        <w:t xml:space="preserve"> содержит два backend-сервера [10]:</w:t>
       </w:r>
     </w:p>
     <w:p>
@@ -6615,7 +6646,7 @@
           <w:i w:val="0"/>
           <w:sz w:val="28"/>
         </w:rPr>
-        <w:t>. Конфигурация не зависит от дополнительных сервисов авторизации или пользовательского профиля и предназначена только для проверки real-time контура [11], [12].</w:t>
+        <w:t>. Конфигурация не зависит от дополнительных сервисов авторизации или пользовательского профиля и предназначена только для проверки real-time контура [10], [14].</w:t>
       </w:r>
     </w:p>
     <w:p>
@@ -6835,7 +6866,61 @@
           <w:i w:val="0"/>
           <w:sz w:val="28"/>
         </w:rPr>
-        <w:t>. В этом режиме выполняется несколько независимых проверок, после чего скрипт выводит число успешных доставок и агрегированные значения задержки: минимум, максимум, среднее, p50 и p95.</w:t>
+        <w:t xml:space="preserve">. В этом режиме выполняется несколько независимых проверок, после чего скрипт выводит число успешных доставок и агрегированные значения задержки: минимум, максимум, среднее, p50 и p95. Дополнительно предусмотрены режимы </w:t>
+      </w:r>
+      <w:r>
+        <w:rPr>
+          <w:rFonts w:ascii="Courier New" w:hAnsi="Courier New" w:eastAsia="Courier New"/>
+          <w:b w:val="0"/>
+          <w:i w:val="0"/>
+          <w:sz w:val="28"/>
+        </w:rPr>
+        <w:t>THESIS_SCENARIO=rejoin</w:t>
+      </w:r>
+      <w:r>
+        <w:rPr>
+          <w:rFonts w:ascii="Times New Roman" w:hAnsi="Times New Roman" w:eastAsia="Times New Roman"/>
+          <w:b w:val="0"/>
+          <w:i w:val="0"/>
+          <w:sz w:val="28"/>
+        </w:rPr>
+        <w:t xml:space="preserve"> и </w:t>
+      </w:r>
+      <w:r>
+        <w:rPr>
+          <w:rFonts w:ascii="Courier New" w:hAnsi="Courier New" w:eastAsia="Courier New"/>
+          <w:b w:val="0"/>
+          <w:i w:val="0"/>
+          <w:sz w:val="28"/>
+        </w:rPr>
+        <w:t>THESIS_SCENARIO=failover</w:t>
+      </w:r>
+      <w:r>
+        <w:rPr>
+          <w:rFonts w:ascii="Times New Roman" w:hAnsi="Times New Roman" w:eastAsia="Times New Roman"/>
+          <w:b w:val="0"/>
+          <w:i w:val="0"/>
+          <w:sz w:val="28"/>
+        </w:rPr>
+        <w:t xml:space="preserve">: первый проверяет повторное вступление в группу после разрыва соединения, второй — переподключение через nginx после остановки одного экземпляра </w:t>
+      </w:r>
+      <w:r>
+        <w:rPr>
+          <w:rFonts w:ascii="Courier New" w:hAnsi="Courier New" w:eastAsia="Courier New"/>
+          <w:b w:val="0"/>
+          <w:i w:val="0"/>
+          <w:sz w:val="28"/>
+        </w:rPr>
+        <w:t>app-api</w:t>
+      </w:r>
+      <w:r>
+        <w:rPr>
+          <w:rFonts w:ascii="Times New Roman" w:hAnsi="Times New Roman" w:eastAsia="Times New Roman"/>
+          <w:b w:val="0"/>
+          <w:i w:val="0"/>
+          <w:sz w:val="28"/>
+        </w:rPr>
+        <w:t>.</w:t>
       </w:r>
     </w:p>
     <w:p>
@@ -7185,14 +7270,6 @@
     </w:p>
     <w:p>
       <w:pPr>
-        <w:pStyle w:val="Heading2"/>
-      </w:pPr>
-      <w:r>
-        <w:t>5.3 Результат без Redis backplane</w:t>
-      </w:r>
-    </w:p>
-    <w:p>
-      <w:pPr>
         <w:spacing w:line="360" w:lineRule="auto"/>
         <w:ind w:firstLine="709"/>
         <w:jc w:val="both"/>
@@ -7204,25 +7281,7 @@
           <w:i w:val="0"/>
           <w:sz w:val="28"/>
         </w:rPr>
-        <w:t xml:space="preserve">В режиме без backplane оба экземпляра </w:t>
-      </w:r>
-      <w:r>
-        <w:rPr>
-          <w:rFonts w:ascii="Courier New" w:hAnsi="Courier New" w:eastAsia="Courier New"/>
-          <w:b w:val="0"/>
-          <w:i w:val="0"/>
-          <w:sz w:val="28"/>
-        </w:rPr>
-        <w:t>app-api</w:t>
-      </w:r>
-      <w:r>
-        <w:rPr>
-          <w:rFonts w:ascii="Times New Roman" w:hAnsi="Times New Roman" w:eastAsia="Times New Roman"/>
-          <w:b w:val="0"/>
-          <w:i w:val="0"/>
-          <w:sz w:val="28"/>
-        </w:rPr>
-        <w:t xml:space="preserve"> работают, но SignalR не имеет межузлового канала доставки событий. Проверочный сценарий завершился timeout:</w:t>
+        <w:t>Для проверки восстановления подписки и отказа узла используются команды:</w:t>
       </w:r>
     </w:p>
     <w:p>
@@ -7237,7 +7296,30 @@
           <w:i w:val="0"/>
           <w:sz w:val="20"/>
         </w:rPr>
-        <w:t>Error: ReceiveReportPatch timed out after 10000ms</w:t>
+        <w:t>THESIS_SCENARIO=rejoin node scripts/realtime-scaleout-check.mjs</w:t>
+      </w:r>
+    </w:p>
+    <w:p>
+      <w:pPr>
+        <w:spacing w:line="240" w:lineRule="auto"/>
+        <w:ind w:firstLine="0" w:left="709"/>
+      </w:pPr>
+      <w:r>
+        <w:rPr>
+          <w:rFonts w:ascii="Courier New" w:hAnsi="Courier New" w:eastAsia="Courier New"/>
+          <w:b w:val="0"/>
+          <w:i w:val="0"/>
+          <w:sz w:val="20"/>
+        </w:rPr>
+        <w:t>THESIS_SCENARIO=failover THESIS_ALLOW_DOCKER_CONTROL=1 THESIS_TIMEOUT_MS=20000 node scripts/realtime-scaleout-check.mjs</w:t>
+      </w:r>
+    </w:p>
+    <w:p>
+      <w:pPr>
+        <w:pStyle w:val="Heading2"/>
+      </w:pPr>
+      <w:r>
+        <w:t>5.3 Результат без Redis backplane</w:t>
       </w:r>
     </w:p>
     <w:p>
@@ -7253,15 +7335,40 @@
           <w:i w:val="0"/>
           <w:sz w:val="28"/>
         </w:rPr>
-        <w:t>Интерпретация результата: клиент A был подключен к одному экземпляру сервиса, клиент B — к другому. Событие изменения отчета было создано через первый экземпляр, но не дошло до клиента, подключенного ко второму экземпляру. Этот результат подтверждает исходное архитектурное ограничение: простой запуск нескольких backend-процессов не обеспечивает глобальную real-time доставку [3].</w:t>
-      </w:r>
-    </w:p>
-    <w:p>
-      <w:pPr>
-        <w:pStyle w:val="Heading2"/>
-      </w:pPr>
-      <w:r>
-        <w:t>5.4 Результат с Redis backplane</w:t>
+        <w:t xml:space="preserve">В режиме без backplane оба экземпляра </w:t>
+      </w:r>
+      <w:r>
+        <w:rPr>
+          <w:rFonts w:ascii="Courier New" w:hAnsi="Courier New" w:eastAsia="Courier New"/>
+          <w:b w:val="0"/>
+          <w:i w:val="0"/>
+          <w:sz w:val="28"/>
+        </w:rPr>
+        <w:t>app-api</w:t>
+      </w:r>
+      <w:r>
+        <w:rPr>
+          <w:rFonts w:ascii="Times New Roman" w:hAnsi="Times New Roman" w:eastAsia="Times New Roman"/>
+          <w:b w:val="0"/>
+          <w:i w:val="0"/>
+          <w:sz w:val="28"/>
+        </w:rPr>
+        <w:t xml:space="preserve"> работают, но SignalR не имеет межузлового канала доставки событий. Проверочный сценарий завершился timeout:</w:t>
+      </w:r>
+    </w:p>
+    <w:p>
+      <w:pPr>
+        <w:spacing w:line="240" w:lineRule="auto"/>
+        <w:ind w:firstLine="0" w:left="709"/>
+      </w:pPr>
+      <w:r>
+        <w:rPr>
+          <w:rFonts w:ascii="Courier New" w:hAnsi="Courier New" w:eastAsia="Courier New"/>
+          <w:b w:val="0"/>
+          <w:i w:val="0"/>
+          <w:sz w:val="20"/>
+        </w:rPr>
+        <w:t>Error: ReceiveReportPatch timed out after 10000ms</w:t>
       </w:r>
     </w:p>
     <w:p>
@@ -7277,382 +7384,15 @@
           <w:i w:val="0"/>
           <w:sz w:val="28"/>
         </w:rPr>
-        <w:t>В режиме с Redis backplane проверочный сценарий завершился успешно. Один из зафиксированных результатов:</w:t>
-      </w:r>
-    </w:p>
-    <w:p>
-      <w:pPr>
-        <w:spacing w:line="240" w:lineRule="auto"/>
-        <w:ind w:firstLine="0" w:left="709"/>
-      </w:pPr>
-      <w:r>
-        <w:rPr>
-          <w:rFonts w:ascii="Courier New" w:hAnsi="Courier New" w:eastAsia="Courier New"/>
-          <w:b w:val="0"/>
-          <w:i w:val="0"/>
-          <w:sz w:val="20"/>
-        </w:rPr>
-        <w:t>{</w:t>
-      </w:r>
-    </w:p>
-    <w:p>
-      <w:pPr>
-        <w:spacing w:line="240" w:lineRule="auto"/>
-        <w:ind w:firstLine="0" w:left="709"/>
-      </w:pPr>
-      <w:r>
-        <w:rPr>
-          <w:rFonts w:ascii="Courier New" w:hAnsi="Courier New" w:eastAsia="Courier New"/>
-          <w:b w:val="0"/>
-          <w:i w:val="0"/>
-          <w:sz w:val="20"/>
-        </w:rPr>
-        <w:t xml:space="preserve">  "ok": true,</w:t>
-      </w:r>
-    </w:p>
-    <w:p>
-      <w:pPr>
-        <w:spacing w:line="240" w:lineRule="auto"/>
-        <w:ind w:firstLine="0" w:left="709"/>
-      </w:pPr>
-      <w:r>
-        <w:rPr>
-          <w:rFonts w:ascii="Courier New" w:hAnsi="Courier New" w:eastAsia="Courier New"/>
-          <w:b w:val="0"/>
-          <w:i w:val="0"/>
-          <w:sz w:val="20"/>
-        </w:rPr>
-        <w:t xml:space="preserve">  "reportId": "3",</w:t>
-      </w:r>
-    </w:p>
-    <w:p>
-      <w:pPr>
-        <w:spacing w:line="240" w:lineRule="auto"/>
-        <w:ind w:firstLine="0" w:left="709"/>
-      </w:pPr>
-      <w:r>
-        <w:rPr>
-          <w:rFonts w:ascii="Courier New" w:hAnsi="Courier New" w:eastAsia="Courier New"/>
-          <w:b w:val="0"/>
-          <w:i w:val="0"/>
-          <w:sz w:val="20"/>
-        </w:rPr>
-        <w:t xml:space="preserve">  "patchedTitle": "scaleout-patched-1778316874715",</w:t>
-      </w:r>
-    </w:p>
-    <w:p>
-      <w:pPr>
-        <w:spacing w:line="240" w:lineRule="auto"/>
-        <w:ind w:firstLine="0" w:left="709"/>
-      </w:pPr>
-      <w:r>
-        <w:rPr>
-          <w:rFonts w:ascii="Courier New" w:hAnsi="Courier New" w:eastAsia="Courier New"/>
-          <w:b w:val="0"/>
-          <w:i w:val="0"/>
-          <w:sz w:val="20"/>
-        </w:rPr>
-        <w:t xml:space="preserve">  "nodeA": {</w:t>
-      </w:r>
-    </w:p>
-    <w:p>
-      <w:pPr>
-        <w:spacing w:line="240" w:lineRule="auto"/>
-        <w:ind w:firstLine="0" w:left="709"/>
-      </w:pPr>
-      <w:r>
-        <w:rPr>
-          <w:rFonts w:ascii="Courier New" w:hAnsi="Courier New" w:eastAsia="Courier New"/>
-          <w:b w:val="0"/>
-          <w:i w:val="0"/>
-          <w:sz w:val="20"/>
-        </w:rPr>
-        <w:t xml:space="preserve">    "serverInstanceId": "app-api-1",</w:t>
-      </w:r>
-    </w:p>
-    <w:p>
-      <w:pPr>
-        <w:spacing w:line="240" w:lineRule="auto"/>
-        <w:ind w:firstLine="0" w:left="709"/>
-      </w:pPr>
-      <w:r>
-        <w:rPr>
-          <w:rFonts w:ascii="Courier New" w:hAnsi="Courier New" w:eastAsia="Courier New"/>
-          <w:b w:val="0"/>
-          <w:i w:val="0"/>
-          <w:sz w:val="20"/>
-        </w:rPr>
-        <w:t xml:space="preserve">    "machineName": "21ee5de48b13",</w:t>
-      </w:r>
-    </w:p>
-    <w:p>
-      <w:pPr>
-        <w:spacing w:line="240" w:lineRule="auto"/>
-        <w:ind w:firstLine="0" w:left="709"/>
-      </w:pPr>
-      <w:r>
-        <w:rPr>
-          <w:rFonts w:ascii="Courier New" w:hAnsi="Courier New" w:eastAsia="Courier New"/>
-          <w:b w:val="0"/>
-          <w:i w:val="0"/>
-          <w:sz w:val="20"/>
-        </w:rPr>
-        <w:t xml:space="preserve">    "connectionId": "9iIIs9uWgfJlf6BHXER8XA",</w:t>
-      </w:r>
-    </w:p>
-    <w:p>
-      <w:pPr>
-        <w:spacing w:line="240" w:lineRule="auto"/>
-        <w:ind w:firstLine="0" w:left="709"/>
-      </w:pPr>
-      <w:r>
-        <w:rPr>
-          <w:rFonts w:ascii="Courier New" w:hAnsi="Courier New" w:eastAsia="Courier New"/>
-          <w:b w:val="0"/>
-          <w:i w:val="0"/>
-          <w:sz w:val="20"/>
-        </w:rPr>
-        <w:t xml:space="preserve">    "userIdentifier": "thesis-user"</w:t>
-      </w:r>
-    </w:p>
-    <w:p>
-      <w:pPr>
-        <w:spacing w:line="240" w:lineRule="auto"/>
-        <w:ind w:firstLine="0" w:left="709"/>
-      </w:pPr>
-      <w:r>
-        <w:rPr>
-          <w:rFonts w:ascii="Courier New" w:hAnsi="Courier New" w:eastAsia="Courier New"/>
-          <w:b w:val="0"/>
-          <w:i w:val="0"/>
-          <w:sz w:val="20"/>
-        </w:rPr>
-        <w:t xml:space="preserve">  },</w:t>
-      </w:r>
-    </w:p>
-    <w:p>
-      <w:pPr>
-        <w:spacing w:line="240" w:lineRule="auto"/>
-        <w:ind w:firstLine="0" w:left="709"/>
-      </w:pPr>
-      <w:r>
-        <w:rPr>
-          <w:rFonts w:ascii="Courier New" w:hAnsi="Courier New" w:eastAsia="Courier New"/>
-          <w:b w:val="0"/>
-          <w:i w:val="0"/>
-          <w:sz w:val="20"/>
-        </w:rPr>
-        <w:t xml:space="preserve">  "nodeB": {</w:t>
-      </w:r>
-    </w:p>
-    <w:p>
-      <w:pPr>
-        <w:spacing w:line="240" w:lineRule="auto"/>
-        <w:ind w:firstLine="0" w:left="709"/>
-      </w:pPr>
-      <w:r>
-        <w:rPr>
-          <w:rFonts w:ascii="Courier New" w:hAnsi="Courier New" w:eastAsia="Courier New"/>
-          <w:b w:val="0"/>
-          <w:i w:val="0"/>
-          <w:sz w:val="20"/>
-        </w:rPr>
-        <w:t xml:space="preserve">    "serverInstanceId": "app-api-2",</w:t>
-      </w:r>
-    </w:p>
-    <w:p>
-      <w:pPr>
-        <w:spacing w:line="240" w:lineRule="auto"/>
-        <w:ind w:firstLine="0" w:left="709"/>
-      </w:pPr>
-      <w:r>
-        <w:rPr>
-          <w:rFonts w:ascii="Courier New" w:hAnsi="Courier New" w:eastAsia="Courier New"/>
-          <w:b w:val="0"/>
-          <w:i w:val="0"/>
-          <w:sz w:val="20"/>
-        </w:rPr>
-        <w:t xml:space="preserve">    "machineName": "1d6a8589cdae",</w:t>
-      </w:r>
-    </w:p>
-    <w:p>
-      <w:pPr>
-        <w:spacing w:line="240" w:lineRule="auto"/>
-        <w:ind w:firstLine="0" w:left="709"/>
-      </w:pPr>
-      <w:r>
-        <w:rPr>
-          <w:rFonts w:ascii="Courier New" w:hAnsi="Courier New" w:eastAsia="Courier New"/>
-          <w:b w:val="0"/>
-          <w:i w:val="0"/>
-          <w:sz w:val="20"/>
-        </w:rPr>
-        <w:t xml:space="preserve">    "connectionId": "NpH7DSAYYJW1EWM2XKhyqQ",</w:t>
-      </w:r>
-    </w:p>
-    <w:p>
-      <w:pPr>
-        <w:spacing w:line="240" w:lineRule="auto"/>
-        <w:ind w:firstLine="0" w:left="709"/>
-      </w:pPr>
-      <w:r>
-        <w:rPr>
-          <w:rFonts w:ascii="Courier New" w:hAnsi="Courier New" w:eastAsia="Courier New"/>
-          <w:b w:val="0"/>
-          <w:i w:val="0"/>
-          <w:sz w:val="20"/>
-        </w:rPr>
-        <w:t xml:space="preserve">    "userIdentifier": "thesis-user"</w:t>
-      </w:r>
-    </w:p>
-    <w:p>
-      <w:pPr>
-        <w:spacing w:line="240" w:lineRule="auto"/>
-        <w:ind w:firstLine="0" w:left="709"/>
-      </w:pPr>
-      <w:r>
-        <w:rPr>
-          <w:rFonts w:ascii="Courier New" w:hAnsi="Courier New" w:eastAsia="Courier New"/>
-          <w:b w:val="0"/>
-          <w:i w:val="0"/>
-          <w:sz w:val="20"/>
-        </w:rPr>
-        <w:t xml:space="preserve">  },</w:t>
-      </w:r>
-    </w:p>
-    <w:p>
-      <w:pPr>
-        <w:spacing w:line="240" w:lineRule="auto"/>
-        <w:ind w:firstLine="0" w:left="709"/>
-      </w:pPr>
-      <w:r>
-        <w:rPr>
-          <w:rFonts w:ascii="Courier New" w:hAnsi="Courier New" w:eastAsia="Courier New"/>
-          <w:b w:val="0"/>
-          <w:i w:val="0"/>
-          <w:sz w:val="20"/>
-        </w:rPr>
-        <w:t xml:space="preserve">  "receivedPatch": {</w:t>
-      </w:r>
-    </w:p>
-    <w:p>
-      <w:pPr>
-        <w:spacing w:line="240" w:lineRule="auto"/>
-        <w:ind w:firstLine="0" w:left="709"/>
-      </w:pPr>
-      <w:r>
-        <w:rPr>
-          <w:rFonts w:ascii="Courier New" w:hAnsi="Courier New" w:eastAsia="Courier New"/>
-          <w:b w:val="0"/>
-          <w:i w:val="0"/>
-          <w:sz w:val="20"/>
-        </w:rPr>
-        <w:t xml:space="preserve">    "title": "scaleout-patched-1778316874715",</w:t>
-      </w:r>
-    </w:p>
-    <w:p>
-      <w:pPr>
-        <w:spacing w:line="240" w:lineRule="auto"/>
-        <w:ind w:firstLine="0" w:left="709"/>
-      </w:pPr>
-      <w:r>
-        <w:rPr>
-          <w:rFonts w:ascii="Courier New" w:hAnsi="Courier New" w:eastAsia="Courier New"/>
-          <w:b w:val="0"/>
-          <w:i w:val="0"/>
-          <w:sz w:val="20"/>
-        </w:rPr>
-        <w:t xml:space="preserve">    "updatedAt": "2026-05-09T08:54:35.186614+00:00"</w:t>
-      </w:r>
-    </w:p>
-    <w:p>
-      <w:pPr>
-        <w:spacing w:line="240" w:lineRule="auto"/>
-        <w:ind w:firstLine="0" w:left="709"/>
-      </w:pPr>
-      <w:r>
-        <w:rPr>
-          <w:rFonts w:ascii="Courier New" w:hAnsi="Courier New" w:eastAsia="Courier New"/>
-          <w:b w:val="0"/>
-          <w:i w:val="0"/>
-          <w:sz w:val="20"/>
-        </w:rPr>
-        <w:t xml:space="preserve">  },</w:t>
-      </w:r>
-    </w:p>
-    <w:p>
-      <w:pPr>
-        <w:spacing w:line="240" w:lineRule="auto"/>
-        <w:ind w:firstLine="0" w:left="709"/>
-      </w:pPr>
-      <w:r>
-        <w:rPr>
-          <w:rFonts w:ascii="Courier New" w:hAnsi="Courier New" w:eastAsia="Courier New"/>
-          <w:b w:val="0"/>
-          <w:i w:val="0"/>
-          <w:sz w:val="20"/>
-        </w:rPr>
-        <w:t xml:space="preserve">  "metrics": {</w:t>
-      </w:r>
-    </w:p>
-    <w:p>
-      <w:pPr>
-        <w:spacing w:line="240" w:lineRule="auto"/>
-        <w:ind w:firstLine="0" w:left="709"/>
-      </w:pPr>
-      <w:r>
-        <w:rPr>
-          <w:rFonts w:ascii="Courier New" w:hAnsi="Courier New" w:eastAsia="Courier New"/>
-          <w:b w:val="0"/>
-          <w:i w:val="0"/>
-          <w:sz w:val="20"/>
-        </w:rPr>
-        <w:t xml:space="preserve">    "deliveryLatencyMs": 9.5,</w:t>
-      </w:r>
-    </w:p>
-    <w:p>
-      <w:pPr>
-        <w:spacing w:line="240" w:lineRule="auto"/>
-        <w:ind w:firstLine="0" w:left="709"/>
-      </w:pPr>
-      <w:r>
-        <w:rPr>
-          <w:rFonts w:ascii="Courier New" w:hAnsi="Courier New" w:eastAsia="Courier New"/>
-          <w:b w:val="0"/>
-          <w:i w:val="0"/>
-          <w:sz w:val="20"/>
-        </w:rPr>
-        <w:t xml:space="preserve">    "patchRequestMs": 8.5</w:t>
-      </w:r>
-    </w:p>
-    <w:p>
-      <w:pPr>
-        <w:spacing w:line="240" w:lineRule="auto"/>
-        <w:ind w:firstLine="0" w:left="709"/>
-      </w:pPr>
-      <w:r>
-        <w:rPr>
-          <w:rFonts w:ascii="Courier New" w:hAnsi="Courier New" w:eastAsia="Courier New"/>
-          <w:b w:val="0"/>
-          <w:i w:val="0"/>
-          <w:sz w:val="20"/>
-        </w:rPr>
-        <w:t xml:space="preserve">  }</w:t>
-      </w:r>
-    </w:p>
-    <w:p>
-      <w:pPr>
-        <w:spacing w:line="240" w:lineRule="auto"/>
-        <w:ind w:firstLine="0" w:left="709"/>
-      </w:pPr>
-      <w:r>
-        <w:rPr>
-          <w:rFonts w:ascii="Courier New" w:hAnsi="Courier New" w:eastAsia="Courier New"/>
-          <w:b w:val="0"/>
-          <w:i w:val="0"/>
-          <w:sz w:val="20"/>
-        </w:rPr>
-        <w:t>}</w:t>
+        <w:t>Интерпретация результата: клиент A был подключен к одному экземпляру сервиса, клиент B — к другому. Событие изменения отчета было создано через первый экземпляр, но не дошло до клиента, подключенного ко второму экземпляру. Этот результат подтверждает исходное архитектурное ограничение: простой запуск нескольких backend-процессов не обеспечивает глобальную real-time доставку [3].</w:t>
+      </w:r>
+    </w:p>
+    <w:p>
+      <w:pPr>
+        <w:pStyle w:val="Heading2"/>
+      </w:pPr>
+      <w:r>
+        <w:t>5.4 Результат с Redis backplane</w:t>
       </w:r>
     </w:p>
     <w:p>
@@ -7668,69 +7408,382 @@
           <w:i w:val="0"/>
           <w:sz w:val="28"/>
         </w:rPr>
-        <w:t xml:space="preserve">Из результата видно, что клиент A был подключен к </w:t>
-      </w:r>
+        <w:t>В режиме с Redis backplane проверочный сценарий завершился успешно. Один из зафиксированных результатов:</w:t>
+      </w:r>
+    </w:p>
+    <w:p>
+      <w:pPr>
+        <w:spacing w:line="240" w:lineRule="auto"/>
+        <w:ind w:firstLine="0" w:left="709"/>
+      </w:pPr>
       <w:r>
         <w:rPr>
           <w:rFonts w:ascii="Courier New" w:hAnsi="Courier New" w:eastAsia="Courier New"/>
           <w:b w:val="0"/>
           <w:i w:val="0"/>
-          <w:sz w:val="28"/>
-        </w:rPr>
-        <w:t>app-api-1</w:t>
-      </w:r>
-      <w:r>
-        <w:rPr>
-          <w:rFonts w:ascii="Times New Roman" w:hAnsi="Times New Roman" w:eastAsia="Times New Roman"/>
-          <w:b w:val="0"/>
-          <w:i w:val="0"/>
-          <w:sz w:val="28"/>
-        </w:rPr>
-        <w:t xml:space="preserve">, а клиент B — к </w:t>
-      </w:r>
+          <w:sz w:val="20"/>
+        </w:rPr>
+        <w:t>{</w:t>
+      </w:r>
+    </w:p>
+    <w:p>
+      <w:pPr>
+        <w:spacing w:line="240" w:lineRule="auto"/>
+        <w:ind w:firstLine="0" w:left="709"/>
+      </w:pPr>
       <w:r>
         <w:rPr>
           <w:rFonts w:ascii="Courier New" w:hAnsi="Courier New" w:eastAsia="Courier New"/>
           <w:b w:val="0"/>
           <w:i w:val="0"/>
-          <w:sz w:val="28"/>
-        </w:rPr>
-        <w:t>app-api-2</w:t>
-      </w:r>
-      <w:r>
-        <w:rPr>
-          <w:rFonts w:ascii="Times New Roman" w:hAnsi="Times New Roman" w:eastAsia="Times New Roman"/>
-          <w:b w:val="0"/>
-          <w:i w:val="0"/>
-          <w:sz w:val="28"/>
-        </w:rPr>
-        <w:t xml:space="preserve">. При этом клиент B получил событие </w:t>
-      </w:r>
+          <w:sz w:val="20"/>
+        </w:rPr>
+        <w:t xml:space="preserve">  "ok": true,</w:t>
+      </w:r>
+    </w:p>
+    <w:p>
+      <w:pPr>
+        <w:spacing w:line="240" w:lineRule="auto"/>
+        <w:ind w:firstLine="0" w:left="709"/>
+      </w:pPr>
       <w:r>
         <w:rPr>
           <w:rFonts w:ascii="Courier New" w:hAnsi="Courier New" w:eastAsia="Courier New"/>
           <w:b w:val="0"/>
           <w:i w:val="0"/>
-          <w:sz w:val="28"/>
-        </w:rPr>
-        <w:t>ReceiveReportPatch</w:t>
-      </w:r>
-      <w:r>
-        <w:rPr>
-          <w:rFonts w:ascii="Times New Roman" w:hAnsi="Times New Roman" w:eastAsia="Times New Roman"/>
-          <w:b w:val="0"/>
-          <w:i w:val="0"/>
-          <w:sz w:val="28"/>
-        </w:rPr>
-        <w:t>, инициированное через первый узел. Это подтверждает, что Redis backplane обеспечил межузловую доставку real-time события [4], [9].</w:t>
-      </w:r>
-    </w:p>
-    <w:p>
-      <w:pPr>
-        <w:pStyle w:val="Heading2"/>
-      </w:pPr>
-      <w:r>
-        <w:t>5.5 Серийная проверка и задержка доставки</w:t>
+          <w:sz w:val="20"/>
+        </w:rPr>
+        <w:t xml:space="preserve">  "reportId": "3",</w:t>
+      </w:r>
+    </w:p>
+    <w:p>
+      <w:pPr>
+        <w:spacing w:line="240" w:lineRule="auto"/>
+        <w:ind w:firstLine="0" w:left="709"/>
+      </w:pPr>
+      <w:r>
+        <w:rPr>
+          <w:rFonts w:ascii="Courier New" w:hAnsi="Courier New" w:eastAsia="Courier New"/>
+          <w:b w:val="0"/>
+          <w:i w:val="0"/>
+          <w:sz w:val="20"/>
+        </w:rPr>
+        <w:t xml:space="preserve">  "patchedTitle": "scaleout-patched-1778316874715",</w:t>
+      </w:r>
+    </w:p>
+    <w:p>
+      <w:pPr>
+        <w:spacing w:line="240" w:lineRule="auto"/>
+        <w:ind w:firstLine="0" w:left="709"/>
+      </w:pPr>
+      <w:r>
+        <w:rPr>
+          <w:rFonts w:ascii="Courier New" w:hAnsi="Courier New" w:eastAsia="Courier New"/>
+          <w:b w:val="0"/>
+          <w:i w:val="0"/>
+          <w:sz w:val="20"/>
+        </w:rPr>
+        <w:t xml:space="preserve">  "nodeA": {</w:t>
+      </w:r>
+    </w:p>
+    <w:p>
+      <w:pPr>
+        <w:spacing w:line="240" w:lineRule="auto"/>
+        <w:ind w:firstLine="0" w:left="709"/>
+      </w:pPr>
+      <w:r>
+        <w:rPr>
+          <w:rFonts w:ascii="Courier New" w:hAnsi="Courier New" w:eastAsia="Courier New"/>
+          <w:b w:val="0"/>
+          <w:i w:val="0"/>
+          <w:sz w:val="20"/>
+        </w:rPr>
+        <w:t xml:space="preserve">    "serverInstanceId": "app-api-1",</w:t>
+      </w:r>
+    </w:p>
+    <w:p>
+      <w:pPr>
+        <w:spacing w:line="240" w:lineRule="auto"/>
+        <w:ind w:firstLine="0" w:left="709"/>
+      </w:pPr>
+      <w:r>
+        <w:rPr>
+          <w:rFonts w:ascii="Courier New" w:hAnsi="Courier New" w:eastAsia="Courier New"/>
+          <w:b w:val="0"/>
+          <w:i w:val="0"/>
+          <w:sz w:val="20"/>
+        </w:rPr>
+        <w:t xml:space="preserve">    "machineName": "21ee5de48b13",</w:t>
+      </w:r>
+    </w:p>
+    <w:p>
+      <w:pPr>
+        <w:spacing w:line="240" w:lineRule="auto"/>
+        <w:ind w:firstLine="0" w:left="709"/>
+      </w:pPr>
+      <w:r>
+        <w:rPr>
+          <w:rFonts w:ascii="Courier New" w:hAnsi="Courier New" w:eastAsia="Courier New"/>
+          <w:b w:val="0"/>
+          <w:i w:val="0"/>
+          <w:sz w:val="20"/>
+        </w:rPr>
+        <w:t xml:space="preserve">    "connectionId": "9iIIs9uWgfJlf6BHXER8XA",</w:t>
+      </w:r>
+    </w:p>
+    <w:p>
+      <w:pPr>
+        <w:spacing w:line="240" w:lineRule="auto"/>
+        <w:ind w:firstLine="0" w:left="709"/>
+      </w:pPr>
+      <w:r>
+        <w:rPr>
+          <w:rFonts w:ascii="Courier New" w:hAnsi="Courier New" w:eastAsia="Courier New"/>
+          <w:b w:val="0"/>
+          <w:i w:val="0"/>
+          <w:sz w:val="20"/>
+        </w:rPr>
+        <w:t xml:space="preserve">    "userIdentifier": "thesis-user"</w:t>
+      </w:r>
+    </w:p>
+    <w:p>
+      <w:pPr>
+        <w:spacing w:line="240" w:lineRule="auto"/>
+        <w:ind w:firstLine="0" w:left="709"/>
+      </w:pPr>
+      <w:r>
+        <w:rPr>
+          <w:rFonts w:ascii="Courier New" w:hAnsi="Courier New" w:eastAsia="Courier New"/>
+          <w:b w:val="0"/>
+          <w:i w:val="0"/>
+          <w:sz w:val="20"/>
+        </w:rPr>
+        <w:t xml:space="preserve">  },</w:t>
+      </w:r>
+    </w:p>
+    <w:p>
+      <w:pPr>
+        <w:spacing w:line="240" w:lineRule="auto"/>
+        <w:ind w:firstLine="0" w:left="709"/>
+      </w:pPr>
+      <w:r>
+        <w:rPr>
+          <w:rFonts w:ascii="Courier New" w:hAnsi="Courier New" w:eastAsia="Courier New"/>
+          <w:b w:val="0"/>
+          <w:i w:val="0"/>
+          <w:sz w:val="20"/>
+        </w:rPr>
+        <w:t xml:space="preserve">  "nodeB": {</w:t>
+      </w:r>
+    </w:p>
+    <w:p>
+      <w:pPr>
+        <w:spacing w:line="240" w:lineRule="auto"/>
+        <w:ind w:firstLine="0" w:left="709"/>
+      </w:pPr>
+      <w:r>
+        <w:rPr>
+          <w:rFonts w:ascii="Courier New" w:hAnsi="Courier New" w:eastAsia="Courier New"/>
+          <w:b w:val="0"/>
+          <w:i w:val="0"/>
+          <w:sz w:val="20"/>
+        </w:rPr>
+        <w:t xml:space="preserve">    "serverInstanceId": "app-api-2",</w:t>
+      </w:r>
+    </w:p>
+    <w:p>
+      <w:pPr>
+        <w:spacing w:line="240" w:lineRule="auto"/>
+        <w:ind w:firstLine="0" w:left="709"/>
+      </w:pPr>
+      <w:r>
+        <w:rPr>
+          <w:rFonts w:ascii="Courier New" w:hAnsi="Courier New" w:eastAsia="Courier New"/>
+          <w:b w:val="0"/>
+          <w:i w:val="0"/>
+          <w:sz w:val="20"/>
+        </w:rPr>
+        <w:t xml:space="preserve">    "machineName": "1d6a8589cdae",</w:t>
+      </w:r>
+    </w:p>
+    <w:p>
+      <w:pPr>
+        <w:spacing w:line="240" w:lineRule="auto"/>
+        <w:ind w:firstLine="0" w:left="709"/>
+      </w:pPr>
+      <w:r>
+        <w:rPr>
+          <w:rFonts w:ascii="Courier New" w:hAnsi="Courier New" w:eastAsia="Courier New"/>
+          <w:b w:val="0"/>
+          <w:i w:val="0"/>
+          <w:sz w:val="20"/>
+        </w:rPr>
+        <w:t xml:space="preserve">    "connectionId": "NpH7DSAYYJW1EWM2XKhyqQ",</w:t>
+      </w:r>
+    </w:p>
+    <w:p>
+      <w:pPr>
+        <w:spacing w:line="240" w:lineRule="auto"/>
+        <w:ind w:firstLine="0" w:left="709"/>
+      </w:pPr>
+      <w:r>
+        <w:rPr>
+          <w:rFonts w:ascii="Courier New" w:hAnsi="Courier New" w:eastAsia="Courier New"/>
+          <w:b w:val="0"/>
+          <w:i w:val="0"/>
+          <w:sz w:val="20"/>
+        </w:rPr>
+        <w:t xml:space="preserve">    "userIdentifier": "thesis-user"</w:t>
+      </w:r>
+    </w:p>
+    <w:p>
+      <w:pPr>
+        <w:spacing w:line="240" w:lineRule="auto"/>
+        <w:ind w:firstLine="0" w:left="709"/>
+      </w:pPr>
+      <w:r>
+        <w:rPr>
+          <w:rFonts w:ascii="Courier New" w:hAnsi="Courier New" w:eastAsia="Courier New"/>
+          <w:b w:val="0"/>
+          <w:i w:val="0"/>
+          <w:sz w:val="20"/>
+        </w:rPr>
+        <w:t xml:space="preserve">  },</w:t>
+      </w:r>
+    </w:p>
+    <w:p>
+      <w:pPr>
+        <w:spacing w:line="240" w:lineRule="auto"/>
+        <w:ind w:firstLine="0" w:left="709"/>
+      </w:pPr>
+      <w:r>
+        <w:rPr>
+          <w:rFonts w:ascii="Courier New" w:hAnsi="Courier New" w:eastAsia="Courier New"/>
+          <w:b w:val="0"/>
+          <w:i w:val="0"/>
+          <w:sz w:val="20"/>
+        </w:rPr>
+        <w:t xml:space="preserve">  "receivedPatch": {</w:t>
+      </w:r>
+    </w:p>
+    <w:p>
+      <w:pPr>
+        <w:spacing w:line="240" w:lineRule="auto"/>
+        <w:ind w:firstLine="0" w:left="709"/>
+      </w:pPr>
+      <w:r>
+        <w:rPr>
+          <w:rFonts w:ascii="Courier New" w:hAnsi="Courier New" w:eastAsia="Courier New"/>
+          <w:b w:val="0"/>
+          <w:i w:val="0"/>
+          <w:sz w:val="20"/>
+        </w:rPr>
+        <w:t xml:space="preserve">    "title": "scaleout-patched-1778316874715",</w:t>
+      </w:r>
+    </w:p>
+    <w:p>
+      <w:pPr>
+        <w:spacing w:line="240" w:lineRule="auto"/>
+        <w:ind w:firstLine="0" w:left="709"/>
+      </w:pPr>
+      <w:r>
+        <w:rPr>
+          <w:rFonts w:ascii="Courier New" w:hAnsi="Courier New" w:eastAsia="Courier New"/>
+          <w:b w:val="0"/>
+          <w:i w:val="0"/>
+          <w:sz w:val="20"/>
+        </w:rPr>
+        <w:t xml:space="preserve">    "updatedAt": "2026-05-09T08:54:35.186614+00:00"</w:t>
+      </w:r>
+    </w:p>
+    <w:p>
+      <w:pPr>
+        <w:spacing w:line="240" w:lineRule="auto"/>
+        <w:ind w:firstLine="0" w:left="709"/>
+      </w:pPr>
+      <w:r>
+        <w:rPr>
+          <w:rFonts w:ascii="Courier New" w:hAnsi="Courier New" w:eastAsia="Courier New"/>
+          <w:b w:val="0"/>
+          <w:i w:val="0"/>
+          <w:sz w:val="20"/>
+        </w:rPr>
+        <w:t xml:space="preserve">  },</w:t>
+      </w:r>
+    </w:p>
+    <w:p>
+      <w:pPr>
+        <w:spacing w:line="240" w:lineRule="auto"/>
+        <w:ind w:firstLine="0" w:left="709"/>
+      </w:pPr>
+      <w:r>
+        <w:rPr>
+          <w:rFonts w:ascii="Courier New" w:hAnsi="Courier New" w:eastAsia="Courier New"/>
+          <w:b w:val="0"/>
+          <w:i w:val="0"/>
+          <w:sz w:val="20"/>
+        </w:rPr>
+        <w:t xml:space="preserve">  "metrics": {</w:t>
+      </w:r>
+    </w:p>
+    <w:p>
+      <w:pPr>
+        <w:spacing w:line="240" w:lineRule="auto"/>
+        <w:ind w:firstLine="0" w:left="709"/>
+      </w:pPr>
+      <w:r>
+        <w:rPr>
+          <w:rFonts w:ascii="Courier New" w:hAnsi="Courier New" w:eastAsia="Courier New"/>
+          <w:b w:val="0"/>
+          <w:i w:val="0"/>
+          <w:sz w:val="20"/>
+        </w:rPr>
+        <w:t xml:space="preserve">    "deliveryLatencyMs": 9.5,</w:t>
+      </w:r>
+    </w:p>
+    <w:p>
+      <w:pPr>
+        <w:spacing w:line="240" w:lineRule="auto"/>
+        <w:ind w:firstLine="0" w:left="709"/>
+      </w:pPr>
+      <w:r>
+        <w:rPr>
+          <w:rFonts w:ascii="Courier New" w:hAnsi="Courier New" w:eastAsia="Courier New"/>
+          <w:b w:val="0"/>
+          <w:i w:val="0"/>
+          <w:sz w:val="20"/>
+        </w:rPr>
+        <w:t xml:space="preserve">    "patchRequestMs": 8.5</w:t>
+      </w:r>
+    </w:p>
+    <w:p>
+      <w:pPr>
+        <w:spacing w:line="240" w:lineRule="auto"/>
+        <w:ind w:firstLine="0" w:left="709"/>
+      </w:pPr>
+      <w:r>
+        <w:rPr>
+          <w:rFonts w:ascii="Courier New" w:hAnsi="Courier New" w:eastAsia="Courier New"/>
+          <w:b w:val="0"/>
+          <w:i w:val="0"/>
+          <w:sz w:val="20"/>
+        </w:rPr>
+        <w:t xml:space="preserve">  }</w:t>
+      </w:r>
+    </w:p>
+    <w:p>
+      <w:pPr>
+        <w:spacing w:line="240" w:lineRule="auto"/>
+        <w:ind w:firstLine="0" w:left="709"/>
+      </w:pPr>
+      <w:r>
+        <w:rPr>
+          <w:rFonts w:ascii="Courier New" w:hAnsi="Courier New" w:eastAsia="Courier New"/>
+          <w:b w:val="0"/>
+          <w:i w:val="0"/>
+          <w:sz w:val="20"/>
+        </w:rPr>
+        <w:t>}</w:t>
       </w:r>
     </w:p>
     <w:p>
@@ -7746,22 +7799,69 @@
           <w:i w:val="0"/>
           <w:sz w:val="28"/>
         </w:rPr>
-        <w:t>Для дополнительной проверки был выполнен серийный запуск из пяти независимых итераций в режиме с Redis backplane:</w:t>
-      </w:r>
-    </w:p>
-    <w:p>
-      <w:pPr>
-        <w:spacing w:line="240" w:lineRule="auto"/>
-        <w:ind w:firstLine="0" w:left="709"/>
-      </w:pPr>
+        <w:t xml:space="preserve">Из результата видно, что клиент A был подключен к </w:t>
+      </w:r>
       <w:r>
         <w:rPr>
           <w:rFonts w:ascii="Courier New" w:hAnsi="Courier New" w:eastAsia="Courier New"/>
           <w:b w:val="0"/>
           <w:i w:val="0"/>
-          <w:sz w:val="20"/>
-        </w:rPr>
-        <w:t>THESIS_ITERATIONS=5 node scripts/realtime-scaleout-check.mjs</w:t>
+          <w:sz w:val="28"/>
+        </w:rPr>
+        <w:t>app-api-1</w:t>
+      </w:r>
+      <w:r>
+        <w:rPr>
+          <w:rFonts w:ascii="Times New Roman" w:hAnsi="Times New Roman" w:eastAsia="Times New Roman"/>
+          <w:b w:val="0"/>
+          <w:i w:val="0"/>
+          <w:sz w:val="28"/>
+        </w:rPr>
+        <w:t xml:space="preserve">, а клиент B — к </w:t>
+      </w:r>
+      <w:r>
+        <w:rPr>
+          <w:rFonts w:ascii="Courier New" w:hAnsi="Courier New" w:eastAsia="Courier New"/>
+          <w:b w:val="0"/>
+          <w:i w:val="0"/>
+          <w:sz w:val="28"/>
+        </w:rPr>
+        <w:t>app-api-2</w:t>
+      </w:r>
+      <w:r>
+        <w:rPr>
+          <w:rFonts w:ascii="Times New Roman" w:hAnsi="Times New Roman" w:eastAsia="Times New Roman"/>
+          <w:b w:val="0"/>
+          <w:i w:val="0"/>
+          <w:sz w:val="28"/>
+        </w:rPr>
+        <w:t xml:space="preserve">. При этом клиент B получил событие </w:t>
+      </w:r>
+      <w:r>
+        <w:rPr>
+          <w:rFonts w:ascii="Courier New" w:hAnsi="Courier New" w:eastAsia="Courier New"/>
+          <w:b w:val="0"/>
+          <w:i w:val="0"/>
+          <w:sz w:val="28"/>
+        </w:rPr>
+        <w:t>ReceiveReportPatch</w:t>
+      </w:r>
+      <w:r>
+        <w:rPr>
+          <w:rFonts w:ascii="Times New Roman" w:hAnsi="Times New Roman" w:eastAsia="Times New Roman"/>
+          <w:b w:val="0"/>
+          <w:i w:val="0"/>
+          <w:sz w:val="28"/>
+        </w:rPr>
+        <w:t>, инициированное через первый узел. Это подтверждает, что Redis backplane обеспечил межузловую доставку real-time события [4], [9].</w:t>
+      </w:r>
+    </w:p>
+    <w:p>
+      <w:pPr>
+        <w:pStyle w:val="Heading2"/>
+      </w:pPr>
+      <w:r>
+        <w:t>5.5 Серийная проверка и задержка доставки</w:t>
       </w:r>
     </w:p>
     <w:p>
@@ -7777,7 +7877,7 @@
           <w:i w:val="0"/>
           <w:sz w:val="28"/>
         </w:rPr>
-        <w:t>Результат:</w:t>
+        <w:t>Для дополнительной проверки был выполнен серийный запуск из пяти независимых итераций в режиме с Redis backplane:</w:t>
       </w:r>
     </w:p>
     <w:p>
@@ -7792,187 +7892,7 @@
           <w:i w:val="0"/>
           <w:sz w:val="20"/>
         </w:rPr>
-        <w:t>{</w:t>
-      </w:r>
-    </w:p>
-    <w:p>
-      <w:pPr>
-        <w:spacing w:line="240" w:lineRule="auto"/>
-        <w:ind w:firstLine="0" w:left="709"/>
-      </w:pPr>
-      <w:r>
-        <w:rPr>
-          <w:rFonts w:ascii="Courier New" w:hAnsi="Courier New" w:eastAsia="Courier New"/>
-          <w:b w:val="0"/>
-          <w:i w:val="0"/>
-          <w:sz w:val="20"/>
-        </w:rPr>
-        <w:t xml:space="preserve">  "ok": true,</w:t>
-      </w:r>
-    </w:p>
-    <w:p>
-      <w:pPr>
-        <w:spacing w:line="240" w:lineRule="auto"/>
-        <w:ind w:firstLine="0" w:left="709"/>
-      </w:pPr>
-      <w:r>
-        <w:rPr>
-          <w:rFonts w:ascii="Courier New" w:hAnsi="Courier New" w:eastAsia="Courier New"/>
-          <w:b w:val="0"/>
-          <w:i w:val="0"/>
-          <w:sz w:val="20"/>
-        </w:rPr>
-        <w:t xml:space="preserve">  "iterations": 5,</w:t>
-      </w:r>
-    </w:p>
-    <w:p>
-      <w:pPr>
-        <w:spacing w:line="240" w:lineRule="auto"/>
-        <w:ind w:firstLine="0" w:left="709"/>
-      </w:pPr>
-      <w:r>
-        <w:rPr>
-          <w:rFonts w:ascii="Courier New" w:hAnsi="Courier New" w:eastAsia="Courier New"/>
-          <w:b w:val="0"/>
-          <w:i w:val="0"/>
-          <w:sz w:val="20"/>
-        </w:rPr>
-        <w:t xml:space="preserve">  "successful": 5,</w:t>
-      </w:r>
-    </w:p>
-    <w:p>
-      <w:pPr>
-        <w:spacing w:line="240" w:lineRule="auto"/>
-        <w:ind w:firstLine="0" w:left="709"/>
-      </w:pPr>
-      <w:r>
-        <w:rPr>
-          <w:rFonts w:ascii="Courier New" w:hAnsi="Courier New" w:eastAsia="Courier New"/>
-          <w:b w:val="0"/>
-          <w:i w:val="0"/>
-          <w:sz w:val="20"/>
-        </w:rPr>
-        <w:t xml:space="preserve">  "failed": 0,</w:t>
-      </w:r>
-    </w:p>
-    <w:p>
-      <w:pPr>
-        <w:spacing w:line="240" w:lineRule="auto"/>
-        <w:ind w:firstLine="0" w:left="709"/>
-      </w:pPr>
-      <w:r>
-        <w:rPr>
-          <w:rFonts w:ascii="Courier New" w:hAnsi="Courier New" w:eastAsia="Courier New"/>
-          <w:b w:val="0"/>
-          <w:i w:val="0"/>
-          <w:sz w:val="20"/>
-        </w:rPr>
-        <w:t xml:space="preserve">  "latencyMs": {</w:t>
-      </w:r>
-    </w:p>
-    <w:p>
-      <w:pPr>
-        <w:spacing w:line="240" w:lineRule="auto"/>
-        <w:ind w:firstLine="0" w:left="709"/>
-      </w:pPr>
-      <w:r>
-        <w:rPr>
-          <w:rFonts w:ascii="Courier New" w:hAnsi="Courier New" w:eastAsia="Courier New"/>
-          <w:b w:val="0"/>
-          <w:i w:val="0"/>
-          <w:sz w:val="20"/>
-        </w:rPr>
-        <w:t xml:space="preserve">    "min": 3.6,</w:t>
-      </w:r>
-    </w:p>
-    <w:p>
-      <w:pPr>
-        <w:spacing w:line="240" w:lineRule="auto"/>
-        <w:ind w:firstLine="0" w:left="709"/>
-      </w:pPr>
-      <w:r>
-        <w:rPr>
-          <w:rFonts w:ascii="Courier New" w:hAnsi="Courier New" w:eastAsia="Courier New"/>
-          <w:b w:val="0"/>
-          <w:i w:val="0"/>
-          <w:sz w:val="20"/>
-        </w:rPr>
-        <w:t xml:space="preserve">    "max": 9.5,</w:t>
-      </w:r>
-    </w:p>
-    <w:p>
-      <w:pPr>
-        <w:spacing w:line="240" w:lineRule="auto"/>
-        <w:ind w:firstLine="0" w:left="709"/>
-      </w:pPr>
-      <w:r>
-        <w:rPr>
-          <w:rFonts w:ascii="Courier New" w:hAnsi="Courier New" w:eastAsia="Courier New"/>
-          <w:b w:val="0"/>
-          <w:i w:val="0"/>
-          <w:sz w:val="20"/>
-        </w:rPr>
-        <w:t xml:space="preserve">    "avg": 5.5,</w:t>
-      </w:r>
-    </w:p>
-    <w:p>
-      <w:pPr>
-        <w:spacing w:line="240" w:lineRule="auto"/>
-        <w:ind w:firstLine="0" w:left="709"/>
-      </w:pPr>
-      <w:r>
-        <w:rPr>
-          <w:rFonts w:ascii="Courier New" w:hAnsi="Courier New" w:eastAsia="Courier New"/>
-          <w:b w:val="0"/>
-          <w:i w:val="0"/>
-          <w:sz w:val="20"/>
-        </w:rPr>
-        <w:t xml:space="preserve">    "p50": 4.4,</w:t>
-      </w:r>
-    </w:p>
-    <w:p>
-      <w:pPr>
-        <w:spacing w:line="240" w:lineRule="auto"/>
-        <w:ind w:firstLine="0" w:left="709"/>
-      </w:pPr>
-      <w:r>
-        <w:rPr>
-          <w:rFonts w:ascii="Courier New" w:hAnsi="Courier New" w:eastAsia="Courier New"/>
-          <w:b w:val="0"/>
-          <w:i w:val="0"/>
-          <w:sz w:val="20"/>
-        </w:rPr>
-        <w:t xml:space="preserve">    "p95": 9.5</w:t>
-      </w:r>
-    </w:p>
-    <w:p>
-      <w:pPr>
-        <w:spacing w:line="240" w:lineRule="auto"/>
-        <w:ind w:firstLine="0" w:left="709"/>
-      </w:pPr>
-      <w:r>
-        <w:rPr>
-          <w:rFonts w:ascii="Courier New" w:hAnsi="Courier New" w:eastAsia="Courier New"/>
-          <w:b w:val="0"/>
-          <w:i w:val="0"/>
-          <w:sz w:val="20"/>
-        </w:rPr>
-        <w:t xml:space="preserve">  }</w:t>
-      </w:r>
-    </w:p>
-    <w:p>
-      <w:pPr>
-        <w:spacing w:line="240" w:lineRule="auto"/>
-        <w:ind w:firstLine="0" w:left="709"/>
-      </w:pPr>
-      <w:r>
-        <w:rPr>
-          <w:rFonts w:ascii="Courier New" w:hAnsi="Courier New" w:eastAsia="Courier New"/>
-          <w:b w:val="0"/>
-          <w:i w:val="0"/>
-          <w:sz w:val="20"/>
-        </w:rPr>
-        <w:t>}</w:t>
+        <w:t>THESIS_ITERATIONS=5 node scripts/realtime-scaleout-check.mjs</w:t>
       </w:r>
     </w:p>
     <w:p>
@@ -7988,6 +7908,217 @@
           <w:i w:val="0"/>
           <w:sz w:val="28"/>
         </w:rPr>
+        <w:t>Результат:</w:t>
+      </w:r>
+    </w:p>
+    <w:p>
+      <w:pPr>
+        <w:spacing w:line="240" w:lineRule="auto"/>
+        <w:ind w:firstLine="0" w:left="709"/>
+      </w:pPr>
+      <w:r>
+        <w:rPr>
+          <w:rFonts w:ascii="Courier New" w:hAnsi="Courier New" w:eastAsia="Courier New"/>
+          <w:b w:val="0"/>
+          <w:i w:val="0"/>
+          <w:sz w:val="20"/>
+        </w:rPr>
+        <w:t>{</w:t>
+      </w:r>
+    </w:p>
+    <w:p>
+      <w:pPr>
+        <w:spacing w:line="240" w:lineRule="auto"/>
+        <w:ind w:firstLine="0" w:left="709"/>
+      </w:pPr>
+      <w:r>
+        <w:rPr>
+          <w:rFonts w:ascii="Courier New" w:hAnsi="Courier New" w:eastAsia="Courier New"/>
+          <w:b w:val="0"/>
+          <w:i w:val="0"/>
+          <w:sz w:val="20"/>
+        </w:rPr>
+        <w:t xml:space="preserve">  "ok": true,</w:t>
+      </w:r>
+    </w:p>
+    <w:p>
+      <w:pPr>
+        <w:spacing w:line="240" w:lineRule="auto"/>
+        <w:ind w:firstLine="0" w:left="709"/>
+      </w:pPr>
+      <w:r>
+        <w:rPr>
+          <w:rFonts w:ascii="Courier New" w:hAnsi="Courier New" w:eastAsia="Courier New"/>
+          <w:b w:val="0"/>
+          <w:i w:val="0"/>
+          <w:sz w:val="20"/>
+        </w:rPr>
+        <w:t xml:space="preserve">  "iterations": 5,</w:t>
+      </w:r>
+    </w:p>
+    <w:p>
+      <w:pPr>
+        <w:spacing w:line="240" w:lineRule="auto"/>
+        <w:ind w:firstLine="0" w:left="709"/>
+      </w:pPr>
+      <w:r>
+        <w:rPr>
+          <w:rFonts w:ascii="Courier New" w:hAnsi="Courier New" w:eastAsia="Courier New"/>
+          <w:b w:val="0"/>
+          <w:i w:val="0"/>
+          <w:sz w:val="20"/>
+        </w:rPr>
+        <w:t xml:space="preserve">  "successful": 5,</w:t>
+      </w:r>
+    </w:p>
+    <w:p>
+      <w:pPr>
+        <w:spacing w:line="240" w:lineRule="auto"/>
+        <w:ind w:firstLine="0" w:left="709"/>
+      </w:pPr>
+      <w:r>
+        <w:rPr>
+          <w:rFonts w:ascii="Courier New" w:hAnsi="Courier New" w:eastAsia="Courier New"/>
+          <w:b w:val="0"/>
+          <w:i w:val="0"/>
+          <w:sz w:val="20"/>
+        </w:rPr>
+        <w:t xml:space="preserve">  "failed": 0,</w:t>
+      </w:r>
+    </w:p>
+    <w:p>
+      <w:pPr>
+        <w:spacing w:line="240" w:lineRule="auto"/>
+        <w:ind w:firstLine="0" w:left="709"/>
+      </w:pPr>
+      <w:r>
+        <w:rPr>
+          <w:rFonts w:ascii="Courier New" w:hAnsi="Courier New" w:eastAsia="Courier New"/>
+          <w:b w:val="0"/>
+          <w:i w:val="0"/>
+          <w:sz w:val="20"/>
+        </w:rPr>
+        <w:t xml:space="preserve">  "latencyMs": {</w:t>
+      </w:r>
+    </w:p>
+    <w:p>
+      <w:pPr>
+        <w:spacing w:line="240" w:lineRule="auto"/>
+        <w:ind w:firstLine="0" w:left="709"/>
+      </w:pPr>
+      <w:r>
+        <w:rPr>
+          <w:rFonts w:ascii="Courier New" w:hAnsi="Courier New" w:eastAsia="Courier New"/>
+          <w:b w:val="0"/>
+          <w:i w:val="0"/>
+          <w:sz w:val="20"/>
+        </w:rPr>
+        <w:t xml:space="preserve">    "min": 5.5,</w:t>
+      </w:r>
+    </w:p>
+    <w:p>
+      <w:pPr>
+        <w:spacing w:line="240" w:lineRule="auto"/>
+        <w:ind w:firstLine="0" w:left="709"/>
+      </w:pPr>
+      <w:r>
+        <w:rPr>
+          <w:rFonts w:ascii="Courier New" w:hAnsi="Courier New" w:eastAsia="Courier New"/>
+          <w:b w:val="0"/>
+          <w:i w:val="0"/>
+          <w:sz w:val="20"/>
+        </w:rPr>
+        <w:t xml:space="preserve">    "max": 11.6,</w:t>
+      </w:r>
+    </w:p>
+    <w:p>
+      <w:pPr>
+        <w:spacing w:line="240" w:lineRule="auto"/>
+        <w:ind w:firstLine="0" w:left="709"/>
+      </w:pPr>
+      <w:r>
+        <w:rPr>
+          <w:rFonts w:ascii="Courier New" w:hAnsi="Courier New" w:eastAsia="Courier New"/>
+          <w:b w:val="0"/>
+          <w:i w:val="0"/>
+          <w:sz w:val="20"/>
+        </w:rPr>
+        <w:t xml:space="preserve">    "avg": 8.4,</w:t>
+      </w:r>
+    </w:p>
+    <w:p>
+      <w:pPr>
+        <w:spacing w:line="240" w:lineRule="auto"/>
+        <w:ind w:firstLine="0" w:left="709"/>
+      </w:pPr>
+      <w:r>
+        <w:rPr>
+          <w:rFonts w:ascii="Courier New" w:hAnsi="Courier New" w:eastAsia="Courier New"/>
+          <w:b w:val="0"/>
+          <w:i w:val="0"/>
+          <w:sz w:val="20"/>
+        </w:rPr>
+        <w:t xml:space="preserve">    "p50": 9.1,</w:t>
+      </w:r>
+    </w:p>
+    <w:p>
+      <w:pPr>
+        <w:spacing w:line="240" w:lineRule="auto"/>
+        <w:ind w:firstLine="0" w:left="709"/>
+      </w:pPr>
+      <w:r>
+        <w:rPr>
+          <w:rFonts w:ascii="Courier New" w:hAnsi="Courier New" w:eastAsia="Courier New"/>
+          <w:b w:val="0"/>
+          <w:i w:val="0"/>
+          <w:sz w:val="20"/>
+        </w:rPr>
+        <w:t xml:space="preserve">    "p95": 11.6</w:t>
+      </w:r>
+    </w:p>
+    <w:p>
+      <w:pPr>
+        <w:spacing w:line="240" w:lineRule="auto"/>
+        <w:ind w:firstLine="0" w:left="709"/>
+      </w:pPr>
+      <w:r>
+        <w:rPr>
+          <w:rFonts w:ascii="Courier New" w:hAnsi="Courier New" w:eastAsia="Courier New"/>
+          <w:b w:val="0"/>
+          <w:i w:val="0"/>
+          <w:sz w:val="20"/>
+        </w:rPr>
+        <w:t xml:space="preserve">  }</w:t>
+      </w:r>
+    </w:p>
+    <w:p>
+      <w:pPr>
+        <w:spacing w:line="240" w:lineRule="auto"/>
+        <w:ind w:firstLine="0" w:left="709"/>
+      </w:pPr>
+      <w:r>
+        <w:rPr>
+          <w:rFonts w:ascii="Courier New" w:hAnsi="Courier New" w:eastAsia="Courier New"/>
+          <w:b w:val="0"/>
+          <w:i w:val="0"/>
+          <w:sz w:val="20"/>
+        </w:rPr>
+        <w:t>}</w:t>
+      </w:r>
+    </w:p>
+    <w:p>
+      <w:pPr>
+        <w:spacing w:line="360" w:lineRule="auto"/>
+        <w:ind w:firstLine="709"/>
+        <w:jc w:val="both"/>
+      </w:pPr>
+      <w:r>
+        <w:rPr>
+          <w:rFonts w:ascii="Times New Roman" w:hAnsi="Times New Roman" w:eastAsia="Times New Roman"/>
+          <w:b w:val="0"/>
+          <w:i w:val="0"/>
+          <w:sz w:val="28"/>
+        </w:rPr>
         <w:t xml:space="preserve">Все пять проверок завершились успешно: каждый раз клиент, подключенный к </w:t>
       </w:r>
       <w:r>
@@ -8024,7 +8155,227 @@
           <w:i w:val="0"/>
           <w:sz w:val="28"/>
         </w:rPr>
-        <w:t>. Измеренная задержка доставки в локальном стенде составила в среднем 5,5 мс, p50 — 4,4 мс, p95 — 9,5 мс. Эти значения не следует трактовать как промышленный нагрузочный тест, поскольку стенд локальный и число итераций невелико. Однако они подтверждают, что реализованная межузловая доставка работает не только в единичном запуске, но и в серии повторных проверок.</w:t>
+        <w:t>. Измеренная задержка доставки в локальном стенде составила в среднем 8,4 мс, p50 — 9,1 мс, p95 — 11,6 мс. Эти значения не следует трактовать как промышленный нагрузочный тест, поскольку стенд локальный и число итераций невелико. Однако они подтверждают, что реализованная межузловая доставка работает не только в единичном запуске, но и в серии повторных проверок.</w:t>
+      </w:r>
+    </w:p>
+    <w:p>
+      <w:pPr>
+        <w:pStyle w:val="Heading2"/>
+      </w:pPr>
+      <w:r>
+        <w:t>5.6 Проверка восстановления соединения и отказа узла</w:t>
+      </w:r>
+    </w:p>
+    <w:p>
+      <w:pPr>
+        <w:spacing w:line="360" w:lineRule="auto"/>
+        <w:ind w:firstLine="709"/>
+        <w:jc w:val="both"/>
+      </w:pPr>
+      <w:r>
+        <w:rPr>
+          <w:rFonts w:ascii="Times New Roman" w:hAnsi="Times New Roman" w:eastAsia="Times New Roman"/>
+          <w:b w:val="0"/>
+          <w:i w:val="0"/>
+          <w:sz w:val="28"/>
+        </w:rPr>
+        <w:t xml:space="preserve">Режим </w:t>
+      </w:r>
+      <w:r>
+        <w:rPr>
+          <w:rFonts w:ascii="Courier New" w:hAnsi="Courier New" w:eastAsia="Courier New"/>
+          <w:b w:val="0"/>
+          <w:i w:val="0"/>
+          <w:sz w:val="28"/>
+        </w:rPr>
+        <w:t>THESIS_SCENARIO=rejoin</w:t>
+      </w:r>
+      <w:r>
+        <w:rPr>
+          <w:rFonts w:ascii="Times New Roman" w:hAnsi="Times New Roman" w:eastAsia="Times New Roman"/>
+          <w:b w:val="0"/>
+          <w:i w:val="0"/>
+          <w:sz w:val="28"/>
+        </w:rPr>
+        <w:t xml:space="preserve"> проверяет, что после разрыва соединения клиент может создать новое SignalR-подключение, повторно вступить в группу отчета и получить следующее событие. В зафиксированном запуске клиент B сначала был подключен к </w:t>
+      </w:r>
+      <w:r>
+        <w:rPr>
+          <w:rFonts w:ascii="Courier New" w:hAnsi="Courier New" w:eastAsia="Courier New"/>
+          <w:b w:val="0"/>
+          <w:i w:val="0"/>
+          <w:sz w:val="28"/>
+        </w:rPr>
+        <w:t>app-api-2</w:t>
+      </w:r>
+      <w:r>
+        <w:rPr>
+          <w:rFonts w:ascii="Times New Roman" w:hAnsi="Times New Roman" w:eastAsia="Times New Roman"/>
+          <w:b w:val="0"/>
+          <w:i w:val="0"/>
+          <w:sz w:val="28"/>
+        </w:rPr>
+        <w:t xml:space="preserve">, затем получил новое соединение с другим </w:t>
+      </w:r>
+      <w:r>
+        <w:rPr>
+          <w:rFonts w:ascii="Courier New" w:hAnsi="Courier New" w:eastAsia="Courier New"/>
+          <w:b w:val="0"/>
+          <w:i w:val="0"/>
+          <w:sz w:val="28"/>
+        </w:rPr>
+        <w:t>connectionId</w:t>
+      </w:r>
+      <w:r>
+        <w:rPr>
+          <w:rFonts w:ascii="Times New Roman" w:hAnsi="Times New Roman" w:eastAsia="Times New Roman"/>
+          <w:b w:val="0"/>
+          <w:i w:val="0"/>
+          <w:sz w:val="28"/>
+        </w:rPr>
+        <w:t xml:space="preserve">, повторно выполнил </w:t>
+      </w:r>
+      <w:r>
+        <w:rPr>
+          <w:rFonts w:ascii="Courier New" w:hAnsi="Courier New" w:eastAsia="Courier New"/>
+          <w:b w:val="0"/>
+          <w:i w:val="0"/>
+          <w:sz w:val="28"/>
+        </w:rPr>
+        <w:t>JoinReportGroupAsync</w:t>
+      </w:r>
+      <w:r>
+        <w:rPr>
+          <w:rFonts w:ascii="Times New Roman" w:hAnsi="Times New Roman" w:eastAsia="Times New Roman"/>
+          <w:b w:val="0"/>
+          <w:i w:val="0"/>
+          <w:sz w:val="28"/>
+        </w:rPr>
+        <w:t xml:space="preserve"> и получил событие </w:t>
+      </w:r>
+      <w:r>
+        <w:rPr>
+          <w:rFonts w:ascii="Courier New" w:hAnsi="Courier New" w:eastAsia="Courier New"/>
+          <w:b w:val="0"/>
+          <w:i w:val="0"/>
+          <w:sz w:val="28"/>
+        </w:rPr>
+        <w:t>ReceiveReportPatch</w:t>
+      </w:r>
+      <w:r>
+        <w:rPr>
+          <w:rFonts w:ascii="Times New Roman" w:hAnsi="Times New Roman" w:eastAsia="Times New Roman"/>
+          <w:b w:val="0"/>
+          <w:i w:val="0"/>
+          <w:sz w:val="28"/>
+        </w:rPr>
+        <w:t>. Время повторного подключения и вступления в группу составило 12,9 мс, задержка доставки после повторного вступления — 6,6 мс.</w:t>
+      </w:r>
+    </w:p>
+    <w:p>
+      <w:pPr>
+        <w:spacing w:line="360" w:lineRule="auto"/>
+        <w:ind w:firstLine="709"/>
+        <w:jc w:val="both"/>
+      </w:pPr>
+      <w:r>
+        <w:rPr>
+          <w:rFonts w:ascii="Times New Roman" w:hAnsi="Times New Roman" w:eastAsia="Times New Roman"/>
+          <w:b w:val="0"/>
+          <w:i w:val="0"/>
+          <w:sz w:val="28"/>
+        </w:rPr>
+        <w:t xml:space="preserve">Режим </w:t>
+      </w:r>
+      <w:r>
+        <w:rPr>
+          <w:rFonts w:ascii="Courier New" w:hAnsi="Courier New" w:eastAsia="Courier New"/>
+          <w:b w:val="0"/>
+          <w:i w:val="0"/>
+          <w:sz w:val="28"/>
+        </w:rPr>
+        <w:t>THESIS_SCENARIO=failover</w:t>
+      </w:r>
+      <w:r>
+        <w:rPr>
+          <w:rFonts w:ascii="Times New Roman" w:hAnsi="Times New Roman" w:eastAsia="Times New Roman"/>
+          <w:b w:val="0"/>
+          <w:i w:val="0"/>
+          <w:sz w:val="28"/>
+        </w:rPr>
+        <w:t xml:space="preserve"> проверяет поведение при остановке одного экземпляра. Клиент B был подключен через nginx к </w:t>
+      </w:r>
+      <w:r>
+        <w:rPr>
+          <w:rFonts w:ascii="Courier New" w:hAnsi="Courier New" w:eastAsia="Courier New"/>
+          <w:b w:val="0"/>
+          <w:i w:val="0"/>
+          <w:sz w:val="28"/>
+        </w:rPr>
+        <w:t>app-api-2</w:t>
+      </w:r>
+      <w:r>
+        <w:rPr>
+          <w:rFonts w:ascii="Times New Roman" w:hAnsi="Times New Roman" w:eastAsia="Times New Roman"/>
+          <w:b w:val="0"/>
+          <w:i w:val="0"/>
+          <w:sz w:val="28"/>
+        </w:rPr>
+        <w:t xml:space="preserve">, после чего контейнер </w:t>
+      </w:r>
+      <w:r>
+        <w:rPr>
+          <w:rFonts w:ascii="Courier New" w:hAnsi="Courier New" w:eastAsia="Courier New"/>
+          <w:b w:val="0"/>
+          <w:i w:val="0"/>
+          <w:sz w:val="28"/>
+        </w:rPr>
+        <w:t>app-api-2</w:t>
+      </w:r>
+      <w:r>
+        <w:rPr>
+          <w:rFonts w:ascii="Times New Roman" w:hAnsi="Times New Roman" w:eastAsia="Times New Roman"/>
+          <w:b w:val="0"/>
+          <w:i w:val="0"/>
+          <w:sz w:val="28"/>
+        </w:rPr>
+        <w:t xml:space="preserve"> был остановлен. SignalR-клиент переподключился через nginx к </w:t>
+      </w:r>
+      <w:r>
+        <w:rPr>
+          <w:rFonts w:ascii="Courier New" w:hAnsi="Courier New" w:eastAsia="Courier New"/>
+          <w:b w:val="0"/>
+          <w:i w:val="0"/>
+          <w:sz w:val="28"/>
+        </w:rPr>
+        <w:t>app-api-1</w:t>
+      </w:r>
+      <w:r>
+        <w:rPr>
+          <w:rFonts w:ascii="Times New Roman" w:hAnsi="Times New Roman" w:eastAsia="Times New Roman"/>
+          <w:b w:val="0"/>
+          <w:i w:val="0"/>
+          <w:sz w:val="28"/>
+        </w:rPr>
+        <w:t xml:space="preserve">, повторно вступил в группу отчета и получил новое событие. Время переподключения и повторного вступления составило 240,3 мс, задержка доставки после failover — 7,3 мс. Для WebSocket-only проверки через балансировщик в клиенте используется </w:t>
+      </w:r>
+      <w:r>
+        <w:rPr>
+          <w:rFonts w:ascii="Courier New" w:hAnsi="Courier New" w:eastAsia="Courier New"/>
+          <w:b w:val="0"/>
+          <w:i w:val="0"/>
+          <w:sz w:val="28"/>
+        </w:rPr>
+        <w:t>skipNegotiation</w:t>
+      </w:r>
+      <w:r>
+        <w:rPr>
+          <w:rFonts w:ascii="Times New Roman" w:hAnsi="Times New Roman" w:eastAsia="Times New Roman"/>
+          <w:b w:val="0"/>
+          <w:i w:val="0"/>
+          <w:sz w:val="28"/>
+        </w:rPr>
+        <w:t>, чтобы установить соединение одним WebSocket-запросом и не зависеть от sticky sessions на этапе negotiate.</w:t>
       </w:r>
     </w:p>
     <w:p>
@@ -8037,7 +8388,7 @@
         <w:pStyle w:val="Heading2"/>
       </w:pPr>
       <w:r>
-        <w:t>5.6 Сравнительная таблица результатов</w:t>
+        <w:t>5.7 Сравнительная таблица результатов</w:t>
       </w:r>
     </w:p>
     <w:p>
@@ -8052,7 +8403,7 @@
           <w:i w:val="0"/>
           <w:sz w:val="24"/>
         </w:rPr>
-        <w:t>Таблица 2 — Режим</w:t>
+        <w:t>Таблица 2 — Сравнительная таблица результатов испытаний</w:t>
       </w:r>
     </w:p>
     <w:tbl>
@@ -8579,7 +8930,7 @@
                 <w:b w:val="0"/>
                 <w:sz w:val="22"/>
               </w:rPr>
-              <w:t>5 из 5 успешно, p95 = 9,5 мс</w:t>
+              <w:t>5 из 5 успешно, p95 = 11,6 мс</w:t>
             </w:r>
           </w:p>
         </w:tc>
@@ -8606,13 +8957,281 @@
           </w:p>
         </w:tc>
       </w:tr>
+      <w:tr>
+        <w:tc>
+          <w:tcPr>
+            <w:tcW w:type="dxa" w:w="1615"/>
+            <w:vAlign w:val="center"/>
+          </w:tcPr>
+          <w:p>
+            <w:pPr>
+              <w:spacing w:line="240" w:lineRule="auto" w:before="0" w:after="0"/>
+              <w:ind w:firstLine="0"/>
+              <w:jc w:val="left"/>
+            </w:pPr>
+            <w:r/>
+            <w:r>
+              <w:rPr>
+                <w:rFonts w:ascii="Times New Roman" w:hAnsi="Times New Roman" w:eastAsia="Times New Roman"/>
+                <w:b w:val="0"/>
+                <w:sz w:val="22"/>
+              </w:rPr>
+              <w:t>Rejoin после разрыва</w:t>
+            </w:r>
+          </w:p>
+        </w:tc>
+        <w:tc>
+          <w:tcPr>
+            <w:tcW w:type="dxa" w:w="1615"/>
+            <w:vAlign w:val="center"/>
+          </w:tcPr>
+          <w:p>
+            <w:pPr>
+              <w:spacing w:line="240" w:lineRule="auto" w:before="0" w:after="0"/>
+              <w:ind w:firstLine="0"/>
+              <w:jc w:val="left"/>
+            </w:pPr>
+            <w:r/>
+            <w:r>
+              <w:rPr>
+                <w:rFonts w:ascii="Times New Roman" w:hAnsi="Times New Roman" w:eastAsia="Times New Roman"/>
+                <w:b w:val="0"/>
+                <w:sz w:val="22"/>
+              </w:rPr>
+              <w:t>Да</w:t>
+            </w:r>
+          </w:p>
+        </w:tc>
+        <w:tc>
+          <w:tcPr>
+            <w:tcW w:type="dxa" w:w="1615"/>
+            <w:vAlign w:val="center"/>
+          </w:tcPr>
+          <w:p>
+            <w:pPr>
+              <w:spacing w:line="240" w:lineRule="auto" w:before="0" w:after="0"/>
+              <w:ind w:firstLine="0"/>
+              <w:jc w:val="left"/>
+            </w:pPr>
+            <w:r/>
+            <w:r>
+              <w:rPr>
+                <w:rFonts w:ascii="Times New Roman" w:hAnsi="Times New Roman" w:eastAsia="Times New Roman"/>
+                <w:b w:val="0"/>
+                <w:sz w:val="22"/>
+              </w:rPr>
+              <w:t>Да</w:t>
+            </w:r>
+          </w:p>
+        </w:tc>
+        <w:tc>
+          <w:tcPr>
+            <w:tcW w:type="dxa" w:w="1615"/>
+            <w:vAlign w:val="center"/>
+          </w:tcPr>
+          <w:p>
+            <w:pPr>
+              <w:spacing w:line="240" w:lineRule="auto" w:before="0" w:after="0"/>
+              <w:ind w:firstLine="0"/>
+              <w:jc w:val="left"/>
+            </w:pPr>
+            <w:r/>
+            <w:r>
+              <w:rPr>
+                <w:rFonts w:ascii="Times New Roman" w:hAnsi="Times New Roman" w:eastAsia="Times New Roman"/>
+                <w:b w:val="0"/>
+                <w:sz w:val="22"/>
+              </w:rPr>
+              <w:t>После нового подключения клиент повторно вступает в группу</w:t>
+            </w:r>
+          </w:p>
+        </w:tc>
+        <w:tc>
+          <w:tcPr>
+            <w:tcW w:type="dxa" w:w="1615"/>
+            <w:vAlign w:val="center"/>
+          </w:tcPr>
+          <w:p>
+            <w:pPr>
+              <w:spacing w:line="240" w:lineRule="auto" w:before="0" w:after="0"/>
+              <w:ind w:firstLine="0"/>
+              <w:jc w:val="left"/>
+            </w:pPr>
+            <w:r/>
+            <w:r>
+              <w:rPr>
+                <w:rFonts w:ascii="Times New Roman" w:hAnsi="Times New Roman" w:eastAsia="Times New Roman"/>
+                <w:b w:val="0"/>
+                <w:sz w:val="22"/>
+              </w:rPr>
+              <w:t>Событие после rejoin получено, 6,6 мс</w:t>
+            </w:r>
+          </w:p>
+        </w:tc>
+        <w:tc>
+          <w:tcPr>
+            <w:tcW w:type="dxa" w:w="1615"/>
+            <w:vAlign w:val="center"/>
+          </w:tcPr>
+          <w:p>
+            <w:pPr>
+              <w:spacing w:line="240" w:lineRule="auto" w:before="0" w:after="0"/>
+              <w:ind w:firstLine="0"/>
+              <w:jc w:val="left"/>
+            </w:pPr>
+            <w:r/>
+            <w:r>
+              <w:rPr>
+                <w:rFonts w:ascii="Times New Roman" w:hAnsi="Times New Roman" w:eastAsia="Times New Roman"/>
+                <w:b w:val="0"/>
+                <w:sz w:val="22"/>
+              </w:rPr>
+              <w:t>Подтверждена повторная подписка</w:t>
+            </w:r>
+          </w:p>
+        </w:tc>
+      </w:tr>
+      <w:tr>
+        <w:tc>
+          <w:tcPr>
+            <w:tcW w:type="dxa" w:w="1615"/>
+            <w:vAlign w:val="center"/>
+          </w:tcPr>
+          <w:p>
+            <w:pPr>
+              <w:spacing w:line="240" w:lineRule="auto" w:before="0" w:after="0"/>
+              <w:ind w:firstLine="0"/>
+              <w:jc w:val="left"/>
+            </w:pPr>
+            <w:r/>
+            <w:r>
+              <w:rPr>
+                <w:rFonts w:ascii="Times New Roman" w:hAnsi="Times New Roman" w:eastAsia="Times New Roman"/>
+                <w:b w:val="0"/>
+                <w:sz w:val="22"/>
+              </w:rPr>
+              <w:t>Failover одного узла</w:t>
+            </w:r>
+          </w:p>
+        </w:tc>
+        <w:tc>
+          <w:tcPr>
+            <w:tcW w:type="dxa" w:w="1615"/>
+            <w:vAlign w:val="center"/>
+          </w:tcPr>
+          <w:p>
+            <w:pPr>
+              <w:spacing w:line="240" w:lineRule="auto" w:before="0" w:after="0"/>
+              <w:ind w:firstLine="0"/>
+              <w:jc w:val="left"/>
+            </w:pPr>
+            <w:r/>
+            <w:r>
+              <w:rPr>
+                <w:rFonts w:ascii="Times New Roman" w:hAnsi="Times New Roman" w:eastAsia="Times New Roman"/>
+                <w:b w:val="0"/>
+                <w:sz w:val="22"/>
+              </w:rPr>
+              <w:t>Да</w:t>
+            </w:r>
+          </w:p>
+        </w:tc>
+        <w:tc>
+          <w:tcPr>
+            <w:tcW w:type="dxa" w:w="1615"/>
+            <w:vAlign w:val="center"/>
+          </w:tcPr>
+          <w:p>
+            <w:pPr>
+              <w:spacing w:line="240" w:lineRule="auto" w:before="0" w:after="0"/>
+              <w:ind w:firstLine="0"/>
+              <w:jc w:val="left"/>
+            </w:pPr>
+            <w:r/>
+            <w:r>
+              <w:rPr>
+                <w:rFonts w:ascii="Times New Roman" w:hAnsi="Times New Roman" w:eastAsia="Times New Roman"/>
+                <w:b w:val="0"/>
+                <w:sz w:val="22"/>
+              </w:rPr>
+              <w:t>Да</w:t>
+            </w:r>
+          </w:p>
+        </w:tc>
+        <w:tc>
+          <w:tcPr>
+            <w:tcW w:type="dxa" w:w="1615"/>
+            <w:vAlign w:val="center"/>
+          </w:tcPr>
+          <w:p>
+            <w:pPr>
+              <w:spacing w:line="240" w:lineRule="auto" w:before="0" w:after="0"/>
+              <w:ind w:firstLine="0"/>
+              <w:jc w:val="left"/>
+            </w:pPr>
+            <w:r/>
+            <w:r>
+              <w:rPr>
+                <w:rFonts w:ascii="Times New Roman" w:hAnsi="Times New Roman" w:eastAsia="Times New Roman"/>
+                <w:b w:val="0"/>
+                <w:sz w:val="22"/>
+              </w:rPr>
+              <w:t>Клиент переподключается через nginx к доступному узлу</w:t>
+            </w:r>
+          </w:p>
+        </w:tc>
+        <w:tc>
+          <w:tcPr>
+            <w:tcW w:type="dxa" w:w="1615"/>
+            <w:vAlign w:val="center"/>
+          </w:tcPr>
+          <w:p>
+            <w:pPr>
+              <w:spacing w:line="240" w:lineRule="auto" w:before="0" w:after="0"/>
+              <w:ind w:firstLine="0"/>
+              <w:jc w:val="left"/>
+            </w:pPr>
+            <w:r/>
+            <w:r>
+              <w:rPr>
+                <w:rFonts w:ascii="Times New Roman" w:hAnsi="Times New Roman" w:eastAsia="Times New Roman"/>
+                <w:b w:val="0"/>
+                <w:sz w:val="22"/>
+              </w:rPr>
+              <w:t>`app-api-2` -&gt; `app-api-1`, событие получено</w:t>
+            </w:r>
+          </w:p>
+        </w:tc>
+        <w:tc>
+          <w:tcPr>
+            <w:tcW w:type="dxa" w:w="1615"/>
+            <w:vAlign w:val="center"/>
+          </w:tcPr>
+          <w:p>
+            <w:pPr>
+              <w:spacing w:line="240" w:lineRule="auto" w:before="0" w:after="0"/>
+              <w:ind w:firstLine="0"/>
+              <w:jc w:val="left"/>
+            </w:pPr>
+            <w:r/>
+            <w:r>
+              <w:rPr>
+                <w:rFonts w:ascii="Times New Roman" w:hAnsi="Times New Roman" w:eastAsia="Times New Roman"/>
+                <w:b w:val="0"/>
+                <w:sz w:val="22"/>
+              </w:rPr>
+              <w:t>Подтверждено восстановление после отказа</w:t>
+            </w:r>
+          </w:p>
+        </w:tc>
+      </w:tr>
     </w:tbl>
     <w:p>
       <w:pPr>
         <w:pStyle w:val="Heading2"/>
       </w:pPr>
       <w:r>
-        <w:t>5.7 Проверка входной точки стенда</w:t>
+        <w:t>5.8 Проверка входной точки стенда</w:t>
       </w:r>
     </w:p>
     <w:p>
@@ -8690,7 +9309,7 @@
         <w:pStyle w:val="Heading2"/>
       </w:pPr>
       <w:r>
-        <w:t>5.8 Ограничения эксперимента</w:t>
+        <w:t>5.9 Ограничения эксперимента</w:t>
       </w:r>
     </w:p>
     <w:p>
@@ -8722,7 +9341,7 @@
           <w:i w:val="0"/>
           <w:sz w:val="28"/>
         </w:rPr>
-        <w:t>Сценарием остановки одного экземпляра `app-api` и проверки восстановления соединения.</w:t>
+        <w:t>Увеличением числа одновременных клиентов и числа событий.</w:t>
       </w:r>
     </w:p>
     <w:p>
@@ -8738,7 +9357,7 @@
           <w:i w:val="0"/>
           <w:sz w:val="28"/>
         </w:rPr>
-        <w:t>Проверкой повторного вступления в группу после reconnect.</w:t>
+        <w:t>Сравнением поведения при разных стратегиях балансировки.</w:t>
       </w:r>
     </w:p>
     <w:p>
@@ -8754,7 +9373,7 @@
           <w:i w:val="0"/>
           <w:sz w:val="28"/>
         </w:rPr>
-        <w:t>Увеличением числа одновременных клиентов и числа событий.</w:t>
+        <w:t>Сбором p99 и распределения задержек на более длинной серии запусков с учетом того, что задержка влияет на качество real-time совместной работы [20].</w:t>
       </w:r>
     </w:p>
     <w:p>
@@ -8770,23 +9389,7 @@
           <w:i w:val="0"/>
           <w:sz w:val="28"/>
         </w:rPr>
-        <w:t>Сравнением поведения при разных стратегиях балансировки.</w:t>
-      </w:r>
-    </w:p>
-    <w:p>
-      <w:pPr>
-        <w:pStyle w:val="ListNumber"/>
-        <w:spacing w:line="360" w:lineRule="auto"/>
-        <w:ind w:left="709" w:hanging="283"/>
-      </w:pPr>
-      <w:r>
-        <w:rPr>
-          <w:rFonts w:ascii="Times New Roman" w:hAnsi="Times New Roman" w:eastAsia="Times New Roman"/>
-          <w:b w:val="0"/>
-          <w:i w:val="0"/>
-          <w:sz w:val="28"/>
-        </w:rPr>
-        <w:t>Сбором p99 и распределения задержек на более длинной серии запусков с учетом того, что задержка влияет на качество real-time совместной работы [15].</w:t>
+        <w:t>Проверкой поведения при длительной недоступности Redis.</w:t>
       </w:r>
     </w:p>
     <w:p>
@@ -8810,7 +9413,7 @@
         <w:pStyle w:val="Heading2"/>
       </w:pPr>
       <w:r>
-        <w:t>5.9 Вывод по испытаниям</w:t>
+        <w:t>5.10 Вывод по испытаниям</w:t>
       </w:r>
     </w:p>
     <w:p>
@@ -8862,7 +9465,7 @@
           <w:i w:val="0"/>
           <w:sz w:val="28"/>
         </w:rPr>
-        <w:t>. Серийная проверка показала 5 успешных доставок из 5, а p95 задержки в локальном стенде составил 9,5 мс. Таким образом, реализованное решение подтверждает заявленный тезис работы: single-node ограничение WebSocket-архитектуры устранено за счет распределенного real-time контура [3], [4].</w:t>
+        <w:t>. Серийная проверка показала 5 успешных доставок из 5, p95 задержки в локальном стенде составил 11,6 мс. Дополнительно подтверждены повторное вступление в группу после разрыва соединения и восстановление после остановки одного узла. Таким образом, реализованное решение подтверждает заявленный тезис работы: single-node ограничение WebSocket-архитектуры устранено за счет распределенного real-time контура [3], [4].</w:t>
       </w:r>
     </w:p>
     <w:p>
@@ -8921,7 +9524,7 @@
           <w:i w:val="0"/>
           <w:sz w:val="28"/>
         </w:rPr>
-        <w:t>, nginx как reverse proxy и Redis backplane для межузловой доставки SignalR-событий. В отдельной ветке проекта реализована поддержка конфигурируемого Redis backplane, добавлены идентификаторы серверных экземпляров, диагностический метод хаба, логирование real-time событий, проверочный клиент и воспроизводимый Docker Compose стенд [4], [8], [11], [12].</w:t>
+        <w:t>, nginx как reverse proxy и Redis backplane для межузловой доставки SignalR-событий. В отдельной ветке проекта реализована поддержка конфигурируемого Redis backplane, добавлены идентификаторы серверных экземпляров, диагностический метод хаба, логирование real-time событий, проверочный клиент и воспроизводимый Docker Compose стенд [4], [8], [10], [14].</w:t>
       </w:r>
     </w:p>
     <w:p>
@@ -8973,7 +9576,7 @@
           <w:i w:val="0"/>
           <w:sz w:val="28"/>
         </w:rPr>
-        <w:t>. Серийный запуск из пяти итераций подтвердил повторяемость результата и позволил получить первичную оценку задержки доставки. Это подтверждает устранение ограничения single-node WebSocket-архитектуры [3], [4].</w:t>
+        <w:t>. Серийный запуск из пяти итераций подтвердил повторяемость результата и позволил получить первичную оценку задержки доставки. Сценарии rejoin и failover показали, что клиент может восстановить рабочую подписку после разрыва соединения и после остановки одного backend-экземпляра. Это подтверждает устранение ограничения single-node WebSocket-архитектуры [3], [4].</w:t>
       </w:r>
     </w:p>
     <w:p>
@@ -8989,7 +9592,7 @@
           <w:i w:val="0"/>
           <w:sz w:val="28"/>
         </w:rPr>
-        <w:t>Полученные результаты имеют практическую значимость для дальнейшего развития системы отслеживания задач, поскольку предложенное решение позволяет перейти от локального real-time механизма к масштабируемому контуру совместной работы над сущностями. В дальнейшем решение может быть расширено отказными сценариями, дополнительной трассировкой событий, более длинной серией измерений задержек и проверкой на большем числе одновременных клиентов [8], [15].</w:t>
+        <w:t>Полученные результаты имеют практическую значимость для дальнейшего развития системы отслеживания задач, поскольку предложенное решение позволяет перейти от локального real-time механизма к масштабируемому контуру совместной работы над сущностями. В дальнейшем решение может быть расширено дополнительной трассировкой событий, более длинной серией измерений задержек, проверкой на большем числе одновременных клиентов и анализом поведения при недоступности Redis [8], [19].</w:t>
       </w:r>
     </w:p>
     <w:p>
@@ -9008,242 +9611,322 @@
     </w:p>
     <w:p>
       <w:pPr>
-        <w:pStyle w:val="ListNumber"/>
-        <w:spacing w:line="360" w:lineRule="auto"/>
-        <w:ind w:left="709" w:hanging="283"/>
+        <w:spacing w:line="240" w:lineRule="auto" w:after="60"/>
+        <w:ind w:firstLine="0" w:left="425"/>
+        <w:jc w:val="left"/>
       </w:pPr>
       <w:r>
         <w:rPr>
           <w:rFonts w:ascii="Times New Roman" w:hAnsi="Times New Roman" w:eastAsia="Times New Roman"/>
           <w:b w:val="0"/>
           <w:i w:val="0"/>
-          <w:sz w:val="28"/>
-        </w:rPr>
-        <w:t>Fette I., Melnikov A. RFC 6455: The WebSocket Protocol. IETF, 2011. URL: https://www.rfc-editor.org/rfc/rfc6455 (дата обращения: 09.05.2026).</w:t>
-      </w:r>
-    </w:p>
-    <w:p>
-      <w:pPr>
-        <w:pStyle w:val="ListNumber"/>
-        <w:spacing w:line="360" w:lineRule="auto"/>
-        <w:ind w:left="709" w:hanging="283"/>
+          <w:sz w:val="24"/>
+        </w:rPr>
+        <w:t>1. Fette I., Melnikov A. The WebSocket Protocol: RFC 6455. IETF, 2011. URL: https://www.rfc-editor.org/rfc/rfc6455 (дата обращения: 09.05.2026).</w:t>
+      </w:r>
+    </w:p>
+    <w:p>
+      <w:pPr>
+        <w:spacing w:line="240" w:lineRule="auto" w:after="60"/>
+        <w:ind w:firstLine="0" w:left="425"/>
+        <w:jc w:val="left"/>
       </w:pPr>
       <w:r>
         <w:rPr>
           <w:rFonts w:ascii="Times New Roman" w:hAnsi="Times New Roman" w:eastAsia="Times New Roman"/>
           <w:b w:val="0"/>
           <w:i w:val="0"/>
-          <w:sz w:val="28"/>
-        </w:rPr>
-        <w:t>Microsoft. Overview of ASP.NET Core SignalR. URL: https://learn.microsoft.com/en-us/aspnet/core/signalr/introduction?view=aspnetcore-9.0 (дата обращения: 09.05.2026).</w:t>
-      </w:r>
-    </w:p>
-    <w:p>
-      <w:pPr>
-        <w:pStyle w:val="ListNumber"/>
-        <w:spacing w:line="360" w:lineRule="auto"/>
-        <w:ind w:left="709" w:hanging="283"/>
+          <w:sz w:val="24"/>
+        </w:rPr>
+        <w:t>2. Microsoft. Overview of ASP.NET Core SignalR. URL: https://learn.microsoft.com/en-us/aspnet/core/signalr/introduction (дата обращения: 09.05.2026).</w:t>
+      </w:r>
+    </w:p>
+    <w:p>
+      <w:pPr>
+        <w:spacing w:line="240" w:lineRule="auto" w:after="60"/>
+        <w:ind w:firstLine="0" w:left="425"/>
+        <w:jc w:val="left"/>
       </w:pPr>
       <w:r>
         <w:rPr>
           <w:rFonts w:ascii="Times New Roman" w:hAnsi="Times New Roman" w:eastAsia="Times New Roman"/>
           <w:b w:val="0"/>
           <w:i w:val="0"/>
-          <w:sz w:val="28"/>
-        </w:rPr>
-        <w:t>Microsoft. ASP.NET Core SignalR production hosting and scaling. URL: https://learn.microsoft.com/en-us/aspnet/core/signalr/scale?view=aspnetcore-9.0 (дата обращения: 09.05.2026).</w:t>
-      </w:r>
-    </w:p>
-    <w:p>
-      <w:pPr>
-        <w:pStyle w:val="ListNumber"/>
-        <w:spacing w:line="360" w:lineRule="auto"/>
-        <w:ind w:left="709" w:hanging="283"/>
+          <w:sz w:val="24"/>
+        </w:rPr>
+        <w:t>3. Microsoft. ASP.NET Core SignalR production hosting and scaling. URL: https://learn.microsoft.com/en-us/aspnet/core/signalr/scale (дата обращения: 09.05.2026).</w:t>
+      </w:r>
+    </w:p>
+    <w:p>
+      <w:pPr>
+        <w:spacing w:line="240" w:lineRule="auto" w:after="60"/>
+        <w:ind w:firstLine="0" w:left="425"/>
+        <w:jc w:val="left"/>
       </w:pPr>
       <w:r>
         <w:rPr>
           <w:rFonts w:ascii="Times New Roman" w:hAnsi="Times New Roman" w:eastAsia="Times New Roman"/>
           <w:b w:val="0"/>
           <w:i w:val="0"/>
-          <w:sz w:val="28"/>
-        </w:rPr>
-        <w:t>Microsoft. Redis backplane for ASP.NET Core SignalR scale-out. URL: https://learn.microsoft.com/en-us/aspnet/core/signalr/redis-backplane?view=aspnetcore-9.0 (дата обращения: 09.05.2026).</w:t>
-      </w:r>
-    </w:p>
-    <w:p>
-      <w:pPr>
-        <w:pStyle w:val="ListNumber"/>
-        <w:spacing w:line="360" w:lineRule="auto"/>
-        <w:ind w:left="709" w:hanging="283"/>
+          <w:sz w:val="24"/>
+        </w:rPr>
+        <w:t>4. Microsoft. Redis backplane for ASP.NET Core SignalR scale-out. URL: https://learn.microsoft.com/en-us/aspnet/core/signalr/redis-backplane (дата обращения: 09.05.2026).</w:t>
+      </w:r>
+    </w:p>
+    <w:p>
+      <w:pPr>
+        <w:spacing w:line="240" w:lineRule="auto" w:after="60"/>
+        <w:ind w:firstLine="0" w:left="425"/>
+        <w:jc w:val="left"/>
       </w:pPr>
       <w:r>
         <w:rPr>
           <w:rFonts w:ascii="Times New Roman" w:hAnsi="Times New Roman" w:eastAsia="Times New Roman"/>
           <w:b w:val="0"/>
           <w:i w:val="0"/>
-          <w:sz w:val="28"/>
-        </w:rPr>
-        <w:t>Microsoft. Manage users and groups in SignalR. URL: https://learn.microsoft.com/en-us/aspnet/core/signalr/groups?view=aspnetcore-9.0 (дата обращения: 09.05.2026).</w:t>
-      </w:r>
-    </w:p>
-    <w:p>
-      <w:pPr>
-        <w:pStyle w:val="ListNumber"/>
-        <w:spacing w:line="360" w:lineRule="auto"/>
-        <w:ind w:left="709" w:hanging="283"/>
+          <w:sz w:val="24"/>
+        </w:rPr>
+        <w:t>5. Microsoft. Manage users and groups in SignalR. URL: https://learn.microsoft.com/en-us/aspnet/core/signalr/groups (дата обращения: 09.05.2026).</w:t>
+      </w:r>
+    </w:p>
+    <w:p>
+      <w:pPr>
+        <w:spacing w:line="240" w:lineRule="auto" w:after="60"/>
+        <w:ind w:firstLine="0" w:left="425"/>
+        <w:jc w:val="left"/>
       </w:pPr>
       <w:r>
         <w:rPr>
           <w:rFonts w:ascii="Times New Roman" w:hAnsi="Times New Roman" w:eastAsia="Times New Roman"/>
           <w:b w:val="0"/>
           <w:i w:val="0"/>
-          <w:sz w:val="28"/>
-        </w:rPr>
-        <w:t>Microsoft. ASP.NET Core SignalR JavaScript client. URL: https://learn.microsoft.com/en-us/aspnet/core/signalr/javascript-client?view=aspnetcore-9.0 (дата обращения: 09.05.2026).</w:t>
-      </w:r>
-    </w:p>
-    <w:p>
-      <w:pPr>
-        <w:pStyle w:val="ListNumber"/>
-        <w:spacing w:line="360" w:lineRule="auto"/>
-        <w:ind w:left="709" w:hanging="283"/>
+          <w:sz w:val="24"/>
+        </w:rPr>
+        <w:t>6. Microsoft. ASP.NET Core SignalR JavaScript client. URL: https://learn.microsoft.com/en-us/aspnet/core/signalr/javascript-client (дата обращения: 09.05.2026).</w:t>
+      </w:r>
+    </w:p>
+    <w:p>
+      <w:pPr>
+        <w:spacing w:line="240" w:lineRule="auto" w:after="60"/>
+        <w:ind w:firstLine="0" w:left="425"/>
+        <w:jc w:val="left"/>
       </w:pPr>
       <w:r>
         <w:rPr>
           <w:rFonts w:ascii="Times New Roman" w:hAnsi="Times New Roman" w:eastAsia="Times New Roman"/>
           <w:b w:val="0"/>
           <w:i w:val="0"/>
-          <w:sz w:val="28"/>
-        </w:rPr>
-        <w:t>Microsoft. ASP.NET Core SignalR configuration. URL: https://learn.microsoft.com/en-us/aspnet/core/signalr/configuration?view=aspnetcore-9.0 (дата обращения: 09.05.2026).</w:t>
-      </w:r>
-    </w:p>
-    <w:p>
-      <w:pPr>
-        <w:pStyle w:val="ListNumber"/>
-        <w:spacing w:line="360" w:lineRule="auto"/>
-        <w:ind w:left="709" w:hanging="283"/>
+          <w:sz w:val="24"/>
+        </w:rPr>
+        <w:t>7. Microsoft. ASP.NET Core SignalR configuration. URL: https://learn.microsoft.com/en-us/aspnet/core/signalr/configuration (дата обращения: 09.05.2026).</w:t>
+      </w:r>
+    </w:p>
+    <w:p>
+      <w:pPr>
+        <w:spacing w:line="240" w:lineRule="auto" w:after="60"/>
+        <w:ind w:firstLine="0" w:left="425"/>
+        <w:jc w:val="left"/>
       </w:pPr>
       <w:r>
         <w:rPr>
           <w:rFonts w:ascii="Times New Roman" w:hAnsi="Times New Roman" w:eastAsia="Times New Roman"/>
           <w:b w:val="0"/>
           <w:i w:val="0"/>
-          <w:sz w:val="28"/>
-        </w:rPr>
-        <w:t>Microsoft. Logging and diagnostics in ASP.NET Core SignalR. URL: https://learn.microsoft.com/en-us/aspnet/core/signalr/diagnostics?view=aspnetcore-9.0 (дата обращения: 09.05.2026).</w:t>
-      </w:r>
-    </w:p>
-    <w:p>
-      <w:pPr>
-        <w:pStyle w:val="ListNumber"/>
-        <w:spacing w:line="360" w:lineRule="auto"/>
-        <w:ind w:left="709" w:hanging="283"/>
+          <w:sz w:val="24"/>
+        </w:rPr>
+        <w:t>8. Microsoft. Logging and diagnostics in ASP.NET Core SignalR. URL: https://learn.microsoft.com/en-us/aspnet/core/signalr/diagnostics (дата обращения: 09.05.2026).</w:t>
+      </w:r>
+    </w:p>
+    <w:p>
+      <w:pPr>
+        <w:spacing w:line="240" w:lineRule="auto" w:after="60"/>
+        <w:ind w:firstLine="0" w:left="425"/>
+        <w:jc w:val="left"/>
       </w:pPr>
       <w:r>
         <w:rPr>
           <w:rFonts w:ascii="Times New Roman" w:hAnsi="Times New Roman" w:eastAsia="Times New Roman"/>
           <w:b w:val="0"/>
           <w:i w:val="0"/>
-          <w:sz w:val="28"/>
-        </w:rPr>
-        <w:t>Redis Ltd. Redis Pub/Sub. URL: https://redis.io/docs/latest/develop/pubsub/ (дата обращения: 09.05.2026).</w:t>
-      </w:r>
-    </w:p>
-    <w:p>
-      <w:pPr>
-        <w:pStyle w:val="ListNumber"/>
-        <w:spacing w:line="360" w:lineRule="auto"/>
-        <w:ind w:left="709" w:hanging="283"/>
+          <w:sz w:val="24"/>
+        </w:rPr>
+        <w:t>9. Redis Ltd. Redis Pub/Sub. URL: https://redis.io/docs/latest/develop/pubsub/ (дата обращения: 09.05.2026).</w:t>
+      </w:r>
+    </w:p>
+    <w:p>
+      <w:pPr>
+        <w:spacing w:line="240" w:lineRule="auto" w:after="60"/>
+        <w:ind w:firstLine="0" w:left="425"/>
+        <w:jc w:val="left"/>
       </w:pPr>
       <w:r>
         <w:rPr>
           <w:rFonts w:ascii="Times New Roman" w:hAnsi="Times New Roman" w:eastAsia="Times New Roman"/>
           <w:b w:val="0"/>
           <w:i w:val="0"/>
-          <w:sz w:val="28"/>
-        </w:rPr>
-        <w:t>Redis Ltd. Redis Streams. URL: https://redis.io/docs/latest/develop/data-types/streams/ (дата обращения: 09.05.2026).</w:t>
-      </w:r>
-    </w:p>
-    <w:p>
-      <w:pPr>
-        <w:pStyle w:val="ListNumber"/>
-        <w:spacing w:line="360" w:lineRule="auto"/>
-        <w:ind w:left="709" w:hanging="283"/>
+          <w:sz w:val="24"/>
+        </w:rPr>
+        <w:t>10. NGINX. WebSocket proxying. URL: https://nginx.org/en/docs/http/websocket.html (дата обращения: 09.05.2026).</w:t>
+      </w:r>
+    </w:p>
+    <w:p>
+      <w:pPr>
+        <w:spacing w:line="240" w:lineRule="auto" w:after="60"/>
+        <w:ind w:firstLine="0" w:left="425"/>
+        <w:jc w:val="left"/>
       </w:pPr>
       <w:r>
         <w:rPr>
           <w:rFonts w:ascii="Times New Roman" w:hAnsi="Times New Roman" w:eastAsia="Times New Roman"/>
           <w:b w:val="0"/>
           <w:i w:val="0"/>
-          <w:sz w:val="28"/>
-        </w:rPr>
-        <w:t>NGINX. WebSocket proxying. URL: https://nginx.org/en/docs/http/websocket.html (дата обращения: 09.05.2026).</w:t>
-      </w:r>
-    </w:p>
-    <w:p>
-      <w:pPr>
-        <w:pStyle w:val="ListNumber"/>
-        <w:spacing w:line="360" w:lineRule="auto"/>
-        <w:ind w:left="709" w:hanging="283"/>
+          <w:sz w:val="24"/>
+        </w:rPr>
+        <w:t>11. ГОСТ 7.32-2017. Система стандартов по информации, библиотечному и издательскому делу. Отчет о научно-исследовательской работе. Структура и правила оформления. М.: Стандартинформ, 2018.</w:t>
+      </w:r>
+    </w:p>
+    <w:p>
+      <w:pPr>
+        <w:spacing w:line="240" w:lineRule="auto" w:after="60"/>
+        <w:ind w:firstLine="0" w:left="425"/>
+        <w:jc w:val="left"/>
       </w:pPr>
       <w:r>
         <w:rPr>
           <w:rFonts w:ascii="Times New Roman" w:hAnsi="Times New Roman" w:eastAsia="Times New Roman"/>
           <w:b w:val="0"/>
           <w:i w:val="0"/>
-          <w:sz w:val="28"/>
-        </w:rPr>
-        <w:t>F5 NGINX. HTTP Load Balancing. URL: https://docs.nginx.com/nginx/admin-guide/load-balancer/http-load-balancer/ (дата обращения: 09.05.2026).</w:t>
-      </w:r>
-    </w:p>
-    <w:p>
-      <w:pPr>
-        <w:pStyle w:val="ListNumber"/>
-        <w:spacing w:line="360" w:lineRule="auto"/>
-        <w:ind w:left="709" w:hanging="283"/>
+          <w:sz w:val="24"/>
+        </w:rPr>
+        <w:t>12. ГОСТ Р 7.0.100-2018. Система стандартов по информации, библиотечному и издательскому делу. Библиографическая запись. Библиографическое описание. Общие требования и правила составления. М.: Стандартинформ, 2018.</w:t>
+      </w:r>
+    </w:p>
+    <w:p>
+      <w:pPr>
+        <w:spacing w:line="240" w:lineRule="auto" w:after="60"/>
+        <w:ind w:firstLine="0" w:left="425"/>
+        <w:jc w:val="left"/>
       </w:pPr>
       <w:r>
         <w:rPr>
           <w:rFonts w:ascii="Times New Roman" w:hAnsi="Times New Roman" w:eastAsia="Times New Roman"/>
           <w:b w:val="0"/>
           <w:i w:val="0"/>
-          <w:sz w:val="28"/>
-        </w:rPr>
-        <w:t>Gutwin C., Greenberg S. A Descriptive Framework of Workspace Awareness for Real-Time Groupware // Computer Supported Cooperative Work. 2002. Vol. 11. P. 411-446. DOI: 10.1023/A:1021271517844.</w:t>
-      </w:r>
-    </w:p>
-    <w:p>
-      <w:pPr>
-        <w:pStyle w:val="ListNumber"/>
-        <w:spacing w:line="360" w:lineRule="auto"/>
-        <w:ind w:left="709" w:hanging="283"/>
+          <w:sz w:val="24"/>
+        </w:rPr>
+        <w:t>13. Рогачев С. А., Бабюк Ю. Программная инженерия. Требования к подготовке и содержанию отчетов по практике: учебно-методическое пособие. СПб.: ГУАП, 2025. 40 с.</w:t>
+      </w:r>
+    </w:p>
+    <w:p>
+      <w:pPr>
+        <w:spacing w:line="240" w:lineRule="auto" w:after="60"/>
+        <w:ind w:firstLine="0" w:left="425"/>
+        <w:jc w:val="left"/>
       </w:pPr>
       <w:r>
         <w:rPr>
           <w:rFonts w:ascii="Times New Roman" w:hAnsi="Times New Roman" w:eastAsia="Times New Roman"/>
           <w:b w:val="0"/>
           <w:i w:val="0"/>
-          <w:sz w:val="28"/>
-        </w:rPr>
-        <w:t>Gutwin C., Schneider K., Penner R., Paquette D. Supporting Group Awareness in Distributed Software Development. URL: https://dl.ifip.org/db/conf/ehci/ehci2004/GutwinSPP04.pdf (дата обращения: 09.05.2026).</w:t>
-      </w:r>
-    </w:p>
-    <w:p>
-      <w:pPr>
-        <w:pStyle w:val="ListNumber"/>
-        <w:spacing w:line="360" w:lineRule="auto"/>
-        <w:ind w:left="709" w:hanging="283"/>
+          <w:sz w:val="24"/>
+        </w:rPr>
+        <w:t>14. Олифер В. Г., Олифер Н. А. Компьютерные сети. Принципы, технологии, протоколы: учебник. 6-е изд. СПб.: Питер, 2022. 1008 с.</w:t>
+      </w:r>
+    </w:p>
+    <w:p>
+      <w:pPr>
+        <w:spacing w:line="240" w:lineRule="auto" w:after="60"/>
+        <w:ind w:firstLine="0" w:left="425"/>
+        <w:jc w:val="left"/>
       </w:pPr>
       <w:r>
         <w:rPr>
           <w:rFonts w:ascii="Times New Roman" w:hAnsi="Times New Roman" w:eastAsia="Times New Roman"/>
           <w:b w:val="0"/>
           <w:i w:val="0"/>
-          <w:sz w:val="28"/>
-        </w:rPr>
-        <w:t>Ignat C.-L., Oster G., Fox O., Shalin V. L., Charoy F. How Do User Groups Cope with Delay in Real-Time Collaborative Note Taking // ECSCW 2015: Proceedings of the 14th European Conference on Computer Supported Cooperative Work. URL: https://dl.eusset.eu/items/a815f8e7-047e-42a2-bf9b-0dc02fdd904e (дата обращения: 09.05.2026).</w:t>
+          <w:sz w:val="24"/>
+        </w:rPr>
+        <w:t>15. Орлов С. А. Программная инженерия: учебник для вузов. 5-е изд. СПб.: Питер, 2016. 640 с.</w:t>
+      </w:r>
+    </w:p>
+    <w:p>
+      <w:pPr>
+        <w:spacing w:line="240" w:lineRule="auto" w:after="60"/>
+        <w:ind w:firstLine="0" w:left="425"/>
+        <w:jc w:val="left"/>
+      </w:pPr>
+      <w:r>
+        <w:rPr>
+          <w:rFonts w:ascii="Times New Roman" w:hAnsi="Times New Roman" w:eastAsia="Times New Roman"/>
+          <w:b w:val="0"/>
+          <w:i w:val="0"/>
+          <w:sz w:val="24"/>
+        </w:rPr>
+        <w:t>16. Гагарина Л. Г., Кокорева Е. В., Виснадул Б. Д. Технология разработки программного обеспечения: учебное пособие. М.: ФОРУМ: ИНФРА-М, 2021. 400 с.</w:t>
+      </w:r>
+    </w:p>
+    <w:p>
+      <w:pPr>
+        <w:spacing w:line="240" w:lineRule="auto" w:after="60"/>
+        <w:ind w:firstLine="0" w:left="425"/>
+        <w:jc w:val="left"/>
+      </w:pPr>
+      <w:r>
+        <w:rPr>
+          <w:rFonts w:ascii="Times New Roman" w:hAnsi="Times New Roman" w:eastAsia="Times New Roman"/>
+          <w:b w:val="0"/>
+          <w:i w:val="0"/>
+          <w:sz w:val="24"/>
+        </w:rPr>
+        <w:t>17. Советов Б. Я., Цехановский В. В., Чертовской В. Д. Базы данных: теория и практика: учебник. М.: Юрайт, 2020. 463 с.</w:t>
+      </w:r>
+    </w:p>
+    <w:p>
+      <w:pPr>
+        <w:spacing w:line="240" w:lineRule="auto" w:after="60"/>
+        <w:ind w:firstLine="0" w:left="425"/>
+        <w:jc w:val="left"/>
+      </w:pPr>
+      <w:r>
+        <w:rPr>
+          <w:rFonts w:ascii="Times New Roman" w:hAnsi="Times New Roman" w:eastAsia="Times New Roman"/>
+          <w:b w:val="0"/>
+          <w:i w:val="0"/>
+          <w:sz w:val="24"/>
+        </w:rPr>
+        <w:t>18. Гвоздева В. А., Баллод Б. А. Основы построения автоматизированных информационных систем: учебник. М.: ФОРУМ: ИНФРА-М, 2020. 320 с.</w:t>
+      </w:r>
+    </w:p>
+    <w:p>
+      <w:pPr>
+        <w:spacing w:line="240" w:lineRule="auto" w:after="60"/>
+        <w:ind w:firstLine="0" w:left="425"/>
+        <w:jc w:val="left"/>
+      </w:pPr>
+      <w:r>
+        <w:rPr>
+          <w:rFonts w:ascii="Times New Roman" w:hAnsi="Times New Roman" w:eastAsia="Times New Roman"/>
+          <w:b w:val="0"/>
+          <w:i w:val="0"/>
+          <w:sz w:val="24"/>
+        </w:rPr>
+        <w:t>19. Липаев В. В. Программная инженерия. Методологические основы: учебник. М.: ТЕИС, 2006. 608 с.</w:t>
+      </w:r>
+    </w:p>
+    <w:p>
+      <w:pPr>
+        <w:spacing w:line="240" w:lineRule="auto" w:after="60"/>
+        <w:ind w:firstLine="0" w:left="425"/>
+        <w:jc w:val="left"/>
+      </w:pPr>
+      <w:r>
+        <w:rPr>
+          <w:rFonts w:ascii="Times New Roman" w:hAnsi="Times New Roman" w:eastAsia="Times New Roman"/>
+          <w:b w:val="0"/>
+          <w:i w:val="0"/>
+          <w:sz w:val="24"/>
+        </w:rPr>
+        <w:t>20. Куликов С. С. Тестирование программного обеспечения. Базовый курс. Минск: Четыре четверти, 2017. 312 с.</w:t>
       </w:r>
     </w:p>
     <w:p>

</xml_diff>

<commit_message>
new page for conclusion
</commit_message>
<xml_diff>
--- a/build/docx/vkr-draft-1.docx
+++ b/build/docx/vkr-draft-1.docx
@@ -5553,7 +5553,7 @@
         </w:rPr>
         <w:t>ЗАКЛЮЧЕНИЕ</w:t>
         <w:tab/>
-        <w:t>36</w:t>
+        <w:t>37</w:t>
       </w:r>
     </w:p>
     <w:p>
@@ -5573,7 +5573,7 @@
         </w:rPr>
         <w:t>СПИСОК ИСПОЛЬЗОВАННЫХ ИСТОЧНИКОВ</w:t>
         <w:tab/>
-        <w:t>38</w:t>
+        <w:t>39</w:t>
       </w:r>
     </w:p>
     <w:p>
@@ -5593,7 +5593,7 @@
         </w:rPr>
         <w:t>ПРИЛОЖЕНИЕ А</w:t>
         <w:tab/>
-        <w:t>39</w:t>
+        <w:t>40</w:t>
       </w:r>
     </w:p>
     <w:p>
@@ -5613,7 +5613,7 @@
         </w:rPr>
         <w:t>ПРИЛОЖЕНИЕ Б</w:t>
         <w:tab/>
-        <w:t>40</w:t>
+        <w:t>41</w:t>
       </w:r>
     </w:p>
     <w:p>
@@ -5633,7 +5633,7 @@
         </w:rPr>
         <w:t>ПРИЛОЖЕНИЕ В</w:t>
         <w:tab/>
-        <w:t>44</w:t>
+        <w:t>45</w:t>
       </w:r>
     </w:p>
     <w:p>
@@ -14155,6 +14155,7 @@
     <w:p>
       <w:pPr>
         <w:pStyle w:val="1"/>
+        <w:pageBreakBefore/>
         <w:jc w:val="center"/>
       </w:pPr>
       <w:r>

</xml_diff>